<commit_message>
doc: add embedded database tables, 7 UI screenshots, and in-depth academic descriptions to the final Word report
</commit_message>
<xml_diff>
--- a/NMPA_Project_Report_Final.docx
+++ b/NMPA_Project_Report_Final.docx
@@ -1057,7 +1057,7 @@
           <w:color w:val="0D2B5E"/>
           <w:sz w:val="20"/>
         </w:rPr>
-        <w:t>33</w:t>
+        <w:t>34</w:t>
       </w:r>
     </w:p>
     <w:p>
@@ -1088,7 +1088,7 @@
           <w:color w:val="262626"/>
           <w:sz w:val="20"/>
         </w:rPr>
-        <w:t>33</w:t>
+        <w:t>34</w:t>
       </w:r>
     </w:p>
     <w:p>
@@ -1119,7 +1119,7 @@
           <w:color w:val="262626"/>
           <w:sz w:val="20"/>
         </w:rPr>
-        <w:t>34</w:t>
+        <w:t>35</w:t>
       </w:r>
     </w:p>
     <w:p>
@@ -1150,7 +1150,7 @@
           <w:color w:val="0D2B5E"/>
           <w:sz w:val="20"/>
         </w:rPr>
-        <w:t>36</w:t>
+        <w:t>37</w:t>
       </w:r>
     </w:p>
     <w:p>
@@ -1181,7 +1181,7 @@
           <w:color w:val="262626"/>
           <w:sz w:val="20"/>
         </w:rPr>
-        <w:t>36</w:t>
+        <w:t>37</w:t>
       </w:r>
     </w:p>
     <w:p>
@@ -1212,7 +1212,7 @@
           <w:color w:val="262626"/>
           <w:sz w:val="20"/>
         </w:rPr>
-        <w:t>37</w:t>
+        <w:t>38</w:t>
       </w:r>
     </w:p>
     <w:p>
@@ -1243,7 +1243,7 @@
           <w:color w:val="262626"/>
           <w:sz w:val="20"/>
         </w:rPr>
-        <w:t>38</w:t>
+        <w:t>39</w:t>
       </w:r>
     </w:p>
     <w:p>
@@ -1274,7 +1274,7 @@
           <w:color w:val="0D2B5E"/>
           <w:sz w:val="20"/>
         </w:rPr>
-        <w:t>39</w:t>
+        <w:t>40</w:t>
       </w:r>
     </w:p>
     <w:p>
@@ -1305,7 +1305,7 @@
           <w:color w:val="262626"/>
           <w:sz w:val="20"/>
         </w:rPr>
-        <w:t>39</w:t>
+        <w:t>40</w:t>
       </w:r>
     </w:p>
     <w:p>
@@ -1336,7 +1336,7 @@
           <w:color w:val="262626"/>
           <w:sz w:val="20"/>
         </w:rPr>
-        <w:t>48</w:t>
+        <w:t>49</w:t>
       </w:r>
     </w:p>
     <w:p>
@@ -1367,7 +1367,7 @@
           <w:color w:val="262626"/>
           <w:sz w:val="20"/>
         </w:rPr>
-        <w:t>59</w:t>
+        <w:t>60</w:t>
       </w:r>
     </w:p>
     <w:p>
@@ -1398,7 +1398,7 @@
           <w:color w:val="262626"/>
           <w:sz w:val="20"/>
         </w:rPr>
-        <w:t>71</w:t>
+        <w:t>72</w:t>
       </w:r>
     </w:p>
     <w:p>
@@ -1805,6 +1805,1811 @@
     <w:p>
       <w:pPr>
         <w:keepNext/>
+        <w:spacing w:before="160" w:after="40"/>
+      </w:pPr>
+      <w:r>
+        <w:rPr>
+          <w:rFonts w:ascii="Arial" w:hAnsi="Arial"/>
+          <w:b/>
+          <w:color w:val="646E7D"/>
+          <w:sz w:val="22"/>
+        </w:rPr>
+        <w:t>4.3.1 Users Collection Schema</w:t>
+      </w:r>
+    </w:p>
+    <w:tbl>
+      <w:tblPr>
+        <w:tblStyle w:val="TableGrid"/>
+        <w:tblW w:type="auto" w:w="0"/>
+        <w:tblLook w:firstColumn="1" w:firstRow="1" w:lastColumn="0" w:lastRow="0" w:noHBand="0" w:noVBand="1" w:val="04A0"/>
+      </w:tblPr>
+      <w:tblGrid>
+        <w:gridCol w:w="2340"/>
+        <w:gridCol w:w="2340"/>
+        <w:gridCol w:w="2340"/>
+        <w:gridCol w:w="2340"/>
+      </w:tblGrid>
+      <w:tr>
+        <w:tc>
+          <w:tcPr>
+            <w:tcW w:type="dxa" w:w="2340"/>
+          </w:tcPr>
+          <w:p>
+            <w:r>
+              <w:rPr>
+                <w:rFonts w:ascii="Arial" w:hAnsi="Arial"/>
+                <w:b/>
+                <w:color w:val="0D2B5E"/>
+                <w:sz w:val="19"/>
+              </w:rPr>
+              <w:t>Field Name</w:t>
+            </w:r>
+          </w:p>
+        </w:tc>
+        <w:tc>
+          <w:tcPr>
+            <w:tcW w:type="dxa" w:w="2340"/>
+          </w:tcPr>
+          <w:p>
+            <w:r>
+              <w:rPr>
+                <w:rFonts w:ascii="Arial" w:hAnsi="Arial"/>
+                <w:b/>
+                <w:color w:val="0D2B5E"/>
+                <w:sz w:val="19"/>
+              </w:rPr>
+              <w:t>Data Type</w:t>
+            </w:r>
+          </w:p>
+        </w:tc>
+        <w:tc>
+          <w:tcPr>
+            <w:tcW w:type="dxa" w:w="2340"/>
+          </w:tcPr>
+          <w:p>
+            <w:r>
+              <w:rPr>
+                <w:rFonts w:ascii="Arial" w:hAnsi="Arial"/>
+                <w:b/>
+                <w:color w:val="0D2B5E"/>
+                <w:sz w:val="19"/>
+              </w:rPr>
+              <w:t>Constraints</w:t>
+            </w:r>
+          </w:p>
+        </w:tc>
+        <w:tc>
+          <w:tcPr>
+            <w:tcW w:type="dxa" w:w="2340"/>
+          </w:tcPr>
+          <w:p>
+            <w:r>
+              <w:rPr>
+                <w:rFonts w:ascii="Arial" w:hAnsi="Arial"/>
+                <w:b/>
+                <w:color w:val="0D2B5E"/>
+                <w:sz w:val="19"/>
+              </w:rPr>
+              <w:t>Description</w:t>
+            </w:r>
+          </w:p>
+        </w:tc>
+      </w:tr>
+      <w:tr>
+        <w:tc>
+          <w:tcPr>
+            <w:tcW w:type="dxa" w:w="2340"/>
+          </w:tcPr>
+          <w:p>
+            <w:r>
+              <w:rPr>
+                <w:rFonts w:ascii="Times New Roman" w:hAnsi="Times New Roman"/>
+                <w:sz w:val="19"/>
+              </w:rPr>
+              <w:t>id</w:t>
+            </w:r>
+          </w:p>
+        </w:tc>
+        <w:tc>
+          <w:tcPr>
+            <w:tcW w:type="dxa" w:w="2340"/>
+          </w:tcPr>
+          <w:p>
+            <w:r>
+              <w:rPr>
+                <w:rFonts w:ascii="Times New Roman" w:hAnsi="Times New Roman"/>
+                <w:sz w:val="19"/>
+              </w:rPr>
+              <w:t>INTEGER</w:t>
+            </w:r>
+          </w:p>
+        </w:tc>
+        <w:tc>
+          <w:tcPr>
+            <w:tcW w:type="dxa" w:w="2340"/>
+          </w:tcPr>
+          <w:p>
+            <w:r>
+              <w:rPr>
+                <w:rFonts w:ascii="Times New Roman" w:hAnsi="Times New Roman"/>
+                <w:sz w:val="19"/>
+              </w:rPr>
+              <w:t>Primary Key</w:t>
+            </w:r>
+          </w:p>
+        </w:tc>
+        <w:tc>
+          <w:tcPr>
+            <w:tcW w:type="dxa" w:w="2340"/>
+          </w:tcPr>
+          <w:p>
+            <w:r>
+              <w:rPr>
+                <w:rFonts w:ascii="Times New Roman" w:hAnsi="Times New Roman"/>
+                <w:sz w:val="19"/>
+              </w:rPr>
+              <w:t>Unique user identification identifier.</w:t>
+            </w:r>
+          </w:p>
+        </w:tc>
+      </w:tr>
+      <w:tr>
+        <w:tc>
+          <w:tcPr>
+            <w:tcW w:type="dxa" w:w="2340"/>
+          </w:tcPr>
+          <w:p>
+            <w:r>
+              <w:rPr>
+                <w:rFonts w:ascii="Times New Roman" w:hAnsi="Times New Roman"/>
+                <w:sz w:val="19"/>
+              </w:rPr>
+              <w:t>username</w:t>
+            </w:r>
+          </w:p>
+        </w:tc>
+        <w:tc>
+          <w:tcPr>
+            <w:tcW w:type="dxa" w:w="2340"/>
+          </w:tcPr>
+          <w:p>
+            <w:r>
+              <w:rPr>
+                <w:rFonts w:ascii="Times New Roman" w:hAnsi="Times New Roman"/>
+                <w:sz w:val="19"/>
+              </w:rPr>
+              <w:t>VARCHAR</w:t>
+            </w:r>
+          </w:p>
+        </w:tc>
+        <w:tc>
+          <w:tcPr>
+            <w:tcW w:type="dxa" w:w="2340"/>
+          </w:tcPr>
+          <w:p>
+            <w:r>
+              <w:rPr>
+                <w:rFonts w:ascii="Times New Roman" w:hAnsi="Times New Roman"/>
+                <w:sz w:val="19"/>
+              </w:rPr>
+              <w:t>Unique, Min 4 chars</w:t>
+            </w:r>
+          </w:p>
+        </w:tc>
+        <w:tc>
+          <w:tcPr>
+            <w:tcW w:type="dxa" w:w="2340"/>
+          </w:tcPr>
+          <w:p>
+            <w:r>
+              <w:rPr>
+                <w:rFonts w:ascii="Times New Roman" w:hAnsi="Times New Roman"/>
+                <w:sz w:val="19"/>
+              </w:rPr>
+              <w:t>Login username credentials.</w:t>
+            </w:r>
+          </w:p>
+        </w:tc>
+      </w:tr>
+      <w:tr>
+        <w:tc>
+          <w:tcPr>
+            <w:tcW w:type="dxa" w:w="2340"/>
+          </w:tcPr>
+          <w:p>
+            <w:r>
+              <w:rPr>
+                <w:rFonts w:ascii="Times New Roman" w:hAnsi="Times New Roman"/>
+                <w:sz w:val="19"/>
+              </w:rPr>
+              <w:t>password</w:t>
+            </w:r>
+          </w:p>
+        </w:tc>
+        <w:tc>
+          <w:tcPr>
+            <w:tcW w:type="dxa" w:w="2340"/>
+          </w:tcPr>
+          <w:p>
+            <w:r>
+              <w:rPr>
+                <w:rFonts w:ascii="Times New Roman" w:hAnsi="Times New Roman"/>
+                <w:sz w:val="19"/>
+              </w:rPr>
+              <w:t>VARCHAR</w:t>
+            </w:r>
+          </w:p>
+        </w:tc>
+        <w:tc>
+          <w:tcPr>
+            <w:tcW w:type="dxa" w:w="2340"/>
+          </w:tcPr>
+          <w:p>
+            <w:r>
+              <w:rPr>
+                <w:rFonts w:ascii="Times New Roman" w:hAnsi="Times New Roman"/>
+                <w:sz w:val="19"/>
+              </w:rPr>
+              <w:t>Hashed</w:t>
+            </w:r>
+          </w:p>
+        </w:tc>
+        <w:tc>
+          <w:tcPr>
+            <w:tcW w:type="dxa" w:w="2340"/>
+          </w:tcPr>
+          <w:p>
+            <w:r>
+              <w:rPr>
+                <w:rFonts w:ascii="Times New Roman" w:hAnsi="Times New Roman"/>
+                <w:sz w:val="19"/>
+              </w:rPr>
+              <w:t>Secure hashed password string.</w:t>
+            </w:r>
+          </w:p>
+        </w:tc>
+      </w:tr>
+      <w:tr>
+        <w:tc>
+          <w:tcPr>
+            <w:tcW w:type="dxa" w:w="2340"/>
+          </w:tcPr>
+          <w:p>
+            <w:r>
+              <w:rPr>
+                <w:rFonts w:ascii="Times New Roman" w:hAnsi="Times New Roman"/>
+                <w:sz w:val="19"/>
+              </w:rPr>
+              <w:t>email</w:t>
+            </w:r>
+          </w:p>
+        </w:tc>
+        <w:tc>
+          <w:tcPr>
+            <w:tcW w:type="dxa" w:w="2340"/>
+          </w:tcPr>
+          <w:p>
+            <w:r>
+              <w:rPr>
+                <w:rFonts w:ascii="Times New Roman" w:hAnsi="Times New Roman"/>
+                <w:sz w:val="19"/>
+              </w:rPr>
+              <w:t>VARCHAR</w:t>
+            </w:r>
+          </w:p>
+        </w:tc>
+        <w:tc>
+          <w:tcPr>
+            <w:tcW w:type="dxa" w:w="2340"/>
+          </w:tcPr>
+          <w:p>
+            <w:r>
+              <w:rPr>
+                <w:rFonts w:ascii="Times New Roman" w:hAnsi="Times New Roman"/>
+                <w:sz w:val="19"/>
+              </w:rPr>
+              <w:t>Required</w:t>
+            </w:r>
+          </w:p>
+        </w:tc>
+        <w:tc>
+          <w:tcPr>
+            <w:tcW w:type="dxa" w:w="2340"/>
+          </w:tcPr>
+          <w:p>
+            <w:r>
+              <w:rPr>
+                <w:rFonts w:ascii="Times New Roman" w:hAnsi="Times New Roman"/>
+                <w:sz w:val="19"/>
+              </w:rPr>
+              <w:t>Contact email address.</w:t>
+            </w:r>
+          </w:p>
+        </w:tc>
+      </w:tr>
+      <w:tr>
+        <w:tc>
+          <w:tcPr>
+            <w:tcW w:type="dxa" w:w="2340"/>
+          </w:tcPr>
+          <w:p>
+            <w:r>
+              <w:rPr>
+                <w:rFonts w:ascii="Times New Roman" w:hAnsi="Times New Roman"/>
+                <w:sz w:val="19"/>
+              </w:rPr>
+              <w:t>role</w:t>
+            </w:r>
+          </w:p>
+        </w:tc>
+        <w:tc>
+          <w:tcPr>
+            <w:tcW w:type="dxa" w:w="2340"/>
+          </w:tcPr>
+          <w:p>
+            <w:r>
+              <w:rPr>
+                <w:rFonts w:ascii="Times New Roman" w:hAnsi="Times New Roman"/>
+                <w:sz w:val="19"/>
+              </w:rPr>
+              <w:t>VARCHAR</w:t>
+            </w:r>
+          </w:p>
+        </w:tc>
+        <w:tc>
+          <w:tcPr>
+            <w:tcW w:type="dxa" w:w="2340"/>
+          </w:tcPr>
+          <w:p>
+            <w:r>
+              <w:rPr>
+                <w:rFonts w:ascii="Times New Roman" w:hAnsi="Times New Roman"/>
+                <w:sz w:val="19"/>
+              </w:rPr>
+              <w:t>system_admin / inspector / port_authority</w:t>
+            </w:r>
+          </w:p>
+        </w:tc>
+        <w:tc>
+          <w:tcPr>
+            <w:tcW w:type="dxa" w:w="2340"/>
+          </w:tcPr>
+          <w:p>
+            <w:r>
+              <w:rPr>
+                <w:rFonts w:ascii="Times New Roman" w:hAnsi="Times New Roman"/>
+                <w:sz w:val="19"/>
+              </w:rPr>
+              <w:t>Role-based privileges.</w:t>
+            </w:r>
+          </w:p>
+        </w:tc>
+      </w:tr>
+      <w:tr>
+        <w:tc>
+          <w:tcPr>
+            <w:tcW w:type="dxa" w:w="2340"/>
+          </w:tcPr>
+          <w:p>
+            <w:r>
+              <w:rPr>
+                <w:rFonts w:ascii="Times New Roman" w:hAnsi="Times New Roman"/>
+                <w:sz w:val="19"/>
+              </w:rPr>
+              <w:t>is_approved</w:t>
+            </w:r>
+          </w:p>
+        </w:tc>
+        <w:tc>
+          <w:tcPr>
+            <w:tcW w:type="dxa" w:w="2340"/>
+          </w:tcPr>
+          <w:p>
+            <w:r>
+              <w:rPr>
+                <w:rFonts w:ascii="Times New Roman" w:hAnsi="Times New Roman"/>
+                <w:sz w:val="19"/>
+              </w:rPr>
+              <w:t>BOOLEAN</w:t>
+            </w:r>
+          </w:p>
+        </w:tc>
+        <w:tc>
+          <w:tcPr>
+            <w:tcW w:type="dxa" w:w="2340"/>
+          </w:tcPr>
+          <w:p>
+            <w:r>
+              <w:rPr>
+                <w:rFonts w:ascii="Times New Roman" w:hAnsi="Times New Roman"/>
+                <w:sz w:val="19"/>
+              </w:rPr>
+              <w:t>Default: False</w:t>
+            </w:r>
+          </w:p>
+        </w:tc>
+        <w:tc>
+          <w:tcPr>
+            <w:tcW w:type="dxa" w:w="2340"/>
+          </w:tcPr>
+          <w:p>
+            <w:r>
+              <w:rPr>
+                <w:rFonts w:ascii="Times New Roman" w:hAnsi="Times New Roman"/>
+                <w:sz w:val="19"/>
+              </w:rPr>
+              <w:t>Onboarding validation flag.</w:t>
+            </w:r>
+          </w:p>
+        </w:tc>
+      </w:tr>
+      <w:tr>
+        <w:tc>
+          <w:tcPr>
+            <w:tcW w:type="dxa" w:w="2340"/>
+          </w:tcPr>
+          <w:p>
+            <w:r>
+              <w:rPr>
+                <w:rFonts w:ascii="Times New Roman" w:hAnsi="Times New Roman"/>
+                <w:sz w:val="19"/>
+              </w:rPr>
+              <w:t>two_fa_enabled</w:t>
+            </w:r>
+          </w:p>
+        </w:tc>
+        <w:tc>
+          <w:tcPr>
+            <w:tcW w:type="dxa" w:w="2340"/>
+          </w:tcPr>
+          <w:p>
+            <w:r>
+              <w:rPr>
+                <w:rFonts w:ascii="Times New Roman" w:hAnsi="Times New Roman"/>
+                <w:sz w:val="19"/>
+              </w:rPr>
+              <w:t>BOOLEAN</w:t>
+            </w:r>
+          </w:p>
+        </w:tc>
+        <w:tc>
+          <w:tcPr>
+            <w:tcW w:type="dxa" w:w="2340"/>
+          </w:tcPr>
+          <w:p>
+            <w:r>
+              <w:rPr>
+                <w:rFonts w:ascii="Times New Roman" w:hAnsi="Times New Roman"/>
+                <w:sz w:val="19"/>
+              </w:rPr>
+              <w:t>Default: True</w:t>
+            </w:r>
+          </w:p>
+        </w:tc>
+        <w:tc>
+          <w:tcPr>
+            <w:tcW w:type="dxa" w:w="2340"/>
+          </w:tcPr>
+          <w:p>
+            <w:r>
+              <w:rPr>
+                <w:rFonts w:ascii="Times New Roman" w:hAnsi="Times New Roman"/>
+                <w:sz w:val="19"/>
+              </w:rPr>
+              <w:t>2FA authentication flag.</w:t>
+            </w:r>
+          </w:p>
+        </w:tc>
+      </w:tr>
+      <w:tr>
+        <w:tc>
+          <w:tcPr>
+            <w:tcW w:type="dxa" w:w="2340"/>
+          </w:tcPr>
+          <w:p>
+            <w:r>
+              <w:rPr>
+                <w:rFonts w:ascii="Times New Roman" w:hAnsi="Times New Roman"/>
+                <w:sz w:val="19"/>
+              </w:rPr>
+              <w:t>last_login</w:t>
+            </w:r>
+          </w:p>
+        </w:tc>
+        <w:tc>
+          <w:tcPr>
+            <w:tcW w:type="dxa" w:w="2340"/>
+          </w:tcPr>
+          <w:p>
+            <w:r>
+              <w:rPr>
+                <w:rFonts w:ascii="Times New Roman" w:hAnsi="Times New Roman"/>
+                <w:sz w:val="19"/>
+              </w:rPr>
+              <w:t>TIMESTAMP</w:t>
+            </w:r>
+          </w:p>
+        </w:tc>
+        <w:tc>
+          <w:tcPr>
+            <w:tcW w:type="dxa" w:w="2340"/>
+          </w:tcPr>
+          <w:p>
+            <w:r>
+              <w:rPr>
+                <w:rFonts w:ascii="Times New Roman" w:hAnsi="Times New Roman"/>
+                <w:sz w:val="19"/>
+              </w:rPr>
+              <w:t>Nullable</w:t>
+            </w:r>
+          </w:p>
+        </w:tc>
+        <w:tc>
+          <w:tcPr>
+            <w:tcW w:type="dxa" w:w="2340"/>
+          </w:tcPr>
+          <w:p>
+            <w:r>
+              <w:rPr>
+                <w:rFonts w:ascii="Times New Roman" w:hAnsi="Times New Roman"/>
+                <w:sz w:val="19"/>
+              </w:rPr>
+              <w:t>Tracks the user's latest login.</w:t>
+            </w:r>
+          </w:p>
+        </w:tc>
+      </w:tr>
+    </w:tbl>
+    <w:p>
+      <w:pPr>
+        <w:spacing w:before="0" w:after="120"/>
+      </w:pPr>
+    </w:p>
+    <w:p>
+      <w:pPr>
+        <w:keepNext/>
+        <w:spacing w:before="160" w:after="40"/>
+      </w:pPr>
+      <w:r>
+        <w:rPr>
+          <w:rFonts w:ascii="Arial" w:hAnsi="Arial"/>
+          <w:b/>
+          <w:color w:val="646E7D"/>
+          <w:sz w:val="22"/>
+        </w:rPr>
+        <w:t>4.3.2 Voyages Collection Schema</w:t>
+      </w:r>
+    </w:p>
+    <w:tbl>
+      <w:tblPr>
+        <w:tblStyle w:val="TableGrid"/>
+        <w:tblW w:type="auto" w:w="0"/>
+        <w:tblLook w:firstColumn="1" w:firstRow="1" w:lastColumn="0" w:lastRow="0" w:noHBand="0" w:noVBand="1" w:val="04A0"/>
+      </w:tblPr>
+      <w:tblGrid>
+        <w:gridCol w:w="2340"/>
+        <w:gridCol w:w="2340"/>
+        <w:gridCol w:w="2340"/>
+        <w:gridCol w:w="2340"/>
+      </w:tblGrid>
+      <w:tr>
+        <w:tc>
+          <w:tcPr>
+            <w:tcW w:type="dxa" w:w="2340"/>
+          </w:tcPr>
+          <w:p>
+            <w:r>
+              <w:rPr>
+                <w:rFonts w:ascii="Arial" w:hAnsi="Arial"/>
+                <w:b/>
+                <w:color w:val="0D2B5E"/>
+                <w:sz w:val="19"/>
+              </w:rPr>
+              <w:t>Field Name</w:t>
+            </w:r>
+          </w:p>
+        </w:tc>
+        <w:tc>
+          <w:tcPr>
+            <w:tcW w:type="dxa" w:w="2340"/>
+          </w:tcPr>
+          <w:p>
+            <w:r>
+              <w:rPr>
+                <w:rFonts w:ascii="Arial" w:hAnsi="Arial"/>
+                <w:b/>
+                <w:color w:val="0D2B5E"/>
+                <w:sz w:val="19"/>
+              </w:rPr>
+              <w:t>Data Type</w:t>
+            </w:r>
+          </w:p>
+        </w:tc>
+        <w:tc>
+          <w:tcPr>
+            <w:tcW w:type="dxa" w:w="2340"/>
+          </w:tcPr>
+          <w:p>
+            <w:r>
+              <w:rPr>
+                <w:rFonts w:ascii="Arial" w:hAnsi="Arial"/>
+                <w:b/>
+                <w:color w:val="0D2B5E"/>
+                <w:sz w:val="19"/>
+              </w:rPr>
+              <w:t>Constraints</w:t>
+            </w:r>
+          </w:p>
+        </w:tc>
+        <w:tc>
+          <w:tcPr>
+            <w:tcW w:type="dxa" w:w="2340"/>
+          </w:tcPr>
+          <w:p>
+            <w:r>
+              <w:rPr>
+                <w:rFonts w:ascii="Arial" w:hAnsi="Arial"/>
+                <w:b/>
+                <w:color w:val="0D2B5E"/>
+                <w:sz w:val="19"/>
+              </w:rPr>
+              <w:t>Description</w:t>
+            </w:r>
+          </w:p>
+        </w:tc>
+      </w:tr>
+      <w:tr>
+        <w:tc>
+          <w:tcPr>
+            <w:tcW w:type="dxa" w:w="2340"/>
+          </w:tcPr>
+          <w:p>
+            <w:r>
+              <w:rPr>
+                <w:rFonts w:ascii="Times New Roman" w:hAnsi="Times New Roman"/>
+                <w:sz w:val="19"/>
+              </w:rPr>
+              <w:t>id</w:t>
+            </w:r>
+          </w:p>
+        </w:tc>
+        <w:tc>
+          <w:tcPr>
+            <w:tcW w:type="dxa" w:w="2340"/>
+          </w:tcPr>
+          <w:p>
+            <w:r>
+              <w:rPr>
+                <w:rFonts w:ascii="Times New Roman" w:hAnsi="Times New Roman"/>
+                <w:sz w:val="19"/>
+              </w:rPr>
+              <w:t>INTEGER</w:t>
+            </w:r>
+          </w:p>
+        </w:tc>
+        <w:tc>
+          <w:tcPr>
+            <w:tcW w:type="dxa" w:w="2340"/>
+          </w:tcPr>
+          <w:p>
+            <w:r>
+              <w:rPr>
+                <w:rFonts w:ascii="Times New Roman" w:hAnsi="Times New Roman"/>
+                <w:sz w:val="19"/>
+              </w:rPr>
+              <w:t>Primary Key</w:t>
+            </w:r>
+          </w:p>
+        </w:tc>
+        <w:tc>
+          <w:tcPr>
+            <w:tcW w:type="dxa" w:w="2340"/>
+          </w:tcPr>
+          <w:p>
+            <w:r>
+              <w:rPr>
+                <w:rFonts w:ascii="Times New Roman" w:hAnsi="Times New Roman"/>
+                <w:sz w:val="19"/>
+              </w:rPr>
+              <w:t>Voyage unique record identification.</w:t>
+            </w:r>
+          </w:p>
+        </w:tc>
+      </w:tr>
+      <w:tr>
+        <w:tc>
+          <w:tcPr>
+            <w:tcW w:type="dxa" w:w="2340"/>
+          </w:tcPr>
+          <w:p>
+            <w:r>
+              <w:rPr>
+                <w:rFonts w:ascii="Times New Roman" w:hAnsi="Times New Roman"/>
+                <w:sz w:val="19"/>
+              </w:rPr>
+              <w:t>bill_of_lading</w:t>
+            </w:r>
+          </w:p>
+        </w:tc>
+        <w:tc>
+          <w:tcPr>
+            <w:tcW w:type="dxa" w:w="2340"/>
+          </w:tcPr>
+          <w:p>
+            <w:r>
+              <w:rPr>
+                <w:rFonts w:ascii="Times New Roman" w:hAnsi="Times New Roman"/>
+                <w:sz w:val="19"/>
+              </w:rPr>
+              <w:t>VARCHAR</w:t>
+            </w:r>
+          </w:p>
+        </w:tc>
+        <w:tc>
+          <w:tcPr>
+            <w:tcW w:type="dxa" w:w="2340"/>
+          </w:tcPr>
+          <w:p>
+            <w:r>
+              <w:rPr>
+                <w:rFonts w:ascii="Times New Roman" w:hAnsi="Times New Roman"/>
+                <w:sz w:val="19"/>
+              </w:rPr>
+              <w:t>Unique, Required</w:t>
+            </w:r>
+          </w:p>
+        </w:tc>
+        <w:tc>
+          <w:tcPr>
+            <w:tcW w:type="dxa" w:w="2340"/>
+          </w:tcPr>
+          <w:p>
+            <w:r>
+              <w:rPr>
+                <w:rFonts w:ascii="Times New Roman" w:hAnsi="Times New Roman"/>
+                <w:sz w:val="19"/>
+              </w:rPr>
+              <w:t>Cargo shipment identifier.</w:t>
+            </w:r>
+          </w:p>
+        </w:tc>
+      </w:tr>
+      <w:tr>
+        <w:tc>
+          <w:tcPr>
+            <w:tcW w:type="dxa" w:w="2340"/>
+          </w:tcPr>
+          <w:p>
+            <w:r>
+              <w:rPr>
+                <w:rFonts w:ascii="Times New Roman" w:hAnsi="Times New Roman"/>
+                <w:sz w:val="19"/>
+              </w:rPr>
+              <w:t>vessel_name</w:t>
+            </w:r>
+          </w:p>
+        </w:tc>
+        <w:tc>
+          <w:tcPr>
+            <w:tcW w:type="dxa" w:w="2340"/>
+          </w:tcPr>
+          <w:p>
+            <w:r>
+              <w:rPr>
+                <w:rFonts w:ascii="Times New Roman" w:hAnsi="Times New Roman"/>
+                <w:sz w:val="19"/>
+              </w:rPr>
+              <w:t>VARCHAR</w:t>
+            </w:r>
+          </w:p>
+        </w:tc>
+        <w:tc>
+          <w:tcPr>
+            <w:tcW w:type="dxa" w:w="2340"/>
+          </w:tcPr>
+          <w:p>
+            <w:r>
+              <w:rPr>
+                <w:rFonts w:ascii="Times New Roman" w:hAnsi="Times New Roman"/>
+                <w:sz w:val="19"/>
+              </w:rPr>
+              <w:t>Required</w:t>
+            </w:r>
+          </w:p>
+        </w:tc>
+        <w:tc>
+          <w:tcPr>
+            <w:tcW w:type="dxa" w:w="2340"/>
+          </w:tcPr>
+          <w:p>
+            <w:r>
+              <w:rPr>
+                <w:rFonts w:ascii="Times New Roman" w:hAnsi="Times New Roman"/>
+                <w:sz w:val="19"/>
+              </w:rPr>
+              <w:t>Name of the incoming vessel.</w:t>
+            </w:r>
+          </w:p>
+        </w:tc>
+      </w:tr>
+      <w:tr>
+        <w:tc>
+          <w:tcPr>
+            <w:tcW w:type="dxa" w:w="2340"/>
+          </w:tcPr>
+          <w:p>
+            <w:r>
+              <w:rPr>
+                <w:rFonts w:ascii="Times New Roman" w:hAnsi="Times New Roman"/>
+                <w:sz w:val="19"/>
+              </w:rPr>
+              <w:t>origin_port</w:t>
+            </w:r>
+          </w:p>
+        </w:tc>
+        <w:tc>
+          <w:tcPr>
+            <w:tcW w:type="dxa" w:w="2340"/>
+          </w:tcPr>
+          <w:p>
+            <w:r>
+              <w:rPr>
+                <w:rFonts w:ascii="Times New Roman" w:hAnsi="Times New Roman"/>
+                <w:sz w:val="19"/>
+              </w:rPr>
+              <w:t>VARCHAR</w:t>
+            </w:r>
+          </w:p>
+        </w:tc>
+        <w:tc>
+          <w:tcPr>
+            <w:tcW w:type="dxa" w:w="2340"/>
+          </w:tcPr>
+          <w:p>
+            <w:r>
+              <w:rPr>
+                <w:rFonts w:ascii="Times New Roman" w:hAnsi="Times New Roman"/>
+                <w:sz w:val="19"/>
+              </w:rPr>
+              <w:t>Required</w:t>
+            </w:r>
+          </w:p>
+        </w:tc>
+        <w:tc>
+          <w:tcPr>
+            <w:tcW w:type="dxa" w:w="2340"/>
+          </w:tcPr>
+          <w:p>
+            <w:r>
+              <w:rPr>
+                <w:rFonts w:ascii="Times New Roman" w:hAnsi="Times New Roman"/>
+                <w:sz w:val="19"/>
+              </w:rPr>
+              <w:t>Port of cargo dispatch.</w:t>
+            </w:r>
+          </w:p>
+        </w:tc>
+      </w:tr>
+      <w:tr>
+        <w:tc>
+          <w:tcPr>
+            <w:tcW w:type="dxa" w:w="2340"/>
+          </w:tcPr>
+          <w:p>
+            <w:r>
+              <w:rPr>
+                <w:rFonts w:ascii="Times New Roman" w:hAnsi="Times New Roman"/>
+                <w:sz w:val="19"/>
+              </w:rPr>
+              <w:t>cargo_type</w:t>
+            </w:r>
+          </w:p>
+        </w:tc>
+        <w:tc>
+          <w:tcPr>
+            <w:tcW w:type="dxa" w:w="2340"/>
+          </w:tcPr>
+          <w:p>
+            <w:r>
+              <w:rPr>
+                <w:rFonts w:ascii="Times New Roman" w:hAnsi="Times New Roman"/>
+                <w:sz w:val="19"/>
+              </w:rPr>
+              <w:t>VARCHAR</w:t>
+            </w:r>
+          </w:p>
+        </w:tc>
+        <w:tc>
+          <w:tcPr>
+            <w:tcW w:type="dxa" w:w="2340"/>
+          </w:tcPr>
+          <w:p>
+            <w:r>
+              <w:rPr>
+                <w:rFonts w:ascii="Times New Roman" w:hAnsi="Times New Roman"/>
+                <w:sz w:val="19"/>
+              </w:rPr>
+              <w:t>Required</w:t>
+            </w:r>
+          </w:p>
+        </w:tc>
+        <w:tc>
+          <w:tcPr>
+            <w:tcW w:type="dxa" w:w="2340"/>
+          </w:tcPr>
+          <w:p>
+            <w:r>
+              <w:rPr>
+                <w:rFonts w:ascii="Times New Roman" w:hAnsi="Times New Roman"/>
+                <w:sz w:val="19"/>
+              </w:rPr>
+              <w:t>Category of cargo commodity.</w:t>
+            </w:r>
+          </w:p>
+        </w:tc>
+      </w:tr>
+      <w:tr>
+        <w:tc>
+          <w:tcPr>
+            <w:tcW w:type="dxa" w:w="2340"/>
+          </w:tcPr>
+          <w:p>
+            <w:r>
+              <w:rPr>
+                <w:rFonts w:ascii="Times New Roman" w:hAnsi="Times New Roman"/>
+                <w:sz w:val="19"/>
+              </w:rPr>
+              <w:t>weight</w:t>
+            </w:r>
+          </w:p>
+        </w:tc>
+        <w:tc>
+          <w:tcPr>
+            <w:tcW w:type="dxa" w:w="2340"/>
+          </w:tcPr>
+          <w:p>
+            <w:r>
+              <w:rPr>
+                <w:rFonts w:ascii="Times New Roman" w:hAnsi="Times New Roman"/>
+                <w:sz w:val="19"/>
+              </w:rPr>
+              <w:t>REAL</w:t>
+            </w:r>
+          </w:p>
+        </w:tc>
+        <w:tc>
+          <w:tcPr>
+            <w:tcW w:type="dxa" w:w="2340"/>
+          </w:tcPr>
+          <w:p>
+            <w:r>
+              <w:rPr>
+                <w:rFonts w:ascii="Times New Roman" w:hAnsi="Times New Roman"/>
+                <w:sz w:val="19"/>
+              </w:rPr>
+              <w:t>Required</w:t>
+            </w:r>
+          </w:p>
+        </w:tc>
+        <w:tc>
+          <w:tcPr>
+            <w:tcW w:type="dxa" w:w="2340"/>
+          </w:tcPr>
+          <w:p>
+            <w:r>
+              <w:rPr>
+                <w:rFonts w:ascii="Times New Roman" w:hAnsi="Times New Roman"/>
+                <w:sz w:val="19"/>
+              </w:rPr>
+              <w:t>Registered manifest weight (MT).</w:t>
+            </w:r>
+          </w:p>
+        </w:tc>
+      </w:tr>
+      <w:tr>
+        <w:tc>
+          <w:tcPr>
+            <w:tcW w:type="dxa" w:w="2340"/>
+          </w:tcPr>
+          <w:p>
+            <w:r>
+              <w:rPr>
+                <w:rFonts w:ascii="Times New Roman" w:hAnsi="Times New Roman"/>
+                <w:sz w:val="19"/>
+              </w:rPr>
+              <w:t>status</w:t>
+            </w:r>
+          </w:p>
+        </w:tc>
+        <w:tc>
+          <w:tcPr>
+            <w:tcW w:type="dxa" w:w="2340"/>
+          </w:tcPr>
+          <w:p>
+            <w:r>
+              <w:rPr>
+                <w:rFonts w:ascii="Times New Roman" w:hAnsi="Times New Roman"/>
+                <w:sz w:val="19"/>
+              </w:rPr>
+              <w:t>VARCHAR</w:t>
+            </w:r>
+          </w:p>
+        </w:tc>
+        <w:tc>
+          <w:tcPr>
+            <w:tcW w:type="dxa" w:w="2340"/>
+          </w:tcPr>
+          <w:p>
+            <w:r>
+              <w:rPr>
+                <w:rFonts w:ascii="Times New Roman" w:hAnsi="Times New Roman"/>
+                <w:sz w:val="19"/>
+              </w:rPr>
+              <w:t>Pending / Inspected / Approved / Rejected</w:t>
+            </w:r>
+          </w:p>
+        </w:tc>
+        <w:tc>
+          <w:tcPr>
+            <w:tcW w:type="dxa" w:w="2340"/>
+          </w:tcPr>
+          <w:p>
+            <w:r>
+              <w:rPr>
+                <w:rFonts w:ascii="Times New Roman" w:hAnsi="Times New Roman"/>
+                <w:sz w:val="19"/>
+              </w:rPr>
+              <w:t>Current clearance stepper state.</w:t>
+            </w:r>
+          </w:p>
+        </w:tc>
+      </w:tr>
+      <w:tr>
+        <w:tc>
+          <w:tcPr>
+            <w:tcW w:type="dxa" w:w="2340"/>
+          </w:tcPr>
+          <w:p>
+            <w:r>
+              <w:rPr>
+                <w:rFonts w:ascii="Times New Roman" w:hAnsi="Times New Roman"/>
+                <w:sz w:val="19"/>
+              </w:rPr>
+              <w:t>actual_weight</w:t>
+            </w:r>
+          </w:p>
+        </w:tc>
+        <w:tc>
+          <w:tcPr>
+            <w:tcW w:type="dxa" w:w="2340"/>
+          </w:tcPr>
+          <w:p>
+            <w:r>
+              <w:rPr>
+                <w:rFonts w:ascii="Times New Roman" w:hAnsi="Times New Roman"/>
+                <w:sz w:val="19"/>
+              </w:rPr>
+              <w:t>REAL</w:t>
+            </w:r>
+          </w:p>
+        </w:tc>
+        <w:tc>
+          <w:tcPr>
+            <w:tcW w:type="dxa" w:w="2340"/>
+          </w:tcPr>
+          <w:p>
+            <w:r>
+              <w:rPr>
+                <w:rFonts w:ascii="Times New Roman" w:hAnsi="Times New Roman"/>
+                <w:sz w:val="19"/>
+              </w:rPr>
+              <w:t>Nullable</w:t>
+            </w:r>
+          </w:p>
+        </w:tc>
+        <w:tc>
+          <w:tcPr>
+            <w:tcW w:type="dxa" w:w="2340"/>
+          </w:tcPr>
+          <w:p>
+            <w:r>
+              <w:rPr>
+                <w:rFonts w:ascii="Times New Roman" w:hAnsi="Times New Roman"/>
+                <w:sz w:val="19"/>
+              </w:rPr>
+              <w:t>Inspector-verified scale weight.</w:t>
+            </w:r>
+          </w:p>
+        </w:tc>
+      </w:tr>
+      <w:tr>
+        <w:tc>
+          <w:tcPr>
+            <w:tcW w:type="dxa" w:w="2340"/>
+          </w:tcPr>
+          <w:p>
+            <w:r>
+              <w:rPr>
+                <w:rFonts w:ascii="Times New Roman" w:hAnsi="Times New Roman"/>
+                <w:sz w:val="19"/>
+              </w:rPr>
+              <w:t>seal_intact</w:t>
+            </w:r>
+          </w:p>
+        </w:tc>
+        <w:tc>
+          <w:tcPr>
+            <w:tcW w:type="dxa" w:w="2340"/>
+          </w:tcPr>
+          <w:p>
+            <w:r>
+              <w:rPr>
+                <w:rFonts w:ascii="Times New Roman" w:hAnsi="Times New Roman"/>
+                <w:sz w:val="19"/>
+              </w:rPr>
+              <w:t>BOOLEAN</w:t>
+            </w:r>
+          </w:p>
+        </w:tc>
+        <w:tc>
+          <w:tcPr>
+            <w:tcW w:type="dxa" w:w="2340"/>
+          </w:tcPr>
+          <w:p>
+            <w:r>
+              <w:rPr>
+                <w:rFonts w:ascii="Times New Roman" w:hAnsi="Times New Roman"/>
+                <w:sz w:val="19"/>
+              </w:rPr>
+              <w:t>Nullable</w:t>
+            </w:r>
+          </w:p>
+        </w:tc>
+        <w:tc>
+          <w:tcPr>
+            <w:tcW w:type="dxa" w:w="2340"/>
+          </w:tcPr>
+          <w:p>
+            <w:r>
+              <w:rPr>
+                <w:rFonts w:ascii="Times New Roman" w:hAnsi="Times New Roman"/>
+                <w:sz w:val="19"/>
+              </w:rPr>
+              <w:t>Container physical seal integrity flag.</w:t>
+            </w:r>
+          </w:p>
+        </w:tc>
+      </w:tr>
+      <w:tr>
+        <w:tc>
+          <w:tcPr>
+            <w:tcW w:type="dxa" w:w="2340"/>
+          </w:tcPr>
+          <w:p>
+            <w:r>
+              <w:rPr>
+                <w:rFonts w:ascii="Times New Roman" w:hAnsi="Times New Roman"/>
+                <w:sz w:val="19"/>
+              </w:rPr>
+              <w:t>qr_token</w:t>
+            </w:r>
+          </w:p>
+        </w:tc>
+        <w:tc>
+          <w:tcPr>
+            <w:tcW w:type="dxa" w:w="2340"/>
+          </w:tcPr>
+          <w:p>
+            <w:r>
+              <w:rPr>
+                <w:rFonts w:ascii="Times New Roman" w:hAnsi="Times New Roman"/>
+                <w:sz w:val="19"/>
+              </w:rPr>
+              <w:t>VARCHAR</w:t>
+            </w:r>
+          </w:p>
+        </w:tc>
+        <w:tc>
+          <w:tcPr>
+            <w:tcW w:type="dxa" w:w="2340"/>
+          </w:tcPr>
+          <w:p>
+            <w:r>
+              <w:rPr>
+                <w:rFonts w:ascii="Times New Roman" w:hAnsi="Times New Roman"/>
+                <w:sz w:val="19"/>
+              </w:rPr>
+              <w:t>Nullable</w:t>
+            </w:r>
+          </w:p>
+        </w:tc>
+        <w:tc>
+          <w:tcPr>
+            <w:tcW w:type="dxa" w:w="2340"/>
+          </w:tcPr>
+          <w:p>
+            <w:r>
+              <w:rPr>
+                <w:rFonts w:ascii="Times New Roman" w:hAnsi="Times New Roman"/>
+                <w:sz w:val="19"/>
+              </w:rPr>
+              <w:t>Cryptographic clear-pass pass token.</w:t>
+            </w:r>
+          </w:p>
+        </w:tc>
+      </w:tr>
+    </w:tbl>
+    <w:p>
+      <w:pPr>
+        <w:spacing w:before="0" w:after="120"/>
+      </w:pPr>
+    </w:p>
+    <w:p>
+      <w:pPr>
+        <w:keepNext/>
+        <w:spacing w:before="160" w:after="40"/>
+      </w:pPr>
+      <w:r>
+        <w:rPr>
+          <w:rFonts w:ascii="Arial" w:hAnsi="Arial"/>
+          <w:b/>
+          <w:color w:val="646E7D"/>
+          <w:sz w:val="22"/>
+        </w:rPr>
+        <w:t>4.3.3 Grievances Collection Schema</w:t>
+      </w:r>
+    </w:p>
+    <w:tbl>
+      <w:tblPr>
+        <w:tblStyle w:val="TableGrid"/>
+        <w:tblW w:type="auto" w:w="0"/>
+        <w:tblLook w:firstColumn="1" w:firstRow="1" w:lastColumn="0" w:lastRow="0" w:noHBand="0" w:noVBand="1" w:val="04A0"/>
+      </w:tblPr>
+      <w:tblGrid>
+        <w:gridCol w:w="2340"/>
+        <w:gridCol w:w="2340"/>
+        <w:gridCol w:w="2340"/>
+        <w:gridCol w:w="2340"/>
+      </w:tblGrid>
+      <w:tr>
+        <w:tc>
+          <w:tcPr>
+            <w:tcW w:type="dxa" w:w="2340"/>
+          </w:tcPr>
+          <w:p>
+            <w:r>
+              <w:rPr>
+                <w:rFonts w:ascii="Arial" w:hAnsi="Arial"/>
+                <w:b/>
+                <w:color w:val="0D2B5E"/>
+                <w:sz w:val="19"/>
+              </w:rPr>
+              <w:t>Field Name</w:t>
+            </w:r>
+          </w:p>
+        </w:tc>
+        <w:tc>
+          <w:tcPr>
+            <w:tcW w:type="dxa" w:w="2340"/>
+          </w:tcPr>
+          <w:p>
+            <w:r>
+              <w:rPr>
+                <w:rFonts w:ascii="Arial" w:hAnsi="Arial"/>
+                <w:b/>
+                <w:color w:val="0D2B5E"/>
+                <w:sz w:val="19"/>
+              </w:rPr>
+              <w:t>Data Type</w:t>
+            </w:r>
+          </w:p>
+        </w:tc>
+        <w:tc>
+          <w:tcPr>
+            <w:tcW w:type="dxa" w:w="2340"/>
+          </w:tcPr>
+          <w:p>
+            <w:r>
+              <w:rPr>
+                <w:rFonts w:ascii="Arial" w:hAnsi="Arial"/>
+                <w:b/>
+                <w:color w:val="0D2B5E"/>
+                <w:sz w:val="19"/>
+              </w:rPr>
+              <w:t>Constraints</w:t>
+            </w:r>
+          </w:p>
+        </w:tc>
+        <w:tc>
+          <w:tcPr>
+            <w:tcW w:type="dxa" w:w="2340"/>
+          </w:tcPr>
+          <w:p>
+            <w:r>
+              <w:rPr>
+                <w:rFonts w:ascii="Arial" w:hAnsi="Arial"/>
+                <w:b/>
+                <w:color w:val="0D2B5E"/>
+                <w:sz w:val="19"/>
+              </w:rPr>
+              <w:t>Description</w:t>
+            </w:r>
+          </w:p>
+        </w:tc>
+      </w:tr>
+      <w:tr>
+        <w:tc>
+          <w:tcPr>
+            <w:tcW w:type="dxa" w:w="2340"/>
+          </w:tcPr>
+          <w:p>
+            <w:r>
+              <w:rPr>
+                <w:rFonts w:ascii="Times New Roman" w:hAnsi="Times New Roman"/>
+                <w:sz w:val="19"/>
+              </w:rPr>
+              <w:t>id</w:t>
+            </w:r>
+          </w:p>
+        </w:tc>
+        <w:tc>
+          <w:tcPr>
+            <w:tcW w:type="dxa" w:w="2340"/>
+          </w:tcPr>
+          <w:p>
+            <w:r>
+              <w:rPr>
+                <w:rFonts w:ascii="Times New Roman" w:hAnsi="Times New Roman"/>
+                <w:sz w:val="19"/>
+              </w:rPr>
+              <w:t>INTEGER</w:t>
+            </w:r>
+          </w:p>
+        </w:tc>
+        <w:tc>
+          <w:tcPr>
+            <w:tcW w:type="dxa" w:w="2340"/>
+          </w:tcPr>
+          <w:p>
+            <w:r>
+              <w:rPr>
+                <w:rFonts w:ascii="Times New Roman" w:hAnsi="Times New Roman"/>
+                <w:sz w:val="19"/>
+              </w:rPr>
+              <w:t>Primary Key</w:t>
+            </w:r>
+          </w:p>
+        </w:tc>
+        <w:tc>
+          <w:tcPr>
+            <w:tcW w:type="dxa" w:w="2340"/>
+          </w:tcPr>
+          <w:p>
+            <w:r>
+              <w:rPr>
+                <w:rFonts w:ascii="Times New Roman" w:hAnsi="Times New Roman"/>
+                <w:sz w:val="19"/>
+              </w:rPr>
+              <w:t>Grievance unique reference ID.</w:t>
+            </w:r>
+          </w:p>
+        </w:tc>
+      </w:tr>
+      <w:tr>
+        <w:tc>
+          <w:tcPr>
+            <w:tcW w:type="dxa" w:w="2340"/>
+          </w:tcPr>
+          <w:p>
+            <w:r>
+              <w:rPr>
+                <w:rFonts w:ascii="Times New Roman" w:hAnsi="Times New Roman"/>
+                <w:sz w:val="19"/>
+              </w:rPr>
+              <w:t>email</w:t>
+            </w:r>
+          </w:p>
+        </w:tc>
+        <w:tc>
+          <w:tcPr>
+            <w:tcW w:type="dxa" w:w="2340"/>
+          </w:tcPr>
+          <w:p>
+            <w:r>
+              <w:rPr>
+                <w:rFonts w:ascii="Times New Roman" w:hAnsi="Times New Roman"/>
+                <w:sz w:val="19"/>
+              </w:rPr>
+              <w:t>VARCHAR</w:t>
+            </w:r>
+          </w:p>
+        </w:tc>
+        <w:tc>
+          <w:tcPr>
+            <w:tcW w:type="dxa" w:w="2340"/>
+          </w:tcPr>
+          <w:p>
+            <w:r>
+              <w:rPr>
+                <w:rFonts w:ascii="Times New Roman" w:hAnsi="Times New Roman"/>
+                <w:sz w:val="19"/>
+              </w:rPr>
+              <w:t>Required</w:t>
+            </w:r>
+          </w:p>
+        </w:tc>
+        <w:tc>
+          <w:tcPr>
+            <w:tcW w:type="dxa" w:w="2340"/>
+          </w:tcPr>
+          <w:p>
+            <w:r>
+              <w:rPr>
+                <w:rFonts w:ascii="Times New Roman" w:hAnsi="Times New Roman"/>
+                <w:sz w:val="19"/>
+              </w:rPr>
+              <w:t>Contact email of complainant.</w:t>
+            </w:r>
+          </w:p>
+        </w:tc>
+      </w:tr>
+      <w:tr>
+        <w:tc>
+          <w:tcPr>
+            <w:tcW w:type="dxa" w:w="2340"/>
+          </w:tcPr>
+          <w:p>
+            <w:r>
+              <w:rPr>
+                <w:rFonts w:ascii="Times New Roman" w:hAnsi="Times New Roman"/>
+                <w:sz w:val="19"/>
+              </w:rPr>
+              <w:t>subject</w:t>
+            </w:r>
+          </w:p>
+        </w:tc>
+        <w:tc>
+          <w:tcPr>
+            <w:tcW w:type="dxa" w:w="2340"/>
+          </w:tcPr>
+          <w:p>
+            <w:r>
+              <w:rPr>
+                <w:rFonts w:ascii="Times New Roman" w:hAnsi="Times New Roman"/>
+                <w:sz w:val="19"/>
+              </w:rPr>
+              <w:t>VARCHAR</w:t>
+            </w:r>
+          </w:p>
+        </w:tc>
+        <w:tc>
+          <w:tcPr>
+            <w:tcW w:type="dxa" w:w="2340"/>
+          </w:tcPr>
+          <w:p>
+            <w:r>
+              <w:rPr>
+                <w:rFonts w:ascii="Times New Roman" w:hAnsi="Times New Roman"/>
+                <w:sz w:val="19"/>
+              </w:rPr>
+              <w:t>Required</w:t>
+            </w:r>
+          </w:p>
+        </w:tc>
+        <w:tc>
+          <w:tcPr>
+            <w:tcW w:type="dxa" w:w="2340"/>
+          </w:tcPr>
+          <w:p>
+            <w:r>
+              <w:rPr>
+                <w:rFonts w:ascii="Times New Roman" w:hAnsi="Times New Roman"/>
+                <w:sz w:val="19"/>
+              </w:rPr>
+              <w:t>Grievance category classification.</w:t>
+            </w:r>
+          </w:p>
+        </w:tc>
+      </w:tr>
+      <w:tr>
+        <w:tc>
+          <w:tcPr>
+            <w:tcW w:type="dxa" w:w="2340"/>
+          </w:tcPr>
+          <w:p>
+            <w:r>
+              <w:rPr>
+                <w:rFonts w:ascii="Times New Roman" w:hAnsi="Times New Roman"/>
+                <w:sz w:val="19"/>
+              </w:rPr>
+              <w:t>message</w:t>
+            </w:r>
+          </w:p>
+        </w:tc>
+        <w:tc>
+          <w:tcPr>
+            <w:tcW w:type="dxa" w:w="2340"/>
+          </w:tcPr>
+          <w:p>
+            <w:r>
+              <w:rPr>
+                <w:rFonts w:ascii="Times New Roman" w:hAnsi="Times New Roman"/>
+                <w:sz w:val="19"/>
+              </w:rPr>
+              <w:t>TEXT</w:t>
+            </w:r>
+          </w:p>
+        </w:tc>
+        <w:tc>
+          <w:tcPr>
+            <w:tcW w:type="dxa" w:w="2340"/>
+          </w:tcPr>
+          <w:p>
+            <w:r>
+              <w:rPr>
+                <w:rFonts w:ascii="Times New Roman" w:hAnsi="Times New Roman"/>
+                <w:sz w:val="19"/>
+              </w:rPr>
+              <w:t>Required</w:t>
+            </w:r>
+          </w:p>
+        </w:tc>
+        <w:tc>
+          <w:tcPr>
+            <w:tcW w:type="dxa" w:w="2340"/>
+          </w:tcPr>
+          <w:p>
+            <w:r>
+              <w:rPr>
+                <w:rFonts w:ascii="Times New Roman" w:hAnsi="Times New Roman"/>
+                <w:sz w:val="19"/>
+              </w:rPr>
+              <w:t>Structured complainant details text.</w:t>
+            </w:r>
+          </w:p>
+        </w:tc>
+      </w:tr>
+      <w:tr>
+        <w:tc>
+          <w:tcPr>
+            <w:tcW w:type="dxa" w:w="2340"/>
+          </w:tcPr>
+          <w:p>
+            <w:r>
+              <w:rPr>
+                <w:rFonts w:ascii="Times New Roman" w:hAnsi="Times New Roman"/>
+                <w:sz w:val="19"/>
+              </w:rPr>
+              <w:t>severity_level</w:t>
+            </w:r>
+          </w:p>
+        </w:tc>
+        <w:tc>
+          <w:tcPr>
+            <w:tcW w:type="dxa" w:w="2340"/>
+          </w:tcPr>
+          <w:p>
+            <w:r>
+              <w:rPr>
+                <w:rFonts w:ascii="Times New Roman" w:hAnsi="Times New Roman"/>
+                <w:sz w:val="19"/>
+              </w:rPr>
+              <w:t>VARCHAR</w:t>
+            </w:r>
+          </w:p>
+        </w:tc>
+        <w:tc>
+          <w:tcPr>
+            <w:tcW w:type="dxa" w:w="2340"/>
+          </w:tcPr>
+          <w:p>
+            <w:r>
+              <w:rPr>
+                <w:rFonts w:ascii="Times New Roman" w:hAnsi="Times New Roman"/>
+                <w:sz w:val="19"/>
+              </w:rPr>
+              <w:t>Low / Medium / High / Critical</w:t>
+            </w:r>
+          </w:p>
+        </w:tc>
+        <w:tc>
+          <w:tcPr>
+            <w:tcW w:type="dxa" w:w="2340"/>
+          </w:tcPr>
+          <w:p>
+            <w:r>
+              <w:rPr>
+                <w:rFonts w:ascii="Times New Roman" w:hAnsi="Times New Roman"/>
+                <w:sz w:val="19"/>
+              </w:rPr>
+              <w:t>Grievance urgency indicator.</w:t>
+            </w:r>
+          </w:p>
+        </w:tc>
+      </w:tr>
+      <w:tr>
+        <w:tc>
+          <w:tcPr>
+            <w:tcW w:type="dxa" w:w="2340"/>
+          </w:tcPr>
+          <w:p>
+            <w:r>
+              <w:rPr>
+                <w:rFonts w:ascii="Times New Roman" w:hAnsi="Times New Roman"/>
+                <w:sz w:val="19"/>
+              </w:rPr>
+              <w:t>sla_status</w:t>
+            </w:r>
+          </w:p>
+        </w:tc>
+        <w:tc>
+          <w:tcPr>
+            <w:tcW w:type="dxa" w:w="2340"/>
+          </w:tcPr>
+          <w:p>
+            <w:r>
+              <w:rPr>
+                <w:rFonts w:ascii="Times New Roman" w:hAnsi="Times New Roman"/>
+                <w:sz w:val="19"/>
+              </w:rPr>
+              <w:t>VARCHAR</w:t>
+            </w:r>
+          </w:p>
+        </w:tc>
+        <w:tc>
+          <w:tcPr>
+            <w:tcW w:type="dxa" w:w="2340"/>
+          </w:tcPr>
+          <w:p>
+            <w:r>
+              <w:rPr>
+                <w:rFonts w:ascii="Times New Roman" w:hAnsi="Times New Roman"/>
+                <w:sz w:val="19"/>
+              </w:rPr>
+              <w:t>Pending / Under Investigation / Resolved / SLA Breached</w:t>
+            </w:r>
+          </w:p>
+        </w:tc>
+        <w:tc>
+          <w:tcPr>
+            <w:tcW w:type="dxa" w:w="2340"/>
+          </w:tcPr>
+          <w:p>
+            <w:r>
+              <w:rPr>
+                <w:rFonts w:ascii="Times New Roman" w:hAnsi="Times New Roman"/>
+                <w:sz w:val="19"/>
+              </w:rPr>
+              <w:t>SLA tracker status.</w:t>
+            </w:r>
+          </w:p>
+        </w:tc>
+      </w:tr>
+      <w:tr>
+        <w:tc>
+          <w:tcPr>
+            <w:tcW w:type="dxa" w:w="2340"/>
+          </w:tcPr>
+          <w:p>
+            <w:r>
+              <w:rPr>
+                <w:rFonts w:ascii="Times New Roman" w:hAnsi="Times New Roman"/>
+                <w:sz w:val="19"/>
+              </w:rPr>
+              <w:t>sla_deadline</w:t>
+            </w:r>
+          </w:p>
+        </w:tc>
+        <w:tc>
+          <w:tcPr>
+            <w:tcW w:type="dxa" w:w="2340"/>
+          </w:tcPr>
+          <w:p>
+            <w:r>
+              <w:rPr>
+                <w:rFonts w:ascii="Times New Roman" w:hAnsi="Times New Roman"/>
+                <w:sz w:val="19"/>
+              </w:rPr>
+              <w:t>TIMESTAMP</w:t>
+            </w:r>
+          </w:p>
+        </w:tc>
+        <w:tc>
+          <w:tcPr>
+            <w:tcW w:type="dxa" w:w="2340"/>
+          </w:tcPr>
+          <w:p>
+            <w:r>
+              <w:rPr>
+                <w:rFonts w:ascii="Times New Roman" w:hAnsi="Times New Roman"/>
+                <w:sz w:val="19"/>
+              </w:rPr>
+              <w:t>Required</w:t>
+            </w:r>
+          </w:p>
+        </w:tc>
+        <w:tc>
+          <w:tcPr>
+            <w:tcW w:type="dxa" w:w="2340"/>
+          </w:tcPr>
+          <w:p>
+            <w:r>
+              <w:rPr>
+                <w:rFonts w:ascii="Times New Roman" w:hAnsi="Times New Roman"/>
+                <w:sz w:val="19"/>
+              </w:rPr>
+              <w:t>Submission date + 72-hour deadline.</w:t>
+            </w:r>
+          </w:p>
+        </w:tc>
+      </w:tr>
+      <w:tr>
+        <w:tc>
+          <w:tcPr>
+            <w:tcW w:type="dxa" w:w="2340"/>
+          </w:tcPr>
+          <w:p>
+            <w:r>
+              <w:rPr>
+                <w:rFonts w:ascii="Times New Roman" w:hAnsi="Times New Roman"/>
+                <w:sz w:val="19"/>
+              </w:rPr>
+              <w:t>escalated_to_chairman</w:t>
+            </w:r>
+          </w:p>
+        </w:tc>
+        <w:tc>
+          <w:tcPr>
+            <w:tcW w:type="dxa" w:w="2340"/>
+          </w:tcPr>
+          <w:p>
+            <w:r>
+              <w:rPr>
+                <w:rFonts w:ascii="Times New Roman" w:hAnsi="Times New Roman"/>
+                <w:sz w:val="19"/>
+              </w:rPr>
+              <w:t>BOOLEAN</w:t>
+            </w:r>
+          </w:p>
+        </w:tc>
+        <w:tc>
+          <w:tcPr>
+            <w:tcW w:type="dxa" w:w="2340"/>
+          </w:tcPr>
+          <w:p>
+            <w:r>
+              <w:rPr>
+                <w:rFonts w:ascii="Times New Roman" w:hAnsi="Times New Roman"/>
+                <w:sz w:val="19"/>
+              </w:rPr>
+              <w:t>Default: False</w:t>
+            </w:r>
+          </w:p>
+        </w:tc>
+        <w:tc>
+          <w:tcPr>
+            <w:tcW w:type="dxa" w:w="2340"/>
+          </w:tcPr>
+          <w:p>
+            <w:r>
+              <w:rPr>
+                <w:rFonts w:ascii="Times New Roman" w:hAnsi="Times New Roman"/>
+                <w:sz w:val="19"/>
+              </w:rPr>
+              <w:t>Escalation indicator flag.</w:t>
+            </w:r>
+          </w:p>
+        </w:tc>
+      </w:tr>
+    </w:tbl>
+    <w:p>
+      <w:pPr>
+        <w:spacing w:before="0" w:after="120"/>
+      </w:pPr>
+    </w:p>
+    <w:p>
+      <w:pPr>
+        <w:keepNext/>
         <w:spacing w:before="240" w:after="80"/>
       </w:pPr>
       <w:r>
@@ -1935,7 +3740,7 @@
           <w:color w:val="262626"/>
           <w:sz w:val="22"/>
         </w:rPr>
-        <w:t>Figure 5.1 illustrates the main grievance submission interface. The form provides direct input validation, automatic dropdown bindings for states, bilingual translations switcher, and visual CAPTCHA rendering for public verification security compliance.</w:t>
+        <w:t>Figure 5.2 illustrates the main grievance submission interface. The form provides direct input validation, automatic dropdown bindings for states, bilingual translations switcher, and visual CAPTCHA rendering for public verification security compliance.</w:t>
       </w:r>
     </w:p>
     <w:p>
@@ -1991,7 +3796,7 @@
           <w:color w:val="646464"/>
           <w:sz w:val="19"/>
         </w:rPr>
-        <w:t>Figure 5.1: Grievance Registration Interface featuring CAPTCHA and Bilingual Switches</w:t>
+        <w:t>Figure 5.2: Grievance Registration Interface featuring CAPTCHA and Bilingual Switches</w:t>
       </w:r>
     </w:p>
     <w:p>
@@ -2019,7 +3824,7 @@
           <w:color w:val="262626"/>
           <w:sz w:val="22"/>
         </w:rPr>
-        <w:t>Upon sending a validated grievance request, the interface intercepts the callback response and triggers a native success Modal prompt presenting the unique registration reference string (e.g. NMPA-GRV-XXXX) for subsequent search queries as seen in Figure 5.2.</w:t>
+        <w:t>Upon sending a validated grievance request, the interface intercepts the callback response and triggers a native success Modal prompt presenting the unique registration reference string (e.g. NMPA-GRV-XXXX) for subsequent search queries as seen in Figure 5.3.</w:t>
       </w:r>
     </w:p>
     <w:p>
@@ -2075,7 +3880,7 @@
           <w:color w:val="646464"/>
           <w:sz w:val="19"/>
         </w:rPr>
-        <w:t>Figure 5.2: Ant Design Grievance Submission Success Notification Modal</w:t>
+        <w:t>Figure 5.3: Ant Design Grievance Submission Success Notification Modal</w:t>
       </w:r>
     </w:p>
     <w:p>
@@ -2103,7 +3908,7 @@
           <w:color w:val="262626"/>
           <w:sz w:val="22"/>
         </w:rPr>
-        <w:t>Figure 5.3 shows the Platform Administrator's operator console. Complainant details are parsed and organized into standardized compact boxes (Role, Name, Contact, State, Pin) to optimize table space, and real-time SLA countdown countdowns alert personnel of pending timers.</w:t>
+        <w:t>Figure 5.4 shows the Platform Administrator's operator console. Complainant details are parsed and organized into standardized compact boxes (Role, Name, Contact, State, Pin) to optimize table space, and real-time SLA countdown countdowns alert personnel of pending timers.</w:t>
       </w:r>
     </w:p>
     <w:p>
@@ -2159,7 +3964,7 @@
           <w:color w:val="646464"/>
           <w:sz w:val="19"/>
         </w:rPr>
-        <w:t>Figure 5.3: Operator Dashboard - Standard Grievance Queue with Compact Tags &amp; SLA countdowns</w:t>
+        <w:t>Figure 5.4: Operator Dashboard - Standard Grievance Queue with Compact Tags &amp; SLA countdowns</w:t>
       </w:r>
     </w:p>
     <w:p>
@@ -2187,7 +3992,7 @@
           <w:color w:val="262626"/>
           <w:sz w:val="22"/>
         </w:rPr>
-        <w:t>Figure 5.4 displays the secure direct escalation portal accessible strictly by authorized board office terminals. Any grievance flagged for direct escalation, or falling into an SLA breach condition, is routed directly here for immediate administrative action.</w:t>
+        <w:t>Figure 5.5 displays the secure direct escalation portal accessible strictly by authorized board office terminals. Any grievance flagged for direct escalation, or falling into an SLA breach condition, is routed directly here for immediate administrative action.</w:t>
       </w:r>
     </w:p>
     <w:p>
@@ -2243,7 +4048,7 @@
           <w:color w:val="646464"/>
           <w:sz w:val="19"/>
         </w:rPr>
-        <w:t>Figure 5.4: Board Office Dashboard - Secure Chairman's Inbox with SLA Breach Routing</w:t>
+        <w:t>Figure 5.5: Board Office Dashboard - Secure Chairman's Inbox with SLA Breach Routing</w:t>
       </w:r>
     </w:p>
     <w:p>
@@ -2398,6 +4203,78 @@
     </w:p>
     <w:p>
       <w:pPr>
+        <w:spacing w:after="120" w:line="276" w:lineRule="auto"/>
+      </w:pPr>
+      <w:r>
+        <w:rPr>
+          <w:rFonts w:ascii="Times New Roman" w:hAnsi="Times New Roman"/>
+          <w:color w:val="262626"/>
+          <w:sz w:val="22"/>
+        </w:rPr>
+        <w:t>The NMPA Cargo Inspection and Vessel Clearance System represents a major technical advancement for the New Mangalore Port Authority. The system digitalizes the physical checkpoints and multi-desk approvals that manage dry and liquid bulk voyages. Utilizing a role-based access workflow, shipping agents can submit manifests while specific desks (Customs, Port Health, and Traffic Control) record verifications sequentially.</w:t>
+        <w:br/>
+        <w:br/>
+        <w:t>By implementing a Single-Window maritime clearance tool, the system eliminates traditional signature routines that cause delays in container processing. The design leverages visual dashboards, interactive port maps, and centralized redirects to official government portals (such as india.gov.in) to establish a secure, compliant web application.</w:t>
+      </w:r>
+    </w:p>
+    <w:p>
+      <w:pPr>
+        <w:keepNext/>
+        <w:spacing w:before="200" w:after="80"/>
+        <w:jc w:val="center"/>
+      </w:pPr>
+      <w:r>
+        <w:drawing>
+          <wp:inline xmlns:a="http://schemas.openxmlformats.org/drawingml/2006/main" xmlns:pic="http://schemas.openxmlformats.org/drawingml/2006/picture">
+            <wp:extent cx="5303520" cy="1192264"/>
+            <wp:docPr id="5" name="Picture 5"/>
+            <wp:cNvGraphicFramePr>
+              <a:graphicFrameLocks noChangeAspect="1"/>
+            </wp:cNvGraphicFramePr>
+            <a:graphic>
+              <a:graphicData uri="http://schemas.openxmlformats.org/drawingml/2006/picture">
+                <pic:pic>
+                  <pic:nvPicPr>
+                    <pic:cNvPr id="0" name="media__1784539036090.png"/>
+                    <pic:cNvPicPr/>
+                  </pic:nvPicPr>
+                  <pic:blipFill>
+                    <a:blip r:embed="rId13"/>
+                    <a:stretch>
+                      <a:fillRect/>
+                    </a:stretch>
+                  </pic:blipFill>
+                  <pic:spPr>
+                    <a:xfrm>
+                      <a:off x="0" y="0"/>
+                      <a:ext cx="5303520" cy="1192264"/>
+                    </a:xfrm>
+                    <a:prstGeom prst="rect"/>
+                  </pic:spPr>
+                </pic:pic>
+              </a:graphicData>
+            </a:graphic>
+          </wp:inline>
+        </w:drawing>
+      </w:r>
+    </w:p>
+    <w:p>
+      <w:pPr>
+        <w:spacing w:after="240"/>
+        <w:jc w:val="center"/>
+      </w:pPr>
+      <w:r>
+        <w:rPr>
+          <w:rFonts w:ascii="Times New Roman" w:hAnsi="Times New Roman"/>
+          <w:i/>
+          <w:color w:val="646464"/>
+          <w:sz w:val="19"/>
+        </w:rPr>
+        <w:t>Figure 1.1: Single-Window Clearance Portal Login &amp; Welcome Interface</w:t>
+      </w:r>
+    </w:p>
+    <w:p>
+      <w:pPr>
         <w:keepNext/>
         <w:spacing w:before="160" w:after="40"/>
       </w:pPr>
@@ -2623,6 +4500,29 @@
           <w:sz w:val="26"/>
         </w:rPr>
         <w:t>1.3 Objectives of the System</w:t>
+      </w:r>
+    </w:p>
+    <w:p>
+      <w:pPr>
+        <w:spacing w:after="120" w:line="276" w:lineRule="auto"/>
+      </w:pPr>
+      <w:r>
+        <w:rPr>
+          <w:rFonts w:ascii="Times New Roman" w:hAnsi="Times New Roman"/>
+          <w:color w:val="262626"/>
+          <w:sz w:val="22"/>
+        </w:rPr>
+        <w:t>The primary technical objectives of the NMPA-CIS system include:</w:t>
+        <w:br/>
+        <w:t>- Orchestrating multi-department clear-pass approvals using secure digital controls.</w:t>
+        <w:br/>
+        <w:t>- Running deterministic AI risk evaluation scoring models to flag high-risk containers.</w:t>
+        <w:br/>
+        <w:t>- Setting automated 72-hour Service Level Agreement (SLA) timers with direct escalation pathways to the Chairman's Office Office.</w:t>
+        <w:br/>
+        <w:t>- Standardizing public grievance portals with CAPTCHA security codes and bilingual (English/Hindi) localizations.</w:t>
+        <w:br/>
+        <w:t>- Logging all critical system modifications to an immutable audit trail database.</w:t>
       </w:r>
     </w:p>
     <w:p>
@@ -3904,6 +5804,1811 @@
         </w:rPr>
         <w:t>4.3 Collection Definitions</w:t>
       </w:r>
+    </w:p>
+    <w:p>
+      <w:pPr>
+        <w:keepNext/>
+        <w:spacing w:before="160" w:after="40"/>
+      </w:pPr>
+      <w:r>
+        <w:rPr>
+          <w:rFonts w:ascii="Arial" w:hAnsi="Arial"/>
+          <w:b/>
+          <w:color w:val="646E7D"/>
+          <w:sz w:val="22"/>
+        </w:rPr>
+        <w:t>4.3.1 Users Collection Schema</w:t>
+      </w:r>
+    </w:p>
+    <w:tbl>
+      <w:tblPr>
+        <w:tblStyle w:val="TableGrid"/>
+        <w:tblW w:type="auto" w:w="0"/>
+        <w:tblLook w:firstColumn="1" w:firstRow="1" w:lastColumn="0" w:lastRow="0" w:noHBand="0" w:noVBand="1" w:val="04A0"/>
+      </w:tblPr>
+      <w:tblGrid>
+        <w:gridCol w:w="2340"/>
+        <w:gridCol w:w="2340"/>
+        <w:gridCol w:w="2340"/>
+        <w:gridCol w:w="2340"/>
+      </w:tblGrid>
+      <w:tr>
+        <w:tc>
+          <w:tcPr>
+            <w:tcW w:type="dxa" w:w="2340"/>
+          </w:tcPr>
+          <w:p>
+            <w:r>
+              <w:rPr>
+                <w:rFonts w:ascii="Arial" w:hAnsi="Arial"/>
+                <w:b/>
+                <w:color w:val="0D2B5E"/>
+                <w:sz w:val="19"/>
+              </w:rPr>
+              <w:t>Field Name</w:t>
+            </w:r>
+          </w:p>
+        </w:tc>
+        <w:tc>
+          <w:tcPr>
+            <w:tcW w:type="dxa" w:w="2340"/>
+          </w:tcPr>
+          <w:p>
+            <w:r>
+              <w:rPr>
+                <w:rFonts w:ascii="Arial" w:hAnsi="Arial"/>
+                <w:b/>
+                <w:color w:val="0D2B5E"/>
+                <w:sz w:val="19"/>
+              </w:rPr>
+              <w:t>Data Type</w:t>
+            </w:r>
+          </w:p>
+        </w:tc>
+        <w:tc>
+          <w:tcPr>
+            <w:tcW w:type="dxa" w:w="2340"/>
+          </w:tcPr>
+          <w:p>
+            <w:r>
+              <w:rPr>
+                <w:rFonts w:ascii="Arial" w:hAnsi="Arial"/>
+                <w:b/>
+                <w:color w:val="0D2B5E"/>
+                <w:sz w:val="19"/>
+              </w:rPr>
+              <w:t>Constraints</w:t>
+            </w:r>
+          </w:p>
+        </w:tc>
+        <w:tc>
+          <w:tcPr>
+            <w:tcW w:type="dxa" w:w="2340"/>
+          </w:tcPr>
+          <w:p>
+            <w:r>
+              <w:rPr>
+                <w:rFonts w:ascii="Arial" w:hAnsi="Arial"/>
+                <w:b/>
+                <w:color w:val="0D2B5E"/>
+                <w:sz w:val="19"/>
+              </w:rPr>
+              <w:t>Description</w:t>
+            </w:r>
+          </w:p>
+        </w:tc>
+      </w:tr>
+      <w:tr>
+        <w:tc>
+          <w:tcPr>
+            <w:tcW w:type="dxa" w:w="2340"/>
+          </w:tcPr>
+          <w:p>
+            <w:r>
+              <w:rPr>
+                <w:rFonts w:ascii="Times New Roman" w:hAnsi="Times New Roman"/>
+                <w:sz w:val="19"/>
+              </w:rPr>
+              <w:t>id</w:t>
+            </w:r>
+          </w:p>
+        </w:tc>
+        <w:tc>
+          <w:tcPr>
+            <w:tcW w:type="dxa" w:w="2340"/>
+          </w:tcPr>
+          <w:p>
+            <w:r>
+              <w:rPr>
+                <w:rFonts w:ascii="Times New Roman" w:hAnsi="Times New Roman"/>
+                <w:sz w:val="19"/>
+              </w:rPr>
+              <w:t>INTEGER</w:t>
+            </w:r>
+          </w:p>
+        </w:tc>
+        <w:tc>
+          <w:tcPr>
+            <w:tcW w:type="dxa" w:w="2340"/>
+          </w:tcPr>
+          <w:p>
+            <w:r>
+              <w:rPr>
+                <w:rFonts w:ascii="Times New Roman" w:hAnsi="Times New Roman"/>
+                <w:sz w:val="19"/>
+              </w:rPr>
+              <w:t>Primary Key</w:t>
+            </w:r>
+          </w:p>
+        </w:tc>
+        <w:tc>
+          <w:tcPr>
+            <w:tcW w:type="dxa" w:w="2340"/>
+          </w:tcPr>
+          <w:p>
+            <w:r>
+              <w:rPr>
+                <w:rFonts w:ascii="Times New Roman" w:hAnsi="Times New Roman"/>
+                <w:sz w:val="19"/>
+              </w:rPr>
+              <w:t>Unique user identification identifier.</w:t>
+            </w:r>
+          </w:p>
+        </w:tc>
+      </w:tr>
+      <w:tr>
+        <w:tc>
+          <w:tcPr>
+            <w:tcW w:type="dxa" w:w="2340"/>
+          </w:tcPr>
+          <w:p>
+            <w:r>
+              <w:rPr>
+                <w:rFonts w:ascii="Times New Roman" w:hAnsi="Times New Roman"/>
+                <w:sz w:val="19"/>
+              </w:rPr>
+              <w:t>username</w:t>
+            </w:r>
+          </w:p>
+        </w:tc>
+        <w:tc>
+          <w:tcPr>
+            <w:tcW w:type="dxa" w:w="2340"/>
+          </w:tcPr>
+          <w:p>
+            <w:r>
+              <w:rPr>
+                <w:rFonts w:ascii="Times New Roman" w:hAnsi="Times New Roman"/>
+                <w:sz w:val="19"/>
+              </w:rPr>
+              <w:t>VARCHAR</w:t>
+            </w:r>
+          </w:p>
+        </w:tc>
+        <w:tc>
+          <w:tcPr>
+            <w:tcW w:type="dxa" w:w="2340"/>
+          </w:tcPr>
+          <w:p>
+            <w:r>
+              <w:rPr>
+                <w:rFonts w:ascii="Times New Roman" w:hAnsi="Times New Roman"/>
+                <w:sz w:val="19"/>
+              </w:rPr>
+              <w:t>Unique, Min 4 chars</w:t>
+            </w:r>
+          </w:p>
+        </w:tc>
+        <w:tc>
+          <w:tcPr>
+            <w:tcW w:type="dxa" w:w="2340"/>
+          </w:tcPr>
+          <w:p>
+            <w:r>
+              <w:rPr>
+                <w:rFonts w:ascii="Times New Roman" w:hAnsi="Times New Roman"/>
+                <w:sz w:val="19"/>
+              </w:rPr>
+              <w:t>Login username credentials.</w:t>
+            </w:r>
+          </w:p>
+        </w:tc>
+      </w:tr>
+      <w:tr>
+        <w:tc>
+          <w:tcPr>
+            <w:tcW w:type="dxa" w:w="2340"/>
+          </w:tcPr>
+          <w:p>
+            <w:r>
+              <w:rPr>
+                <w:rFonts w:ascii="Times New Roman" w:hAnsi="Times New Roman"/>
+                <w:sz w:val="19"/>
+              </w:rPr>
+              <w:t>password</w:t>
+            </w:r>
+          </w:p>
+        </w:tc>
+        <w:tc>
+          <w:tcPr>
+            <w:tcW w:type="dxa" w:w="2340"/>
+          </w:tcPr>
+          <w:p>
+            <w:r>
+              <w:rPr>
+                <w:rFonts w:ascii="Times New Roman" w:hAnsi="Times New Roman"/>
+                <w:sz w:val="19"/>
+              </w:rPr>
+              <w:t>VARCHAR</w:t>
+            </w:r>
+          </w:p>
+        </w:tc>
+        <w:tc>
+          <w:tcPr>
+            <w:tcW w:type="dxa" w:w="2340"/>
+          </w:tcPr>
+          <w:p>
+            <w:r>
+              <w:rPr>
+                <w:rFonts w:ascii="Times New Roman" w:hAnsi="Times New Roman"/>
+                <w:sz w:val="19"/>
+              </w:rPr>
+              <w:t>Hashed</w:t>
+            </w:r>
+          </w:p>
+        </w:tc>
+        <w:tc>
+          <w:tcPr>
+            <w:tcW w:type="dxa" w:w="2340"/>
+          </w:tcPr>
+          <w:p>
+            <w:r>
+              <w:rPr>
+                <w:rFonts w:ascii="Times New Roman" w:hAnsi="Times New Roman"/>
+                <w:sz w:val="19"/>
+              </w:rPr>
+              <w:t>Secure hashed password string.</w:t>
+            </w:r>
+          </w:p>
+        </w:tc>
+      </w:tr>
+      <w:tr>
+        <w:tc>
+          <w:tcPr>
+            <w:tcW w:type="dxa" w:w="2340"/>
+          </w:tcPr>
+          <w:p>
+            <w:r>
+              <w:rPr>
+                <w:rFonts w:ascii="Times New Roman" w:hAnsi="Times New Roman"/>
+                <w:sz w:val="19"/>
+              </w:rPr>
+              <w:t>email</w:t>
+            </w:r>
+          </w:p>
+        </w:tc>
+        <w:tc>
+          <w:tcPr>
+            <w:tcW w:type="dxa" w:w="2340"/>
+          </w:tcPr>
+          <w:p>
+            <w:r>
+              <w:rPr>
+                <w:rFonts w:ascii="Times New Roman" w:hAnsi="Times New Roman"/>
+                <w:sz w:val="19"/>
+              </w:rPr>
+              <w:t>VARCHAR</w:t>
+            </w:r>
+          </w:p>
+        </w:tc>
+        <w:tc>
+          <w:tcPr>
+            <w:tcW w:type="dxa" w:w="2340"/>
+          </w:tcPr>
+          <w:p>
+            <w:r>
+              <w:rPr>
+                <w:rFonts w:ascii="Times New Roman" w:hAnsi="Times New Roman"/>
+                <w:sz w:val="19"/>
+              </w:rPr>
+              <w:t>Required</w:t>
+            </w:r>
+          </w:p>
+        </w:tc>
+        <w:tc>
+          <w:tcPr>
+            <w:tcW w:type="dxa" w:w="2340"/>
+          </w:tcPr>
+          <w:p>
+            <w:r>
+              <w:rPr>
+                <w:rFonts w:ascii="Times New Roman" w:hAnsi="Times New Roman"/>
+                <w:sz w:val="19"/>
+              </w:rPr>
+              <w:t>Contact email address.</w:t>
+            </w:r>
+          </w:p>
+        </w:tc>
+      </w:tr>
+      <w:tr>
+        <w:tc>
+          <w:tcPr>
+            <w:tcW w:type="dxa" w:w="2340"/>
+          </w:tcPr>
+          <w:p>
+            <w:r>
+              <w:rPr>
+                <w:rFonts w:ascii="Times New Roman" w:hAnsi="Times New Roman"/>
+                <w:sz w:val="19"/>
+              </w:rPr>
+              <w:t>role</w:t>
+            </w:r>
+          </w:p>
+        </w:tc>
+        <w:tc>
+          <w:tcPr>
+            <w:tcW w:type="dxa" w:w="2340"/>
+          </w:tcPr>
+          <w:p>
+            <w:r>
+              <w:rPr>
+                <w:rFonts w:ascii="Times New Roman" w:hAnsi="Times New Roman"/>
+                <w:sz w:val="19"/>
+              </w:rPr>
+              <w:t>VARCHAR</w:t>
+            </w:r>
+          </w:p>
+        </w:tc>
+        <w:tc>
+          <w:tcPr>
+            <w:tcW w:type="dxa" w:w="2340"/>
+          </w:tcPr>
+          <w:p>
+            <w:r>
+              <w:rPr>
+                <w:rFonts w:ascii="Times New Roman" w:hAnsi="Times New Roman"/>
+                <w:sz w:val="19"/>
+              </w:rPr>
+              <w:t>system_admin / inspector / port_authority</w:t>
+            </w:r>
+          </w:p>
+        </w:tc>
+        <w:tc>
+          <w:tcPr>
+            <w:tcW w:type="dxa" w:w="2340"/>
+          </w:tcPr>
+          <w:p>
+            <w:r>
+              <w:rPr>
+                <w:rFonts w:ascii="Times New Roman" w:hAnsi="Times New Roman"/>
+                <w:sz w:val="19"/>
+              </w:rPr>
+              <w:t>Role-based privileges.</w:t>
+            </w:r>
+          </w:p>
+        </w:tc>
+      </w:tr>
+      <w:tr>
+        <w:tc>
+          <w:tcPr>
+            <w:tcW w:type="dxa" w:w="2340"/>
+          </w:tcPr>
+          <w:p>
+            <w:r>
+              <w:rPr>
+                <w:rFonts w:ascii="Times New Roman" w:hAnsi="Times New Roman"/>
+                <w:sz w:val="19"/>
+              </w:rPr>
+              <w:t>is_approved</w:t>
+            </w:r>
+          </w:p>
+        </w:tc>
+        <w:tc>
+          <w:tcPr>
+            <w:tcW w:type="dxa" w:w="2340"/>
+          </w:tcPr>
+          <w:p>
+            <w:r>
+              <w:rPr>
+                <w:rFonts w:ascii="Times New Roman" w:hAnsi="Times New Roman"/>
+                <w:sz w:val="19"/>
+              </w:rPr>
+              <w:t>BOOLEAN</w:t>
+            </w:r>
+          </w:p>
+        </w:tc>
+        <w:tc>
+          <w:tcPr>
+            <w:tcW w:type="dxa" w:w="2340"/>
+          </w:tcPr>
+          <w:p>
+            <w:r>
+              <w:rPr>
+                <w:rFonts w:ascii="Times New Roman" w:hAnsi="Times New Roman"/>
+                <w:sz w:val="19"/>
+              </w:rPr>
+              <w:t>Default: False</w:t>
+            </w:r>
+          </w:p>
+        </w:tc>
+        <w:tc>
+          <w:tcPr>
+            <w:tcW w:type="dxa" w:w="2340"/>
+          </w:tcPr>
+          <w:p>
+            <w:r>
+              <w:rPr>
+                <w:rFonts w:ascii="Times New Roman" w:hAnsi="Times New Roman"/>
+                <w:sz w:val="19"/>
+              </w:rPr>
+              <w:t>Onboarding validation flag.</w:t>
+            </w:r>
+          </w:p>
+        </w:tc>
+      </w:tr>
+      <w:tr>
+        <w:tc>
+          <w:tcPr>
+            <w:tcW w:type="dxa" w:w="2340"/>
+          </w:tcPr>
+          <w:p>
+            <w:r>
+              <w:rPr>
+                <w:rFonts w:ascii="Times New Roman" w:hAnsi="Times New Roman"/>
+                <w:sz w:val="19"/>
+              </w:rPr>
+              <w:t>two_fa_enabled</w:t>
+            </w:r>
+          </w:p>
+        </w:tc>
+        <w:tc>
+          <w:tcPr>
+            <w:tcW w:type="dxa" w:w="2340"/>
+          </w:tcPr>
+          <w:p>
+            <w:r>
+              <w:rPr>
+                <w:rFonts w:ascii="Times New Roman" w:hAnsi="Times New Roman"/>
+                <w:sz w:val="19"/>
+              </w:rPr>
+              <w:t>BOOLEAN</w:t>
+            </w:r>
+          </w:p>
+        </w:tc>
+        <w:tc>
+          <w:tcPr>
+            <w:tcW w:type="dxa" w:w="2340"/>
+          </w:tcPr>
+          <w:p>
+            <w:r>
+              <w:rPr>
+                <w:rFonts w:ascii="Times New Roman" w:hAnsi="Times New Roman"/>
+                <w:sz w:val="19"/>
+              </w:rPr>
+              <w:t>Default: True</w:t>
+            </w:r>
+          </w:p>
+        </w:tc>
+        <w:tc>
+          <w:tcPr>
+            <w:tcW w:type="dxa" w:w="2340"/>
+          </w:tcPr>
+          <w:p>
+            <w:r>
+              <w:rPr>
+                <w:rFonts w:ascii="Times New Roman" w:hAnsi="Times New Roman"/>
+                <w:sz w:val="19"/>
+              </w:rPr>
+              <w:t>2FA authentication flag.</w:t>
+            </w:r>
+          </w:p>
+        </w:tc>
+      </w:tr>
+      <w:tr>
+        <w:tc>
+          <w:tcPr>
+            <w:tcW w:type="dxa" w:w="2340"/>
+          </w:tcPr>
+          <w:p>
+            <w:r>
+              <w:rPr>
+                <w:rFonts w:ascii="Times New Roman" w:hAnsi="Times New Roman"/>
+                <w:sz w:val="19"/>
+              </w:rPr>
+              <w:t>last_login</w:t>
+            </w:r>
+          </w:p>
+        </w:tc>
+        <w:tc>
+          <w:tcPr>
+            <w:tcW w:type="dxa" w:w="2340"/>
+          </w:tcPr>
+          <w:p>
+            <w:r>
+              <w:rPr>
+                <w:rFonts w:ascii="Times New Roman" w:hAnsi="Times New Roman"/>
+                <w:sz w:val="19"/>
+              </w:rPr>
+              <w:t>TIMESTAMP</w:t>
+            </w:r>
+          </w:p>
+        </w:tc>
+        <w:tc>
+          <w:tcPr>
+            <w:tcW w:type="dxa" w:w="2340"/>
+          </w:tcPr>
+          <w:p>
+            <w:r>
+              <w:rPr>
+                <w:rFonts w:ascii="Times New Roman" w:hAnsi="Times New Roman"/>
+                <w:sz w:val="19"/>
+              </w:rPr>
+              <w:t>Nullable</w:t>
+            </w:r>
+          </w:p>
+        </w:tc>
+        <w:tc>
+          <w:tcPr>
+            <w:tcW w:type="dxa" w:w="2340"/>
+          </w:tcPr>
+          <w:p>
+            <w:r>
+              <w:rPr>
+                <w:rFonts w:ascii="Times New Roman" w:hAnsi="Times New Roman"/>
+                <w:sz w:val="19"/>
+              </w:rPr>
+              <w:t>Tracks the user's latest login.</w:t>
+            </w:r>
+          </w:p>
+        </w:tc>
+      </w:tr>
+    </w:tbl>
+    <w:p>
+      <w:pPr>
+        <w:spacing w:before="0" w:after="120"/>
+      </w:pPr>
+    </w:p>
+    <w:p>
+      <w:pPr>
+        <w:keepNext/>
+        <w:spacing w:before="160" w:after="40"/>
+      </w:pPr>
+      <w:r>
+        <w:rPr>
+          <w:rFonts w:ascii="Arial" w:hAnsi="Arial"/>
+          <w:b/>
+          <w:color w:val="646E7D"/>
+          <w:sz w:val="22"/>
+        </w:rPr>
+        <w:t>4.3.2 Voyages Collection Schema</w:t>
+      </w:r>
+    </w:p>
+    <w:tbl>
+      <w:tblPr>
+        <w:tblStyle w:val="TableGrid"/>
+        <w:tblW w:type="auto" w:w="0"/>
+        <w:tblLook w:firstColumn="1" w:firstRow="1" w:lastColumn="0" w:lastRow="0" w:noHBand="0" w:noVBand="1" w:val="04A0"/>
+      </w:tblPr>
+      <w:tblGrid>
+        <w:gridCol w:w="2340"/>
+        <w:gridCol w:w="2340"/>
+        <w:gridCol w:w="2340"/>
+        <w:gridCol w:w="2340"/>
+      </w:tblGrid>
+      <w:tr>
+        <w:tc>
+          <w:tcPr>
+            <w:tcW w:type="dxa" w:w="2340"/>
+          </w:tcPr>
+          <w:p>
+            <w:r>
+              <w:rPr>
+                <w:rFonts w:ascii="Arial" w:hAnsi="Arial"/>
+                <w:b/>
+                <w:color w:val="0D2B5E"/>
+                <w:sz w:val="19"/>
+              </w:rPr>
+              <w:t>Field Name</w:t>
+            </w:r>
+          </w:p>
+        </w:tc>
+        <w:tc>
+          <w:tcPr>
+            <w:tcW w:type="dxa" w:w="2340"/>
+          </w:tcPr>
+          <w:p>
+            <w:r>
+              <w:rPr>
+                <w:rFonts w:ascii="Arial" w:hAnsi="Arial"/>
+                <w:b/>
+                <w:color w:val="0D2B5E"/>
+                <w:sz w:val="19"/>
+              </w:rPr>
+              <w:t>Data Type</w:t>
+            </w:r>
+          </w:p>
+        </w:tc>
+        <w:tc>
+          <w:tcPr>
+            <w:tcW w:type="dxa" w:w="2340"/>
+          </w:tcPr>
+          <w:p>
+            <w:r>
+              <w:rPr>
+                <w:rFonts w:ascii="Arial" w:hAnsi="Arial"/>
+                <w:b/>
+                <w:color w:val="0D2B5E"/>
+                <w:sz w:val="19"/>
+              </w:rPr>
+              <w:t>Constraints</w:t>
+            </w:r>
+          </w:p>
+        </w:tc>
+        <w:tc>
+          <w:tcPr>
+            <w:tcW w:type="dxa" w:w="2340"/>
+          </w:tcPr>
+          <w:p>
+            <w:r>
+              <w:rPr>
+                <w:rFonts w:ascii="Arial" w:hAnsi="Arial"/>
+                <w:b/>
+                <w:color w:val="0D2B5E"/>
+                <w:sz w:val="19"/>
+              </w:rPr>
+              <w:t>Description</w:t>
+            </w:r>
+          </w:p>
+        </w:tc>
+      </w:tr>
+      <w:tr>
+        <w:tc>
+          <w:tcPr>
+            <w:tcW w:type="dxa" w:w="2340"/>
+          </w:tcPr>
+          <w:p>
+            <w:r>
+              <w:rPr>
+                <w:rFonts w:ascii="Times New Roman" w:hAnsi="Times New Roman"/>
+                <w:sz w:val="19"/>
+              </w:rPr>
+              <w:t>id</w:t>
+            </w:r>
+          </w:p>
+        </w:tc>
+        <w:tc>
+          <w:tcPr>
+            <w:tcW w:type="dxa" w:w="2340"/>
+          </w:tcPr>
+          <w:p>
+            <w:r>
+              <w:rPr>
+                <w:rFonts w:ascii="Times New Roman" w:hAnsi="Times New Roman"/>
+                <w:sz w:val="19"/>
+              </w:rPr>
+              <w:t>INTEGER</w:t>
+            </w:r>
+          </w:p>
+        </w:tc>
+        <w:tc>
+          <w:tcPr>
+            <w:tcW w:type="dxa" w:w="2340"/>
+          </w:tcPr>
+          <w:p>
+            <w:r>
+              <w:rPr>
+                <w:rFonts w:ascii="Times New Roman" w:hAnsi="Times New Roman"/>
+                <w:sz w:val="19"/>
+              </w:rPr>
+              <w:t>Primary Key</w:t>
+            </w:r>
+          </w:p>
+        </w:tc>
+        <w:tc>
+          <w:tcPr>
+            <w:tcW w:type="dxa" w:w="2340"/>
+          </w:tcPr>
+          <w:p>
+            <w:r>
+              <w:rPr>
+                <w:rFonts w:ascii="Times New Roman" w:hAnsi="Times New Roman"/>
+                <w:sz w:val="19"/>
+              </w:rPr>
+              <w:t>Voyage unique record identification.</w:t>
+            </w:r>
+          </w:p>
+        </w:tc>
+      </w:tr>
+      <w:tr>
+        <w:tc>
+          <w:tcPr>
+            <w:tcW w:type="dxa" w:w="2340"/>
+          </w:tcPr>
+          <w:p>
+            <w:r>
+              <w:rPr>
+                <w:rFonts w:ascii="Times New Roman" w:hAnsi="Times New Roman"/>
+                <w:sz w:val="19"/>
+              </w:rPr>
+              <w:t>bill_of_lading</w:t>
+            </w:r>
+          </w:p>
+        </w:tc>
+        <w:tc>
+          <w:tcPr>
+            <w:tcW w:type="dxa" w:w="2340"/>
+          </w:tcPr>
+          <w:p>
+            <w:r>
+              <w:rPr>
+                <w:rFonts w:ascii="Times New Roman" w:hAnsi="Times New Roman"/>
+                <w:sz w:val="19"/>
+              </w:rPr>
+              <w:t>VARCHAR</w:t>
+            </w:r>
+          </w:p>
+        </w:tc>
+        <w:tc>
+          <w:tcPr>
+            <w:tcW w:type="dxa" w:w="2340"/>
+          </w:tcPr>
+          <w:p>
+            <w:r>
+              <w:rPr>
+                <w:rFonts w:ascii="Times New Roman" w:hAnsi="Times New Roman"/>
+                <w:sz w:val="19"/>
+              </w:rPr>
+              <w:t>Unique, Required</w:t>
+            </w:r>
+          </w:p>
+        </w:tc>
+        <w:tc>
+          <w:tcPr>
+            <w:tcW w:type="dxa" w:w="2340"/>
+          </w:tcPr>
+          <w:p>
+            <w:r>
+              <w:rPr>
+                <w:rFonts w:ascii="Times New Roman" w:hAnsi="Times New Roman"/>
+                <w:sz w:val="19"/>
+              </w:rPr>
+              <w:t>Cargo shipment identifier.</w:t>
+            </w:r>
+          </w:p>
+        </w:tc>
+      </w:tr>
+      <w:tr>
+        <w:tc>
+          <w:tcPr>
+            <w:tcW w:type="dxa" w:w="2340"/>
+          </w:tcPr>
+          <w:p>
+            <w:r>
+              <w:rPr>
+                <w:rFonts w:ascii="Times New Roman" w:hAnsi="Times New Roman"/>
+                <w:sz w:val="19"/>
+              </w:rPr>
+              <w:t>vessel_name</w:t>
+            </w:r>
+          </w:p>
+        </w:tc>
+        <w:tc>
+          <w:tcPr>
+            <w:tcW w:type="dxa" w:w="2340"/>
+          </w:tcPr>
+          <w:p>
+            <w:r>
+              <w:rPr>
+                <w:rFonts w:ascii="Times New Roman" w:hAnsi="Times New Roman"/>
+                <w:sz w:val="19"/>
+              </w:rPr>
+              <w:t>VARCHAR</w:t>
+            </w:r>
+          </w:p>
+        </w:tc>
+        <w:tc>
+          <w:tcPr>
+            <w:tcW w:type="dxa" w:w="2340"/>
+          </w:tcPr>
+          <w:p>
+            <w:r>
+              <w:rPr>
+                <w:rFonts w:ascii="Times New Roman" w:hAnsi="Times New Roman"/>
+                <w:sz w:val="19"/>
+              </w:rPr>
+              <w:t>Required</w:t>
+            </w:r>
+          </w:p>
+        </w:tc>
+        <w:tc>
+          <w:tcPr>
+            <w:tcW w:type="dxa" w:w="2340"/>
+          </w:tcPr>
+          <w:p>
+            <w:r>
+              <w:rPr>
+                <w:rFonts w:ascii="Times New Roman" w:hAnsi="Times New Roman"/>
+                <w:sz w:val="19"/>
+              </w:rPr>
+              <w:t>Name of the incoming vessel.</w:t>
+            </w:r>
+          </w:p>
+        </w:tc>
+      </w:tr>
+      <w:tr>
+        <w:tc>
+          <w:tcPr>
+            <w:tcW w:type="dxa" w:w="2340"/>
+          </w:tcPr>
+          <w:p>
+            <w:r>
+              <w:rPr>
+                <w:rFonts w:ascii="Times New Roman" w:hAnsi="Times New Roman"/>
+                <w:sz w:val="19"/>
+              </w:rPr>
+              <w:t>origin_port</w:t>
+            </w:r>
+          </w:p>
+        </w:tc>
+        <w:tc>
+          <w:tcPr>
+            <w:tcW w:type="dxa" w:w="2340"/>
+          </w:tcPr>
+          <w:p>
+            <w:r>
+              <w:rPr>
+                <w:rFonts w:ascii="Times New Roman" w:hAnsi="Times New Roman"/>
+                <w:sz w:val="19"/>
+              </w:rPr>
+              <w:t>VARCHAR</w:t>
+            </w:r>
+          </w:p>
+        </w:tc>
+        <w:tc>
+          <w:tcPr>
+            <w:tcW w:type="dxa" w:w="2340"/>
+          </w:tcPr>
+          <w:p>
+            <w:r>
+              <w:rPr>
+                <w:rFonts w:ascii="Times New Roman" w:hAnsi="Times New Roman"/>
+                <w:sz w:val="19"/>
+              </w:rPr>
+              <w:t>Required</w:t>
+            </w:r>
+          </w:p>
+        </w:tc>
+        <w:tc>
+          <w:tcPr>
+            <w:tcW w:type="dxa" w:w="2340"/>
+          </w:tcPr>
+          <w:p>
+            <w:r>
+              <w:rPr>
+                <w:rFonts w:ascii="Times New Roman" w:hAnsi="Times New Roman"/>
+                <w:sz w:val="19"/>
+              </w:rPr>
+              <w:t>Port of cargo dispatch.</w:t>
+            </w:r>
+          </w:p>
+        </w:tc>
+      </w:tr>
+      <w:tr>
+        <w:tc>
+          <w:tcPr>
+            <w:tcW w:type="dxa" w:w="2340"/>
+          </w:tcPr>
+          <w:p>
+            <w:r>
+              <w:rPr>
+                <w:rFonts w:ascii="Times New Roman" w:hAnsi="Times New Roman"/>
+                <w:sz w:val="19"/>
+              </w:rPr>
+              <w:t>cargo_type</w:t>
+            </w:r>
+          </w:p>
+        </w:tc>
+        <w:tc>
+          <w:tcPr>
+            <w:tcW w:type="dxa" w:w="2340"/>
+          </w:tcPr>
+          <w:p>
+            <w:r>
+              <w:rPr>
+                <w:rFonts w:ascii="Times New Roman" w:hAnsi="Times New Roman"/>
+                <w:sz w:val="19"/>
+              </w:rPr>
+              <w:t>VARCHAR</w:t>
+            </w:r>
+          </w:p>
+        </w:tc>
+        <w:tc>
+          <w:tcPr>
+            <w:tcW w:type="dxa" w:w="2340"/>
+          </w:tcPr>
+          <w:p>
+            <w:r>
+              <w:rPr>
+                <w:rFonts w:ascii="Times New Roman" w:hAnsi="Times New Roman"/>
+                <w:sz w:val="19"/>
+              </w:rPr>
+              <w:t>Required</w:t>
+            </w:r>
+          </w:p>
+        </w:tc>
+        <w:tc>
+          <w:tcPr>
+            <w:tcW w:type="dxa" w:w="2340"/>
+          </w:tcPr>
+          <w:p>
+            <w:r>
+              <w:rPr>
+                <w:rFonts w:ascii="Times New Roman" w:hAnsi="Times New Roman"/>
+                <w:sz w:val="19"/>
+              </w:rPr>
+              <w:t>Category of cargo commodity.</w:t>
+            </w:r>
+          </w:p>
+        </w:tc>
+      </w:tr>
+      <w:tr>
+        <w:tc>
+          <w:tcPr>
+            <w:tcW w:type="dxa" w:w="2340"/>
+          </w:tcPr>
+          <w:p>
+            <w:r>
+              <w:rPr>
+                <w:rFonts w:ascii="Times New Roman" w:hAnsi="Times New Roman"/>
+                <w:sz w:val="19"/>
+              </w:rPr>
+              <w:t>weight</w:t>
+            </w:r>
+          </w:p>
+        </w:tc>
+        <w:tc>
+          <w:tcPr>
+            <w:tcW w:type="dxa" w:w="2340"/>
+          </w:tcPr>
+          <w:p>
+            <w:r>
+              <w:rPr>
+                <w:rFonts w:ascii="Times New Roman" w:hAnsi="Times New Roman"/>
+                <w:sz w:val="19"/>
+              </w:rPr>
+              <w:t>REAL</w:t>
+            </w:r>
+          </w:p>
+        </w:tc>
+        <w:tc>
+          <w:tcPr>
+            <w:tcW w:type="dxa" w:w="2340"/>
+          </w:tcPr>
+          <w:p>
+            <w:r>
+              <w:rPr>
+                <w:rFonts w:ascii="Times New Roman" w:hAnsi="Times New Roman"/>
+                <w:sz w:val="19"/>
+              </w:rPr>
+              <w:t>Required</w:t>
+            </w:r>
+          </w:p>
+        </w:tc>
+        <w:tc>
+          <w:tcPr>
+            <w:tcW w:type="dxa" w:w="2340"/>
+          </w:tcPr>
+          <w:p>
+            <w:r>
+              <w:rPr>
+                <w:rFonts w:ascii="Times New Roman" w:hAnsi="Times New Roman"/>
+                <w:sz w:val="19"/>
+              </w:rPr>
+              <w:t>Registered manifest weight (MT).</w:t>
+            </w:r>
+          </w:p>
+        </w:tc>
+      </w:tr>
+      <w:tr>
+        <w:tc>
+          <w:tcPr>
+            <w:tcW w:type="dxa" w:w="2340"/>
+          </w:tcPr>
+          <w:p>
+            <w:r>
+              <w:rPr>
+                <w:rFonts w:ascii="Times New Roman" w:hAnsi="Times New Roman"/>
+                <w:sz w:val="19"/>
+              </w:rPr>
+              <w:t>status</w:t>
+            </w:r>
+          </w:p>
+        </w:tc>
+        <w:tc>
+          <w:tcPr>
+            <w:tcW w:type="dxa" w:w="2340"/>
+          </w:tcPr>
+          <w:p>
+            <w:r>
+              <w:rPr>
+                <w:rFonts w:ascii="Times New Roman" w:hAnsi="Times New Roman"/>
+                <w:sz w:val="19"/>
+              </w:rPr>
+              <w:t>VARCHAR</w:t>
+            </w:r>
+          </w:p>
+        </w:tc>
+        <w:tc>
+          <w:tcPr>
+            <w:tcW w:type="dxa" w:w="2340"/>
+          </w:tcPr>
+          <w:p>
+            <w:r>
+              <w:rPr>
+                <w:rFonts w:ascii="Times New Roman" w:hAnsi="Times New Roman"/>
+                <w:sz w:val="19"/>
+              </w:rPr>
+              <w:t>Pending / Inspected / Approved / Rejected</w:t>
+            </w:r>
+          </w:p>
+        </w:tc>
+        <w:tc>
+          <w:tcPr>
+            <w:tcW w:type="dxa" w:w="2340"/>
+          </w:tcPr>
+          <w:p>
+            <w:r>
+              <w:rPr>
+                <w:rFonts w:ascii="Times New Roman" w:hAnsi="Times New Roman"/>
+                <w:sz w:val="19"/>
+              </w:rPr>
+              <w:t>Current clearance stepper state.</w:t>
+            </w:r>
+          </w:p>
+        </w:tc>
+      </w:tr>
+      <w:tr>
+        <w:tc>
+          <w:tcPr>
+            <w:tcW w:type="dxa" w:w="2340"/>
+          </w:tcPr>
+          <w:p>
+            <w:r>
+              <w:rPr>
+                <w:rFonts w:ascii="Times New Roman" w:hAnsi="Times New Roman"/>
+                <w:sz w:val="19"/>
+              </w:rPr>
+              <w:t>actual_weight</w:t>
+            </w:r>
+          </w:p>
+        </w:tc>
+        <w:tc>
+          <w:tcPr>
+            <w:tcW w:type="dxa" w:w="2340"/>
+          </w:tcPr>
+          <w:p>
+            <w:r>
+              <w:rPr>
+                <w:rFonts w:ascii="Times New Roman" w:hAnsi="Times New Roman"/>
+                <w:sz w:val="19"/>
+              </w:rPr>
+              <w:t>REAL</w:t>
+            </w:r>
+          </w:p>
+        </w:tc>
+        <w:tc>
+          <w:tcPr>
+            <w:tcW w:type="dxa" w:w="2340"/>
+          </w:tcPr>
+          <w:p>
+            <w:r>
+              <w:rPr>
+                <w:rFonts w:ascii="Times New Roman" w:hAnsi="Times New Roman"/>
+                <w:sz w:val="19"/>
+              </w:rPr>
+              <w:t>Nullable</w:t>
+            </w:r>
+          </w:p>
+        </w:tc>
+        <w:tc>
+          <w:tcPr>
+            <w:tcW w:type="dxa" w:w="2340"/>
+          </w:tcPr>
+          <w:p>
+            <w:r>
+              <w:rPr>
+                <w:rFonts w:ascii="Times New Roman" w:hAnsi="Times New Roman"/>
+                <w:sz w:val="19"/>
+              </w:rPr>
+              <w:t>Inspector-verified scale weight.</w:t>
+            </w:r>
+          </w:p>
+        </w:tc>
+      </w:tr>
+      <w:tr>
+        <w:tc>
+          <w:tcPr>
+            <w:tcW w:type="dxa" w:w="2340"/>
+          </w:tcPr>
+          <w:p>
+            <w:r>
+              <w:rPr>
+                <w:rFonts w:ascii="Times New Roman" w:hAnsi="Times New Roman"/>
+                <w:sz w:val="19"/>
+              </w:rPr>
+              <w:t>seal_intact</w:t>
+            </w:r>
+          </w:p>
+        </w:tc>
+        <w:tc>
+          <w:tcPr>
+            <w:tcW w:type="dxa" w:w="2340"/>
+          </w:tcPr>
+          <w:p>
+            <w:r>
+              <w:rPr>
+                <w:rFonts w:ascii="Times New Roman" w:hAnsi="Times New Roman"/>
+                <w:sz w:val="19"/>
+              </w:rPr>
+              <w:t>BOOLEAN</w:t>
+            </w:r>
+          </w:p>
+        </w:tc>
+        <w:tc>
+          <w:tcPr>
+            <w:tcW w:type="dxa" w:w="2340"/>
+          </w:tcPr>
+          <w:p>
+            <w:r>
+              <w:rPr>
+                <w:rFonts w:ascii="Times New Roman" w:hAnsi="Times New Roman"/>
+                <w:sz w:val="19"/>
+              </w:rPr>
+              <w:t>Nullable</w:t>
+            </w:r>
+          </w:p>
+        </w:tc>
+        <w:tc>
+          <w:tcPr>
+            <w:tcW w:type="dxa" w:w="2340"/>
+          </w:tcPr>
+          <w:p>
+            <w:r>
+              <w:rPr>
+                <w:rFonts w:ascii="Times New Roman" w:hAnsi="Times New Roman"/>
+                <w:sz w:val="19"/>
+              </w:rPr>
+              <w:t>Container physical seal integrity flag.</w:t>
+            </w:r>
+          </w:p>
+        </w:tc>
+      </w:tr>
+      <w:tr>
+        <w:tc>
+          <w:tcPr>
+            <w:tcW w:type="dxa" w:w="2340"/>
+          </w:tcPr>
+          <w:p>
+            <w:r>
+              <w:rPr>
+                <w:rFonts w:ascii="Times New Roman" w:hAnsi="Times New Roman"/>
+                <w:sz w:val="19"/>
+              </w:rPr>
+              <w:t>qr_token</w:t>
+            </w:r>
+          </w:p>
+        </w:tc>
+        <w:tc>
+          <w:tcPr>
+            <w:tcW w:type="dxa" w:w="2340"/>
+          </w:tcPr>
+          <w:p>
+            <w:r>
+              <w:rPr>
+                <w:rFonts w:ascii="Times New Roman" w:hAnsi="Times New Roman"/>
+                <w:sz w:val="19"/>
+              </w:rPr>
+              <w:t>VARCHAR</w:t>
+            </w:r>
+          </w:p>
+        </w:tc>
+        <w:tc>
+          <w:tcPr>
+            <w:tcW w:type="dxa" w:w="2340"/>
+          </w:tcPr>
+          <w:p>
+            <w:r>
+              <w:rPr>
+                <w:rFonts w:ascii="Times New Roman" w:hAnsi="Times New Roman"/>
+                <w:sz w:val="19"/>
+              </w:rPr>
+              <w:t>Nullable</w:t>
+            </w:r>
+          </w:p>
+        </w:tc>
+        <w:tc>
+          <w:tcPr>
+            <w:tcW w:type="dxa" w:w="2340"/>
+          </w:tcPr>
+          <w:p>
+            <w:r>
+              <w:rPr>
+                <w:rFonts w:ascii="Times New Roman" w:hAnsi="Times New Roman"/>
+                <w:sz w:val="19"/>
+              </w:rPr>
+              <w:t>Cryptographic clear-pass pass token.</w:t>
+            </w:r>
+          </w:p>
+        </w:tc>
+      </w:tr>
+    </w:tbl>
+    <w:p>
+      <w:pPr>
+        <w:spacing w:before="0" w:after="120"/>
+      </w:pPr>
+    </w:p>
+    <w:p>
+      <w:pPr>
+        <w:keepNext/>
+        <w:spacing w:before="160" w:after="40"/>
+      </w:pPr>
+      <w:r>
+        <w:rPr>
+          <w:rFonts w:ascii="Arial" w:hAnsi="Arial"/>
+          <w:b/>
+          <w:color w:val="646E7D"/>
+          <w:sz w:val="22"/>
+        </w:rPr>
+        <w:t>4.3.3 Grievances Collection Schema</w:t>
+      </w:r>
+    </w:p>
+    <w:tbl>
+      <w:tblPr>
+        <w:tblStyle w:val="TableGrid"/>
+        <w:tblW w:type="auto" w:w="0"/>
+        <w:tblLook w:firstColumn="1" w:firstRow="1" w:lastColumn="0" w:lastRow="0" w:noHBand="0" w:noVBand="1" w:val="04A0"/>
+      </w:tblPr>
+      <w:tblGrid>
+        <w:gridCol w:w="2340"/>
+        <w:gridCol w:w="2340"/>
+        <w:gridCol w:w="2340"/>
+        <w:gridCol w:w="2340"/>
+      </w:tblGrid>
+      <w:tr>
+        <w:tc>
+          <w:tcPr>
+            <w:tcW w:type="dxa" w:w="2340"/>
+          </w:tcPr>
+          <w:p>
+            <w:r>
+              <w:rPr>
+                <w:rFonts w:ascii="Arial" w:hAnsi="Arial"/>
+                <w:b/>
+                <w:color w:val="0D2B5E"/>
+                <w:sz w:val="19"/>
+              </w:rPr>
+              <w:t>Field Name</w:t>
+            </w:r>
+          </w:p>
+        </w:tc>
+        <w:tc>
+          <w:tcPr>
+            <w:tcW w:type="dxa" w:w="2340"/>
+          </w:tcPr>
+          <w:p>
+            <w:r>
+              <w:rPr>
+                <w:rFonts w:ascii="Arial" w:hAnsi="Arial"/>
+                <w:b/>
+                <w:color w:val="0D2B5E"/>
+                <w:sz w:val="19"/>
+              </w:rPr>
+              <w:t>Data Type</w:t>
+            </w:r>
+          </w:p>
+        </w:tc>
+        <w:tc>
+          <w:tcPr>
+            <w:tcW w:type="dxa" w:w="2340"/>
+          </w:tcPr>
+          <w:p>
+            <w:r>
+              <w:rPr>
+                <w:rFonts w:ascii="Arial" w:hAnsi="Arial"/>
+                <w:b/>
+                <w:color w:val="0D2B5E"/>
+                <w:sz w:val="19"/>
+              </w:rPr>
+              <w:t>Constraints</w:t>
+            </w:r>
+          </w:p>
+        </w:tc>
+        <w:tc>
+          <w:tcPr>
+            <w:tcW w:type="dxa" w:w="2340"/>
+          </w:tcPr>
+          <w:p>
+            <w:r>
+              <w:rPr>
+                <w:rFonts w:ascii="Arial" w:hAnsi="Arial"/>
+                <w:b/>
+                <w:color w:val="0D2B5E"/>
+                <w:sz w:val="19"/>
+              </w:rPr>
+              <w:t>Description</w:t>
+            </w:r>
+          </w:p>
+        </w:tc>
+      </w:tr>
+      <w:tr>
+        <w:tc>
+          <w:tcPr>
+            <w:tcW w:type="dxa" w:w="2340"/>
+          </w:tcPr>
+          <w:p>
+            <w:r>
+              <w:rPr>
+                <w:rFonts w:ascii="Times New Roman" w:hAnsi="Times New Roman"/>
+                <w:sz w:val="19"/>
+              </w:rPr>
+              <w:t>id</w:t>
+            </w:r>
+          </w:p>
+        </w:tc>
+        <w:tc>
+          <w:tcPr>
+            <w:tcW w:type="dxa" w:w="2340"/>
+          </w:tcPr>
+          <w:p>
+            <w:r>
+              <w:rPr>
+                <w:rFonts w:ascii="Times New Roman" w:hAnsi="Times New Roman"/>
+                <w:sz w:val="19"/>
+              </w:rPr>
+              <w:t>INTEGER</w:t>
+            </w:r>
+          </w:p>
+        </w:tc>
+        <w:tc>
+          <w:tcPr>
+            <w:tcW w:type="dxa" w:w="2340"/>
+          </w:tcPr>
+          <w:p>
+            <w:r>
+              <w:rPr>
+                <w:rFonts w:ascii="Times New Roman" w:hAnsi="Times New Roman"/>
+                <w:sz w:val="19"/>
+              </w:rPr>
+              <w:t>Primary Key</w:t>
+            </w:r>
+          </w:p>
+        </w:tc>
+        <w:tc>
+          <w:tcPr>
+            <w:tcW w:type="dxa" w:w="2340"/>
+          </w:tcPr>
+          <w:p>
+            <w:r>
+              <w:rPr>
+                <w:rFonts w:ascii="Times New Roman" w:hAnsi="Times New Roman"/>
+                <w:sz w:val="19"/>
+              </w:rPr>
+              <w:t>Grievance unique reference ID.</w:t>
+            </w:r>
+          </w:p>
+        </w:tc>
+      </w:tr>
+      <w:tr>
+        <w:tc>
+          <w:tcPr>
+            <w:tcW w:type="dxa" w:w="2340"/>
+          </w:tcPr>
+          <w:p>
+            <w:r>
+              <w:rPr>
+                <w:rFonts w:ascii="Times New Roman" w:hAnsi="Times New Roman"/>
+                <w:sz w:val="19"/>
+              </w:rPr>
+              <w:t>email</w:t>
+            </w:r>
+          </w:p>
+        </w:tc>
+        <w:tc>
+          <w:tcPr>
+            <w:tcW w:type="dxa" w:w="2340"/>
+          </w:tcPr>
+          <w:p>
+            <w:r>
+              <w:rPr>
+                <w:rFonts w:ascii="Times New Roman" w:hAnsi="Times New Roman"/>
+                <w:sz w:val="19"/>
+              </w:rPr>
+              <w:t>VARCHAR</w:t>
+            </w:r>
+          </w:p>
+        </w:tc>
+        <w:tc>
+          <w:tcPr>
+            <w:tcW w:type="dxa" w:w="2340"/>
+          </w:tcPr>
+          <w:p>
+            <w:r>
+              <w:rPr>
+                <w:rFonts w:ascii="Times New Roman" w:hAnsi="Times New Roman"/>
+                <w:sz w:val="19"/>
+              </w:rPr>
+              <w:t>Required</w:t>
+            </w:r>
+          </w:p>
+        </w:tc>
+        <w:tc>
+          <w:tcPr>
+            <w:tcW w:type="dxa" w:w="2340"/>
+          </w:tcPr>
+          <w:p>
+            <w:r>
+              <w:rPr>
+                <w:rFonts w:ascii="Times New Roman" w:hAnsi="Times New Roman"/>
+                <w:sz w:val="19"/>
+              </w:rPr>
+              <w:t>Contact email of complainant.</w:t>
+            </w:r>
+          </w:p>
+        </w:tc>
+      </w:tr>
+      <w:tr>
+        <w:tc>
+          <w:tcPr>
+            <w:tcW w:type="dxa" w:w="2340"/>
+          </w:tcPr>
+          <w:p>
+            <w:r>
+              <w:rPr>
+                <w:rFonts w:ascii="Times New Roman" w:hAnsi="Times New Roman"/>
+                <w:sz w:val="19"/>
+              </w:rPr>
+              <w:t>subject</w:t>
+            </w:r>
+          </w:p>
+        </w:tc>
+        <w:tc>
+          <w:tcPr>
+            <w:tcW w:type="dxa" w:w="2340"/>
+          </w:tcPr>
+          <w:p>
+            <w:r>
+              <w:rPr>
+                <w:rFonts w:ascii="Times New Roman" w:hAnsi="Times New Roman"/>
+                <w:sz w:val="19"/>
+              </w:rPr>
+              <w:t>VARCHAR</w:t>
+            </w:r>
+          </w:p>
+        </w:tc>
+        <w:tc>
+          <w:tcPr>
+            <w:tcW w:type="dxa" w:w="2340"/>
+          </w:tcPr>
+          <w:p>
+            <w:r>
+              <w:rPr>
+                <w:rFonts w:ascii="Times New Roman" w:hAnsi="Times New Roman"/>
+                <w:sz w:val="19"/>
+              </w:rPr>
+              <w:t>Required</w:t>
+            </w:r>
+          </w:p>
+        </w:tc>
+        <w:tc>
+          <w:tcPr>
+            <w:tcW w:type="dxa" w:w="2340"/>
+          </w:tcPr>
+          <w:p>
+            <w:r>
+              <w:rPr>
+                <w:rFonts w:ascii="Times New Roman" w:hAnsi="Times New Roman"/>
+                <w:sz w:val="19"/>
+              </w:rPr>
+              <w:t>Grievance category classification.</w:t>
+            </w:r>
+          </w:p>
+        </w:tc>
+      </w:tr>
+      <w:tr>
+        <w:tc>
+          <w:tcPr>
+            <w:tcW w:type="dxa" w:w="2340"/>
+          </w:tcPr>
+          <w:p>
+            <w:r>
+              <w:rPr>
+                <w:rFonts w:ascii="Times New Roman" w:hAnsi="Times New Roman"/>
+                <w:sz w:val="19"/>
+              </w:rPr>
+              <w:t>message</w:t>
+            </w:r>
+          </w:p>
+        </w:tc>
+        <w:tc>
+          <w:tcPr>
+            <w:tcW w:type="dxa" w:w="2340"/>
+          </w:tcPr>
+          <w:p>
+            <w:r>
+              <w:rPr>
+                <w:rFonts w:ascii="Times New Roman" w:hAnsi="Times New Roman"/>
+                <w:sz w:val="19"/>
+              </w:rPr>
+              <w:t>TEXT</w:t>
+            </w:r>
+          </w:p>
+        </w:tc>
+        <w:tc>
+          <w:tcPr>
+            <w:tcW w:type="dxa" w:w="2340"/>
+          </w:tcPr>
+          <w:p>
+            <w:r>
+              <w:rPr>
+                <w:rFonts w:ascii="Times New Roman" w:hAnsi="Times New Roman"/>
+                <w:sz w:val="19"/>
+              </w:rPr>
+              <w:t>Required</w:t>
+            </w:r>
+          </w:p>
+        </w:tc>
+        <w:tc>
+          <w:tcPr>
+            <w:tcW w:type="dxa" w:w="2340"/>
+          </w:tcPr>
+          <w:p>
+            <w:r>
+              <w:rPr>
+                <w:rFonts w:ascii="Times New Roman" w:hAnsi="Times New Roman"/>
+                <w:sz w:val="19"/>
+              </w:rPr>
+              <w:t>Structured complainant details text.</w:t>
+            </w:r>
+          </w:p>
+        </w:tc>
+      </w:tr>
+      <w:tr>
+        <w:tc>
+          <w:tcPr>
+            <w:tcW w:type="dxa" w:w="2340"/>
+          </w:tcPr>
+          <w:p>
+            <w:r>
+              <w:rPr>
+                <w:rFonts w:ascii="Times New Roman" w:hAnsi="Times New Roman"/>
+                <w:sz w:val="19"/>
+              </w:rPr>
+              <w:t>severity_level</w:t>
+            </w:r>
+          </w:p>
+        </w:tc>
+        <w:tc>
+          <w:tcPr>
+            <w:tcW w:type="dxa" w:w="2340"/>
+          </w:tcPr>
+          <w:p>
+            <w:r>
+              <w:rPr>
+                <w:rFonts w:ascii="Times New Roman" w:hAnsi="Times New Roman"/>
+                <w:sz w:val="19"/>
+              </w:rPr>
+              <w:t>VARCHAR</w:t>
+            </w:r>
+          </w:p>
+        </w:tc>
+        <w:tc>
+          <w:tcPr>
+            <w:tcW w:type="dxa" w:w="2340"/>
+          </w:tcPr>
+          <w:p>
+            <w:r>
+              <w:rPr>
+                <w:rFonts w:ascii="Times New Roman" w:hAnsi="Times New Roman"/>
+                <w:sz w:val="19"/>
+              </w:rPr>
+              <w:t>Low / Medium / High / Critical</w:t>
+            </w:r>
+          </w:p>
+        </w:tc>
+        <w:tc>
+          <w:tcPr>
+            <w:tcW w:type="dxa" w:w="2340"/>
+          </w:tcPr>
+          <w:p>
+            <w:r>
+              <w:rPr>
+                <w:rFonts w:ascii="Times New Roman" w:hAnsi="Times New Roman"/>
+                <w:sz w:val="19"/>
+              </w:rPr>
+              <w:t>Grievance urgency indicator.</w:t>
+            </w:r>
+          </w:p>
+        </w:tc>
+      </w:tr>
+      <w:tr>
+        <w:tc>
+          <w:tcPr>
+            <w:tcW w:type="dxa" w:w="2340"/>
+          </w:tcPr>
+          <w:p>
+            <w:r>
+              <w:rPr>
+                <w:rFonts w:ascii="Times New Roman" w:hAnsi="Times New Roman"/>
+                <w:sz w:val="19"/>
+              </w:rPr>
+              <w:t>sla_status</w:t>
+            </w:r>
+          </w:p>
+        </w:tc>
+        <w:tc>
+          <w:tcPr>
+            <w:tcW w:type="dxa" w:w="2340"/>
+          </w:tcPr>
+          <w:p>
+            <w:r>
+              <w:rPr>
+                <w:rFonts w:ascii="Times New Roman" w:hAnsi="Times New Roman"/>
+                <w:sz w:val="19"/>
+              </w:rPr>
+              <w:t>VARCHAR</w:t>
+            </w:r>
+          </w:p>
+        </w:tc>
+        <w:tc>
+          <w:tcPr>
+            <w:tcW w:type="dxa" w:w="2340"/>
+          </w:tcPr>
+          <w:p>
+            <w:r>
+              <w:rPr>
+                <w:rFonts w:ascii="Times New Roman" w:hAnsi="Times New Roman"/>
+                <w:sz w:val="19"/>
+              </w:rPr>
+              <w:t>Pending / Under Investigation / Resolved / SLA Breached</w:t>
+            </w:r>
+          </w:p>
+        </w:tc>
+        <w:tc>
+          <w:tcPr>
+            <w:tcW w:type="dxa" w:w="2340"/>
+          </w:tcPr>
+          <w:p>
+            <w:r>
+              <w:rPr>
+                <w:rFonts w:ascii="Times New Roman" w:hAnsi="Times New Roman"/>
+                <w:sz w:val="19"/>
+              </w:rPr>
+              <w:t>SLA tracker status.</w:t>
+            </w:r>
+          </w:p>
+        </w:tc>
+      </w:tr>
+      <w:tr>
+        <w:tc>
+          <w:tcPr>
+            <w:tcW w:type="dxa" w:w="2340"/>
+          </w:tcPr>
+          <w:p>
+            <w:r>
+              <w:rPr>
+                <w:rFonts w:ascii="Times New Roman" w:hAnsi="Times New Roman"/>
+                <w:sz w:val="19"/>
+              </w:rPr>
+              <w:t>sla_deadline</w:t>
+            </w:r>
+          </w:p>
+        </w:tc>
+        <w:tc>
+          <w:tcPr>
+            <w:tcW w:type="dxa" w:w="2340"/>
+          </w:tcPr>
+          <w:p>
+            <w:r>
+              <w:rPr>
+                <w:rFonts w:ascii="Times New Roman" w:hAnsi="Times New Roman"/>
+                <w:sz w:val="19"/>
+              </w:rPr>
+              <w:t>TIMESTAMP</w:t>
+            </w:r>
+          </w:p>
+        </w:tc>
+        <w:tc>
+          <w:tcPr>
+            <w:tcW w:type="dxa" w:w="2340"/>
+          </w:tcPr>
+          <w:p>
+            <w:r>
+              <w:rPr>
+                <w:rFonts w:ascii="Times New Roman" w:hAnsi="Times New Roman"/>
+                <w:sz w:val="19"/>
+              </w:rPr>
+              <w:t>Required</w:t>
+            </w:r>
+          </w:p>
+        </w:tc>
+        <w:tc>
+          <w:tcPr>
+            <w:tcW w:type="dxa" w:w="2340"/>
+          </w:tcPr>
+          <w:p>
+            <w:r>
+              <w:rPr>
+                <w:rFonts w:ascii="Times New Roman" w:hAnsi="Times New Roman"/>
+                <w:sz w:val="19"/>
+              </w:rPr>
+              <w:t>Submission date + 72-hour deadline.</w:t>
+            </w:r>
+          </w:p>
+        </w:tc>
+      </w:tr>
+      <w:tr>
+        <w:tc>
+          <w:tcPr>
+            <w:tcW w:type="dxa" w:w="2340"/>
+          </w:tcPr>
+          <w:p>
+            <w:r>
+              <w:rPr>
+                <w:rFonts w:ascii="Times New Roman" w:hAnsi="Times New Roman"/>
+                <w:sz w:val="19"/>
+              </w:rPr>
+              <w:t>escalated_to_chairman</w:t>
+            </w:r>
+          </w:p>
+        </w:tc>
+        <w:tc>
+          <w:tcPr>
+            <w:tcW w:type="dxa" w:w="2340"/>
+          </w:tcPr>
+          <w:p>
+            <w:r>
+              <w:rPr>
+                <w:rFonts w:ascii="Times New Roman" w:hAnsi="Times New Roman"/>
+                <w:sz w:val="19"/>
+              </w:rPr>
+              <w:t>BOOLEAN</w:t>
+            </w:r>
+          </w:p>
+        </w:tc>
+        <w:tc>
+          <w:tcPr>
+            <w:tcW w:type="dxa" w:w="2340"/>
+          </w:tcPr>
+          <w:p>
+            <w:r>
+              <w:rPr>
+                <w:rFonts w:ascii="Times New Roman" w:hAnsi="Times New Roman"/>
+                <w:sz w:val="19"/>
+              </w:rPr>
+              <w:t>Default: False</w:t>
+            </w:r>
+          </w:p>
+        </w:tc>
+        <w:tc>
+          <w:tcPr>
+            <w:tcW w:type="dxa" w:w="2340"/>
+          </w:tcPr>
+          <w:p>
+            <w:r>
+              <w:rPr>
+                <w:rFonts w:ascii="Times New Roman" w:hAnsi="Times New Roman"/>
+                <w:sz w:val="19"/>
+              </w:rPr>
+              <w:t>Escalation indicator flag.</w:t>
+            </w:r>
+          </w:p>
+        </w:tc>
+      </w:tr>
+    </w:tbl>
+    <w:p>
+      <w:pPr>
+        <w:spacing w:before="0" w:after="120"/>
+      </w:pPr>
     </w:p>
     <w:p>
       <w:pPr>

</xml_diff>

<commit_message>
feat: replace linear progress splits with dynamic SVG Donut Charts in SystemAdmin and PortAuthority; regenerate final PDF and Word reports
</commit_message>
<xml_diff>
--- a/NMPA_Project_Report_Final.docx
+++ b/NMPA_Project_Report_Final.docx
@@ -18370,49 +18370,49 @@
         <w:br/>
         <w:t>0728:                     &lt;Col span={24}&gt;</w:t>
         <w:br/>
-        <w:t>0729:                       &lt;Card title={t('breakdownChartTitle')} style={{ height: '300px' }}&gt;</w:t>
-        <w:br/>
-        <w:t>0730:                         &lt;div style={{ display: 'flex', flexDirection: 'column', justifyContent: ...</w:t>
-        <w:br/>
-        <w:t>0731:                           &lt;div&gt;</w:t>
-        <w:br/>
-        <w:t>0732:                             &lt;div style={{ display: 'flex', justifyContent: 'space-between', marg...</w:t>
-        <w:br/>
-        <w:t>0733:                               &lt;Text&gt;{t('splitsApprovedAccess')}&lt;/Text&gt;</w:t>
-        <w:br/>
-        <w:t>0734:                               &lt;Text strong&gt;{(clearedCount / (clearedCount + rejectedCount || 1) ...</w:t>
-        <w:br/>
-        <w:t>0735:                             &lt;/div&gt;</w:t>
-        <w:br/>
-        <w:t>0736:                             &lt;div style={{ width: '100%', height: '12px', background: '#f5f5f5', ...</w:t>
-        <w:br/>
-        <w:t>0737:                               &lt;div style={{ width: `${(clearedCount / (clearedCount + rejectedCo...</w:t>
-        <w:br/>
-        <w:t>0738:                             &lt;/div&gt;</w:t>
-        <w:br/>
-        <w:t>0739:                           &lt;/div&gt;</w:t>
-        <w:br/>
-        <w:t xml:space="preserve">0740: </w:t>
-        <w:br/>
-        <w:t>0741:                           &lt;div&gt;</w:t>
-        <w:br/>
-        <w:t>0742:                             &lt;div style={{ display: 'flex', justifyContent: 'space-between', marg...</w:t>
-        <w:br/>
-        <w:t>0743:                               &lt;Text&gt;{t('splitsDetainedAccess')}&lt;/Text&gt;</w:t>
-        <w:br/>
-        <w:t>0744:                               &lt;Text strong&gt;{(rejectedCount / (clearedCount + rejectedCount || 1)...</w:t>
-        <w:br/>
-        <w:t>0745:                             &lt;/div&gt;</w:t>
-        <w:br/>
-        <w:t>0746:                             &lt;div style={{ width: '100%', height: '12px', background: '#f5f5f5', ...</w:t>
-        <w:br/>
-        <w:t>0747:                               &lt;div style={{ width: `${(rejectedCount / (clearedCount + rejectedC...</w:t>
-        <w:br/>
-        <w:t>0748:                             &lt;/div&gt;</w:t>
-        <w:br/>
-        <w:t>0749:                           &lt;/div&gt;</w:t>
-        <w:br/>
-        <w:t>0750:                         &lt;/div&gt;</w:t>
+        <w:t>0729:                       &lt;Card title={t('breakdownChartTitle')} style={{ height: '320px' }}&gt;</w:t>
+        <w:br/>
+        <w:t>0730:                         &lt;div style={{ display: 'flex', alignItems: 'center', justifyContent: 'sp...</w:t>
+        <w:br/>
+        <w:t>0731:                           {/* SVG Donut Chart */}</w:t>
+        <w:br/>
+        <w:t>0732:                           &lt;div style={{ position: 'relative', width: '160px', height: '160px' }}&gt;</w:t>
+        <w:br/>
+        <w:t>0733:                             &lt;svg width="160" height="160" viewBox="0 0 120 120" style={{ transfo...</w:t>
+        <w:br/>
+        <w:t>0734:                               &lt;circle</w:t>
+        <w:br/>
+        <w:t>0735:                                 cx="60"</w:t>
+        <w:br/>
+        <w:t>0736:                                 cy="60"</w:t>
+        <w:br/>
+        <w:t>0737:                                 r="48"</w:t>
+        <w:br/>
+        <w:t>0738:                                 fill="transparent"</w:t>
+        <w:br/>
+        <w:t>0739:                                 stroke="#f5f5f5"</w:t>
+        <w:br/>
+        <w:t>0740:                                 strokeWidth="12"</w:t>
+        <w:br/>
+        <w:t>0741:                               /&gt;</w:t>
+        <w:br/>
+        <w:t>0742:                               {(clearedCount + rejectedCount) &gt; 0 ? (</w:t>
+        <w:br/>
+        <w:t>0743:                                 &lt;&gt;</w:t>
+        <w:br/>
+        <w:t>0744:                                   &lt;circle</w:t>
+        <w:br/>
+        <w:t>0745:                                     cx="60"</w:t>
+        <w:br/>
+        <w:t>0746:                                     cy="60"</w:t>
+        <w:br/>
+        <w:t>0747:                                     r="48"</w:t>
+        <w:br/>
+        <w:t>0748:                                     fill="transparent"</w:t>
+        <w:br/>
+        <w:t>0749:                                     stroke="#52c41a"</w:t>
+        <w:br/>
+        <w:t>0750:                                     strokeWidth="12"</w:t>
       </w:r>
     </w:p>
     <w:p>
@@ -18425,305 +18425,305 @@
           <w:color w:val="000000"/>
           <w:sz w:val="17"/>
         </w:rPr>
-        <w:t>0751:                       &lt;/Card&gt;</w:t>
-        <w:br/>
-        <w:t>0752:                     &lt;/Col&gt;</w:t>
-        <w:br/>
-        <w:t>0753:                   &lt;/Row&gt;</w:t>
-        <w:br/>
-        <w:t xml:space="preserve">0754: </w:t>
-        <w:br/>
-        <w:t>0755:                 &lt;/div&gt;</w:t>
-        <w:br/>
-        <w:t>0756:               )</w:t>
-        <w:br/>
-        <w:t>0757:             },</w:t>
-        <w:br/>
-        <w:t xml:space="preserve">0758: </w:t>
-        <w:br/>
-        <w:t>0759:             // TAB 5: OPERATOR COMPLAINTS</w:t>
-        <w:br/>
-        <w:t>0760:             {</w:t>
-        <w:br/>
-        <w:t>0761:               key: '5',</w:t>
-        <w:br/>
-        <w:t>0762:               label: &lt;span&gt;&lt;CommentOutlined /&gt; Grievances&lt;/span&gt;,</w:t>
-        <w:br/>
-        <w:t>0763:               children: (</w:t>
-        <w:br/>
-        <w:t>0764:                 &lt;div&gt;</w:t>
-        <w:br/>
-        <w:t>0765:                   &lt;Tabs</w:t>
-        <w:br/>
-        <w:t>0766:                     defaultActiveKey="standard"</w:t>
-        <w:br/>
-        <w:t>0767:                     type="card"</w:t>
-        <w:br/>
-        <w:t>0768:                     items={[</w:t>
-        <w:br/>
-        <w:t>0769:                       {</w:t>
-        <w:br/>
-        <w:t>0770:                         key: 'standard',</w:t>
-        <w:br/>
-        <w:t>0771:                         label: 'Standard Grievance Queue',</w:t>
-        <w:br/>
-        <w:t>0772:                         children: (</w:t>
-        <w:br/>
-        <w:t>0773:                           &lt;div style={{ marginTop: '15px' }}&gt;</w:t>
-        <w:br/>
-        <w:t>0774:                             &lt;Title level={4} style={{ marginBottom: '20px' }}&gt;Standard Grievance...</w:t>
-        <w:br/>
-        <w:t>0775:                             {(() =&gt; {</w:t>
-        <w:br/>
-        <w:t>0776:                               const sortedComplaints = [...complaints].sort((a, b) =&gt; {</w:t>
-        <w:br/>
-        <w:t>0777:                                 const aBreached = a.sla_status === 'SLA Breached';</w:t>
-        <w:br/>
-        <w:t>0778:                                 const bBreached = b.sla_status === 'SLA Breached';</w:t>
-        <w:br/>
-        <w:t>0779:                                 if (aBreached &amp;&amp; !bBreached) return -1;</w:t>
-        <w:br/>
-        <w:t>0780:                                 if (!aBreached &amp;&amp; bBreached) return 1;</w:t>
-        <w:br/>
-        <w:t>0781:                                 return new Date(b.date) - new Date(a.date);</w:t>
-        <w:br/>
-        <w:t>0782:                               });</w:t>
-        <w:br/>
-        <w:t>0783:                               return (</w:t>
-        <w:br/>
-        <w:t>0784:                                 &lt;Table</w:t>
-        <w:br/>
-        <w:t>0785:                                   dataSource={sortedComplaints}</w:t>
-        <w:br/>
-        <w:t>0786:                                   loading={loading}</w:t>
-        <w:br/>
-        <w:t>0787:                                   rowKey="id"</w:t>
-        <w:br/>
-        <w:t>0788:                                   pagination={{ pageSize: 6 }}</w:t>
-        <w:br/>
-        <w:t>0789:                                   bordered</w:t>
-        <w:br/>
-        <w:t>0790:                                   rowClassName={(record) =&gt; {</w:t>
-        <w:br/>
-        <w:t>0791:                                     if (record.sla_status === 'SLA Breached') {</w:t>
-        <w:br/>
-        <w:t>0792:                                       return 'sla-breached-row';</w:t>
-        <w:br/>
-        <w:t>0793:                                     }</w:t>
-        <w:br/>
-        <w:t>0794:                                     return '';</w:t>
-        <w:br/>
-        <w:t>0795:                                   }}</w:t>
-        <w:br/>
-        <w:t>0796:                                   columns={[</w:t>
-        <w:br/>
-        <w:t>0797:                                     {</w:t>
-        <w:br/>
-        <w:t>0798:                                       title: t('complaintsTimestamp'),</w:t>
-        <w:br/>
-        <w:t>0799:                                       dataIndex: 'date',</w:t>
-        <w:br/>
-        <w:t>0800:                                       key: 'date',</w:t>
-        <w:br/>
-        <w:t>0801:                                       width: '12%',</w:t>
-        <w:br/>
-        <w:t>0802:                                       render: (date) =&gt; date ? new Date(date).toLocaleString() :...</w:t>
-        <w:br/>
-        <w:t>0803:                                     },</w:t>
-        <w:br/>
-        <w:t>0804:                                     {</w:t>
-        <w:br/>
-        <w:t>0805:                                       title: t('complaintsSender'),</w:t>
-        <w:br/>
-        <w:t>0806:                                       dataIndex: 'email',</w:t>
-        <w:br/>
-        <w:t>0807:                                       key: 'email',</w:t>
-        <w:br/>
-        <w:t>0808:                                       width: '15%',</w:t>
-        <w:br/>
-        <w:t>0809:                                       render: (email) =&gt; &lt;Text strong&gt;{email}&lt;/Text&gt;</w:t>
-        <w:br/>
-        <w:t>0810:                                     },</w:t>
-        <w:br/>
-        <w:t>0811:                                     {</w:t>
-        <w:br/>
-        <w:t>0812:                                       title: 'Grievance Category / Subject',</w:t>
-        <w:br/>
-        <w:t>0813:                                       dataIndex: 'subject',</w:t>
-        <w:br/>
-        <w:t>0814:                                       key: 'subject',</w:t>
-        <w:br/>
-        <w:t>0815:                                       width: '15%',</w:t>
-        <w:br/>
-        <w:t>0816:                                       render: (subject) =&gt; &lt;Text style={{ color: 'var(--nmpa-blu...</w:t>
-        <w:br/>
-        <w:t>0817:                                     },</w:t>
-        <w:br/>
-        <w:t>0818:                                     {</w:t>
-        <w:br/>
-        <w:t>0819:                                       title: t('complaintsMessage'),</w:t>
-        <w:br/>
-        <w:t>0820:                                       dataIndex: 'message',</w:t>
-        <w:br/>
-        <w:t>0821:                                       key: 'message',</w:t>
-        <w:br/>
-        <w:t>0822:                                       width: '35%',</w:t>
-        <w:br/>
-        <w:t>0823:                                       render: (message) =&gt; &lt;GrievanceDetailsCell message={messag...</w:t>
-        <w:br/>
-        <w:t>0824:                                     },</w:t>
-        <w:br/>
-        <w:t>0825:                                     {</w:t>
-        <w:br/>
-        <w:t>0826:                                       title: 'SLA Status',</w:t>
-        <w:br/>
-        <w:t>0827:                                       dataIndex: 'sla_status',</w:t>
-        <w:br/>
-        <w:t>0828:                                       key: 'sla_status',</w:t>
-        <w:br/>
-        <w:t>0829:                                       width: '10%',</w:t>
-        <w:br/>
-        <w:t>0830:                                       render: (status) =&gt; {</w:t>
-        <w:br/>
-        <w:t>0831:                                         if (status === 'SLA Breached') return &lt;Tag color="red" s...</w:t>
-        <w:br/>
-        <w:t>0832:                                         if (status === 'Under Investigation') return &lt;Tag color=...</w:t>
-        <w:br/>
-        <w:t>0833:                                         if (status === 'Resolved') return &lt;Tag color="green" sty...</w:t>
-        <w:br/>
-        <w:t>0834:                                         return &lt;Tag color="blue" style={{ fontWeight: 'bold' }}&gt;...</w:t>
-        <w:br/>
-        <w:t>0835:                                       }</w:t>
-        <w:br/>
-        <w:t>0836:                                     },</w:t>
-        <w:br/>
-        <w:t>0837:                                     {</w:t>
-        <w:br/>
-        <w:t>0838:                                       title: 'SLA Timeline',</w:t>
-        <w:br/>
-        <w:t>0839:                                       key: 'sla_timeline',</w:t>
-        <w:br/>
-        <w:t>0840:                                       width: '10%',</w:t>
-        <w:br/>
-        <w:t>0841:                                       render: (_, record) =&gt; {</w:t>
-        <w:br/>
-        <w:t>0842:                                         if (record.sla_status === 'Pending') {</w:t>
-        <w:br/>
-        <w:t>0843:                                           return (</w:t>
-        <w:br/>
-        <w:t>0844:                                             &lt;SlaCountdown</w:t>
-        <w:br/>
-        <w:t>0845:                                               deadline={record.sla_deadline}</w:t>
-        <w:br/>
-        <w:t>0846:                                               onExpired={() =&gt; {</w:t>
-        <w:br/>
-        <w:t>0847:                                                 fetchAll();</w:t>
-        <w:br/>
-        <w:t>0848:                                               }}</w:t>
-        <w:br/>
-        <w:t>0849:                                             /&gt;</w:t>
-        <w:br/>
-        <w:t>0850:                                           );</w:t>
-        <w:br/>
-        <w:t>0851:                                         }</w:t>
-        <w:br/>
-        <w:t>0852:                                         if (record.sla_status === 'SLA Breached') {</w:t>
-        <w:br/>
-        <w:t>0853:                                           return &lt;span style={{ color: '#d9534f', fontWeight: 'b...</w:t>
-        <w:br/>
-        <w:t>0854:                                         }</w:t>
-        <w:br/>
-        <w:t>0855:                                         return &lt;Tag color="success"&gt;SLA Met&lt;/Tag&gt;;</w:t>
-        <w:br/>
-        <w:t>0856:                                       }</w:t>
-        <w:br/>
-        <w:t>0857:                                     },</w:t>
-        <w:br/>
-        <w:t>0858:                                     {</w:t>
-        <w:br/>
-        <w:t>0859:                                       title: 'Actions',</w:t>
-        <w:br/>
-        <w:t>0860:                                       key: 'actions',</w:t>
-        <w:br/>
-        <w:t>0861:                                       width: '10%',</w:t>
-        <w:br/>
-        <w:t>0862:                                       render: (_, record) =&gt; {</w:t>
-        <w:br/>
-        <w:t>0863:                                         if (record.sla_status === 'Resolved') return null;</w:t>
-        <w:br/>
-        <w:t>0864:                                         return (</w:t>
-        <w:br/>
-        <w:t>0865:                                           &lt;Space size="small"&gt;</w:t>
-        <w:br/>
-        <w:t>0866:                                             {record.sla_status === 'Pending' &amp;&amp; (</w:t>
-        <w:br/>
-        <w:t>0867:                                               &lt;Button</w:t>
-        <w:br/>
-        <w:t>0868:                                                 type="primary"</w:t>
-        <w:br/>
-        <w:t>0869:                                                 size="small"</w:t>
-        <w:br/>
-        <w:t>0870:                                                 onClick={() =&gt; handleUpdateStatus(record.id, 'Un...</w:t>
-        <w:br/>
-        <w:t>0871:                                               &gt;</w:t>
-        <w:br/>
-        <w:t>0872:                                                 Investigate</w:t>
-        <w:br/>
-        <w:t>0873:                                               &lt;/Button&gt;</w:t>
-        <w:br/>
-        <w:t>0874:                                             )}</w:t>
-        <w:br/>
-        <w:t>0875:                                             {(record.sla_status === 'Pending' || record.sla_stat...</w:t>
-        <w:br/>
-        <w:t>0876:                                               &lt;Button</w:t>
-        <w:br/>
-        <w:t>0877:                                                 type="primary"</w:t>
-        <w:br/>
-        <w:t>0878:                                                 danger</w:t>
-        <w:br/>
-        <w:t>0879:                                                 size="small"</w:t>
-        <w:br/>
-        <w:t>0880:                                                 onClick={() =&gt; handleUpdateStatus(record.id, 'Re...</w:t>
-        <w:br/>
-        <w:t>0881:                                                 style={{ backgroundColor: '#2e7d32', borderColor...</w:t>
-        <w:br/>
-        <w:t>0882:                                               &gt;</w:t>
-        <w:br/>
-        <w:t>0883:                                                 Resolve</w:t>
-        <w:br/>
-        <w:t>0884:                                               &lt;/Button&gt;</w:t>
-        <w:br/>
-        <w:t>0885:                                             )}</w:t>
-        <w:br/>
-        <w:t>0886:                                           &lt;/Space&gt;</w:t>
-        <w:br/>
-        <w:t>0887:                                         );</w:t>
-        <w:br/>
-        <w:t>0888:                                       }</w:t>
-        <w:br/>
-        <w:t>0889:                                     }</w:t>
-        <w:br/>
-        <w:t>0890:                                   ]}</w:t>
-        <w:br/>
-        <w:t>0891:                                 /&gt;</w:t>
-        <w:br/>
-        <w:t>0892:                               );</w:t>
-        <w:br/>
-        <w:t>0893:                             })()}</w:t>
-        <w:br/>
-        <w:t>0894:                           &lt;/div&gt;</w:t>
-        <w:br/>
-        <w:t>0895:                         )</w:t>
-        <w:br/>
-        <w:t>0896:                       },</w:t>
-        <w:br/>
-        <w:t>0897:                       {</w:t>
-        <w:br/>
-        <w:t>0898:                         key: 'chairman',</w:t>
-        <w:br/>
-        <w:t>0899:                         label: '⚠️ Secure Chairman\'s Office Inbox',</w:t>
-        <w:br/>
-        <w:t>0900:                         children: (</w:t>
+        <w:t>0751:                                     strokeDasharray={`${(clearedCount / (clearedCount + rejected...</w:t>
+        <w:br/>
+        <w:t>0752:                                     strokeLinecap="round"</w:t>
+        <w:br/>
+        <w:t>0753:                                   /&gt;</w:t>
+        <w:br/>
+        <w:t>0754:                                   &lt;circle</w:t>
+        <w:br/>
+        <w:t>0755:                                     cx="60"</w:t>
+        <w:br/>
+        <w:t>0756:                                     cy="60"</w:t>
+        <w:br/>
+        <w:t>0757:                                     r="48"</w:t>
+        <w:br/>
+        <w:t>0758:                                     fill="transparent"</w:t>
+        <w:br/>
+        <w:t>0759:                                     stroke="#ff4d4f"</w:t>
+        <w:br/>
+        <w:t>0760:                                     strokeWidth="12"</w:t>
+        <w:br/>
+        <w:t>0761:                                     strokeDasharray={`${(rejectedCount / (clearedCount + rejecte...</w:t>
+        <w:br/>
+        <w:t>0762:                                     strokeDashoffset={-((clearedCount / (clearedCount + rejected...</w:t>
+        <w:br/>
+        <w:t>0763:                                     strokeLinecap="round"</w:t>
+        <w:br/>
+        <w:t>0764:                                   /&gt;</w:t>
+        <w:br/>
+        <w:t>0765:                                 &lt;/&gt;</w:t>
+        <w:br/>
+        <w:t>0766:                               ) : null}</w:t>
+        <w:br/>
+        <w:t>0767:                             &lt;/svg&gt;</w:t>
+        <w:br/>
+        <w:t>0768:                             &lt;div style={{</w:t>
+        <w:br/>
+        <w:t>0769:                               position: 'absolute',</w:t>
+        <w:br/>
+        <w:t>0770:                               top: 0,</w:t>
+        <w:br/>
+        <w:t>0771:                               left: 0,</w:t>
+        <w:br/>
+        <w:t>0772:                               width: '160px',</w:t>
+        <w:br/>
+        <w:t>0773:                               height: '160px',</w:t>
+        <w:br/>
+        <w:t>0774:                               display: 'flex',</w:t>
+        <w:br/>
+        <w:t>0775:                               flexDirection: 'column',</w:t>
+        <w:br/>
+        <w:t>0776:                               alignItems: 'center',</w:t>
+        <w:br/>
+        <w:t>0777:                               justifyContent: 'center'</w:t>
+        <w:br/>
+        <w:t>0778:                             }}&gt;</w:t>
+        <w:br/>
+        <w:t>0779:                               &lt;Text style={{ fontSize: '20px', fontWeight: 'bold', margin: 0, co...</w:t>
+        <w:br/>
+        <w:t>0780:                                 {clearedCount + rejectedCount}</w:t>
+        <w:br/>
+        <w:t>0781:                               &lt;/Text&gt;</w:t>
+        <w:br/>
+        <w:t>0782:                               &lt;Text style={{ fontSize: '10px', color: '#8c8c8c', margin: 0 }}&gt;</w:t>
+        <w:br/>
+        <w:t>0783:                                 {language === 'en' ? 'Total Actions' : 'कुल गतिविधियां'}</w:t>
+        <w:br/>
+        <w:t>0784:                               &lt;/Text&gt;</w:t>
+        <w:br/>
+        <w:t>0785:                             &lt;/div&gt;</w:t>
+        <w:br/>
+        <w:t>0786:                           &lt;/div&gt;</w:t>
+        <w:br/>
+        <w:t xml:space="preserve">0787: </w:t>
+        <w:br/>
+        <w:t>0788:                           {/* Legend / Details */}</w:t>
+        <w:br/>
+        <w:t>0789:                           &lt;div style={{ display: 'flex', flexDirection: 'column', gap: '15px', m...</w:t>
+        <w:br/>
+        <w:t>0790:                             &lt;div&gt;</w:t>
+        <w:br/>
+        <w:t>0791:                               &lt;div style={{ display: 'flex', alignItems: 'center', gap: '8px', m...</w:t>
+        <w:br/>
+        <w:t>0792:                                 &lt;div style={{ width: '12px', height: '12px', borderRadius: '50%'...</w:t>
+        <w:br/>
+        <w:t>0793:                                 &lt;Text strong style={{ fontSize: '14px' }}&gt;{t('splitsApprovedAcce...</w:t>
+        <w:br/>
+        <w:t>0794:                               &lt;/div&gt;</w:t>
+        <w:br/>
+        <w:t>0795:                               &lt;Text type="secondary" style={{ marginLeft: '20px' }}&gt;</w:t>
+        <w:br/>
+        <w:t>0796:                                 {clearedCount} {language === 'en' ? 'Vessels Cleared' : 'जहाज स्...</w:t>
+        <w:br/>
+        <w:t>0797:                               &lt;/Text&gt;</w:t>
+        <w:br/>
+        <w:t>0798:                             &lt;/div&gt;</w:t>
+        <w:br/>
+        <w:t xml:space="preserve">0799: </w:t>
+        <w:br/>
+        <w:t>0800:                             &lt;div&gt;</w:t>
+        <w:br/>
+        <w:t>0801:                               &lt;div style={{ display: 'flex', alignItems: 'center', gap: '8px', m...</w:t>
+        <w:br/>
+        <w:t>0802:                                 &lt;div style={{ width: '12px', height: '12px', borderRadius: '50%'...</w:t>
+        <w:br/>
+        <w:t>0803:                                 &lt;Text strong style={{ fontSize: '14px' }}&gt;{t('splitsDetainedAcce...</w:t>
+        <w:br/>
+        <w:t>0804:                               &lt;/div&gt;</w:t>
+        <w:br/>
+        <w:t>0805:                               &lt;Text type="secondary" style={{ marginLeft: '20px' }}&gt;</w:t>
+        <w:br/>
+        <w:t>0806:                                 {rejectedCount} {language === 'en' ? 'Vessels Detained' : 'जहाज ...</w:t>
+        <w:br/>
+        <w:t>0807:                               &lt;/Text&gt;</w:t>
+        <w:br/>
+        <w:t>0808:                             &lt;/div&gt;</w:t>
+        <w:br/>
+        <w:t>0809:                           &lt;/div&gt;</w:t>
+        <w:br/>
+        <w:t>0810:                         &lt;/div&gt;</w:t>
+        <w:br/>
+        <w:t>0811:                       &lt;/Card&gt;</w:t>
+        <w:br/>
+        <w:t>0812:                     &lt;/Col&gt;</w:t>
+        <w:br/>
+        <w:t>0813:                   &lt;/Row&gt;</w:t>
+        <w:br/>
+        <w:t xml:space="preserve">0814: </w:t>
+        <w:br/>
+        <w:t>0815:                 &lt;/div&gt;</w:t>
+        <w:br/>
+        <w:t>0816:               )</w:t>
+        <w:br/>
+        <w:t>0817:             },</w:t>
+        <w:br/>
+        <w:t xml:space="preserve">0818: </w:t>
+        <w:br/>
+        <w:t>0819:             // TAB 5: OPERATOR COMPLAINTS</w:t>
+        <w:br/>
+        <w:t>0820:             {</w:t>
+        <w:br/>
+        <w:t>0821:               key: '5',</w:t>
+        <w:br/>
+        <w:t>0822:               label: &lt;span&gt;&lt;CommentOutlined /&gt; Grievances&lt;/span&gt;,</w:t>
+        <w:br/>
+        <w:t>0823:               children: (</w:t>
+        <w:br/>
+        <w:t>0824:                 &lt;div&gt;</w:t>
+        <w:br/>
+        <w:t>0825:                   &lt;Tabs</w:t>
+        <w:br/>
+        <w:t>0826:                     defaultActiveKey="standard"</w:t>
+        <w:br/>
+        <w:t>0827:                     type="card"</w:t>
+        <w:br/>
+        <w:t>0828:                     items={[</w:t>
+        <w:br/>
+        <w:t>0829:                       {</w:t>
+        <w:br/>
+        <w:t>0830:                         key: 'standard',</w:t>
+        <w:br/>
+        <w:t>0831:                         label: 'Standard Grievance Queue',</w:t>
+        <w:br/>
+        <w:t>0832:                         children: (</w:t>
+        <w:br/>
+        <w:t>0833:                           &lt;div style={{ marginTop: '15px' }}&gt;</w:t>
+        <w:br/>
+        <w:t>0834:                             &lt;Title level={4} style={{ marginBottom: '20px' }}&gt;Standard Grievance...</w:t>
+        <w:br/>
+        <w:t>0835:                             {(() =&gt; {</w:t>
+        <w:br/>
+        <w:t>0836:                               const sortedComplaints = [...complaints].sort((a, b) =&gt; {</w:t>
+        <w:br/>
+        <w:t>0837:                                 const aBreached = a.sla_status === 'SLA Breached';</w:t>
+        <w:br/>
+        <w:t>0838:                                 const bBreached = b.sla_status === 'SLA Breached';</w:t>
+        <w:br/>
+        <w:t>0839:                                 if (aBreached &amp;&amp; !bBreached) return -1;</w:t>
+        <w:br/>
+        <w:t>0840:                                 if (!aBreached &amp;&amp; bBreached) return 1;</w:t>
+        <w:br/>
+        <w:t>0841:                                 return new Date(b.date) - new Date(a.date);</w:t>
+        <w:br/>
+        <w:t>0842:                               });</w:t>
+        <w:br/>
+        <w:t>0843:                               return (</w:t>
+        <w:br/>
+        <w:t>0844:                                 &lt;Table</w:t>
+        <w:br/>
+        <w:t>0845:                                   dataSource={sortedComplaints}</w:t>
+        <w:br/>
+        <w:t>0846:                                   loading={loading}</w:t>
+        <w:br/>
+        <w:t>0847:                                   rowKey="id"</w:t>
+        <w:br/>
+        <w:t>0848:                                   pagination={{ pageSize: 6 }}</w:t>
+        <w:br/>
+        <w:t>0849:                                   bordered</w:t>
+        <w:br/>
+        <w:t>0850:                                   rowClassName={(record) =&gt; {</w:t>
+        <w:br/>
+        <w:t>0851:                                     if (record.sla_status === 'SLA Breached') {</w:t>
+        <w:br/>
+        <w:t>0852:                                       return 'sla-breached-row';</w:t>
+        <w:br/>
+        <w:t>0853:                                     }</w:t>
+        <w:br/>
+        <w:t>0854:                                     return '';</w:t>
+        <w:br/>
+        <w:t>0855:                                   }}</w:t>
+        <w:br/>
+        <w:t>0856:                                   columns={[</w:t>
+        <w:br/>
+        <w:t>0857:                                     {</w:t>
+        <w:br/>
+        <w:t>0858:                                       title: t('complaintsTimestamp'),</w:t>
+        <w:br/>
+        <w:t>0859:                                       dataIndex: 'date',</w:t>
+        <w:br/>
+        <w:t>0860:                                       key: 'date',</w:t>
+        <w:br/>
+        <w:t>0861:                                       width: '12%',</w:t>
+        <w:br/>
+        <w:t>0862:                                       render: (date) =&gt; date ? new Date(date).toLocaleString() :...</w:t>
+        <w:br/>
+        <w:t>0863:                                     },</w:t>
+        <w:br/>
+        <w:t>0864:                                     {</w:t>
+        <w:br/>
+        <w:t>0865:                                       title: t('complaintsSender'),</w:t>
+        <w:br/>
+        <w:t>0866:                                       dataIndex: 'email',</w:t>
+        <w:br/>
+        <w:t>0867:                                       key: 'email',</w:t>
+        <w:br/>
+        <w:t>0868:                                       width: '15%',</w:t>
+        <w:br/>
+        <w:t>0869:                                       render: (email) =&gt; &lt;Text strong&gt;{email}&lt;/Text&gt;</w:t>
+        <w:br/>
+        <w:t>0870:                                     },</w:t>
+        <w:br/>
+        <w:t>0871:                                     {</w:t>
+        <w:br/>
+        <w:t>0872:                                       title: 'Grievance Category / Subject',</w:t>
+        <w:br/>
+        <w:t>0873:                                       dataIndex: 'subject',</w:t>
+        <w:br/>
+        <w:t>0874:                                       key: 'subject',</w:t>
+        <w:br/>
+        <w:t>0875:                                       width: '15%',</w:t>
+        <w:br/>
+        <w:t>0876:                                       render: (subject) =&gt; &lt;Text style={{ color: 'var(--nmpa-blu...</w:t>
+        <w:br/>
+        <w:t>0877:                                     },</w:t>
+        <w:br/>
+        <w:t>0878:                                     {</w:t>
+        <w:br/>
+        <w:t>0879:                                       title: t('complaintsMessage'),</w:t>
+        <w:br/>
+        <w:t>0880:                                       dataIndex: 'message',</w:t>
+        <w:br/>
+        <w:t>0881:                                       key: 'message',</w:t>
+        <w:br/>
+        <w:t>0882:                                       width: '35%',</w:t>
+        <w:br/>
+        <w:t>0883:                                       render: (message) =&gt; &lt;GrievanceDetailsCell message={messag...</w:t>
+        <w:br/>
+        <w:t>0884:                                     },</w:t>
+        <w:br/>
+        <w:t>0885:                                     {</w:t>
+        <w:br/>
+        <w:t>0886:                                       title: 'SLA Status',</w:t>
+        <w:br/>
+        <w:t>0887:                                       dataIndex: 'sla_status',</w:t>
+        <w:br/>
+        <w:t>0888:                                       key: 'sla_status',</w:t>
+        <w:br/>
+        <w:t>0889:                                       width: '10%',</w:t>
+        <w:br/>
+        <w:t>0890:                                       render: (status) =&gt; {</w:t>
+        <w:br/>
+        <w:t>0891:                                         if (status === 'SLA Breached') return &lt;Tag color="red" s...</w:t>
+        <w:br/>
+        <w:t>0892:                                         if (status === 'Under Investigation') return &lt;Tag color=...</w:t>
+        <w:br/>
+        <w:t>0893:                                         if (status === 'Resolved') return &lt;Tag color="green" sty...</w:t>
+        <w:br/>
+        <w:t>0894:                                         return &lt;Tag color="blue" style={{ fontWeight: 'bold' }}&gt;...</w:t>
+        <w:br/>
+        <w:t>0895:                                       }</w:t>
+        <w:br/>
+        <w:t>0896:                                     },</w:t>
+        <w:br/>
+        <w:t>0897:                                     {</w:t>
+        <w:br/>
+        <w:t>0898:                                       title: 'SLA Timeline',</w:t>
+        <w:br/>
+        <w:t>0899:                                       key: 'sla_timeline',</w:t>
+        <w:br/>
+        <w:t>0900:                                       width: '10%',</w:t>
       </w:r>
     </w:p>
     <w:p>
@@ -18736,293 +18736,424 @@
           <w:color w:val="000000"/>
           <w:sz w:val="17"/>
         </w:rPr>
-        <w:t>0901:                           &lt;div style={{ marginTop: '15px' }}&gt;</w:t>
-        <w:br/>
-        <w:t>0902:                             &lt;Title level={4} style={{ marginBottom: '20px', color: '#d9534f' }}&gt;</w:t>
-        <w:br/>
-        <w:t>0903:                               ⚠️ Secure Chairman's Office Inbox (Direct Escalations)</w:t>
-        <w:br/>
-        <w:t>0904:                             &lt;/Title&gt;</w:t>
-        <w:br/>
-        <w:t>0905:                             &lt;Table</w:t>
-        <w:br/>
-        <w:t>0906:                               dataSource={chairmanComplaints}</w:t>
-        <w:br/>
-        <w:t>0907:                               loading={loading}</w:t>
-        <w:br/>
-        <w:t>0908:                               rowKey="id"</w:t>
-        <w:br/>
-        <w:t>0909:                               pagination={{ pageSize: 6 }}</w:t>
-        <w:br/>
-        <w:t>0910:                               bordered</w:t>
-        <w:br/>
-        <w:t>0911:                               columns={[</w:t>
-        <w:br/>
-        <w:t>0912:                                  {</w:t>
-        <w:br/>
-        <w:t>0913:                                    title: 'Escalation Timestamp',</w:t>
-        <w:br/>
-        <w:t>0914:                                    dataIndex: 'date',</w:t>
-        <w:br/>
-        <w:t>0915:                                    key: 'date',</w:t>
-        <w:br/>
-        <w:t>0916:                                    width: '15%',</w:t>
-        <w:br/>
-        <w:t>0917:                                    render: (date) =&gt; date ? new Date(date).toLocaleString() : '—'</w:t>
-        <w:br/>
-        <w:t>0918:                                  },</w:t>
-        <w:br/>
-        <w:t>0919:                                  {</w:t>
-        <w:br/>
-        <w:t>0920:                                    title: 'Complainant Email',</w:t>
-        <w:br/>
-        <w:t>0921:                                    dataIndex: 'email',</w:t>
-        <w:br/>
-        <w:t>0922:                                    key: 'email',</w:t>
-        <w:br/>
-        <w:t>0923:                                    width: '18%',</w:t>
-        <w:br/>
-        <w:t>0924:                                    render: (email) =&gt; &lt;Text strong&gt;{email}&lt;/Text&gt;</w:t>
-        <w:br/>
-        <w:t>0925:                                  },</w:t>
-        <w:br/>
-        <w:t>0926:                                  {</w:t>
-        <w:br/>
-        <w:t>0927:                                    title: 'Category',</w:t>
-        <w:br/>
-        <w:t>0928:                                    key: 'category_cell',</w:t>
-        <w:br/>
-        <w:t>0929:                                    width: '18%',</w:t>
-        <w:br/>
-        <w:t>0930:                                    render: (_, record) =&gt; {</w:t>
-        <w:br/>
-        <w:t>0931:                                      const categoryText = record.category || record.subject;</w:t>
-        <w:br/>
-        <w:t>0932:                                      return categoryText ? (</w:t>
-        <w:br/>
-        <w:t>0933:                                        &lt;Tag color="red" style={{ fontWeight: 'bold' }}&gt;</w:t>
-        <w:br/>
-        <w:t>0934:                                          {categoryText.toUpperCase()}</w:t>
-        <w:br/>
-        <w:t>0935:                                        &lt;/Tag&gt;</w:t>
-        <w:br/>
-        <w:t>0936:                                      ) : '—';</w:t>
-        <w:br/>
-        <w:t>0937:                                    }</w:t>
-        <w:br/>
-        <w:t>0938:                                  },</w:t>
-        <w:br/>
-        <w:t>0939:                                  {</w:t>
-        <w:br/>
-        <w:t>0940:                                    title: 'Severity',</w:t>
-        <w:br/>
-        <w:t>0941:                                    dataIndex: 'severity_level',</w:t>
-        <w:br/>
-        <w:t>0942:                                    key: 'severity_level',</w:t>
-        <w:br/>
-        <w:t>0943:                                    width: '14%',</w:t>
-        <w:br/>
-        <w:t>0944:                                    render: (severity) =&gt; {</w:t>
-        <w:br/>
-        <w:t>0945:                                      let color = 'orange';</w:t>
-        <w:br/>
-        <w:t>0946:                                      if (severity === 'Critical') color = 'red';</w:t>
-        <w:br/>
-        <w:t>0947:                                      if (severity === 'High') color = 'volcano';</w:t>
-        <w:br/>
-        <w:t>0948:                                      if (severity === 'Low') color = 'blue';</w:t>
-        <w:br/>
-        <w:t>0949:                                      return &lt;Tag color={color} style={{ fontWeight: 'bold' }}&gt;{s...</w:t>
-        <w:br/>
-        <w:t>0950:                                    }</w:t>
-        <w:br/>
-        <w:t>0951:                                  },</w:t>
-        <w:br/>
-        <w:t>0952:                                  {</w:t>
-        <w:br/>
-        <w:t>0953:                                    title: 'Confidential Description',</w:t>
-        <w:br/>
-        <w:t>0954:                                    key: 'description_cell',</w:t>
-        <w:br/>
-        <w:t>0955:                                    width: '35%',</w:t>
-        <w:br/>
-        <w:t>0956:                                    render: (_, record) =&gt; {</w:t>
-        <w:br/>
-        <w:t>0957:                                      const text = record.description || record.message;</w:t>
-        <w:br/>
-        <w:t>0958:                                      return &lt;GrievanceDetailsCell message={text} isConfidential=...</w:t>
-        <w:br/>
-        <w:t>0959:                                    }</w:t>
-        <w:br/>
-        <w:t>0960:                                  }</w:t>
-        <w:br/>
-        <w:t>0961:                               ]}</w:t>
-        <w:br/>
-        <w:t>0962:                             /&gt;</w:t>
-        <w:br/>
-        <w:t>0963:                           &lt;/div&gt;</w:t>
-        <w:br/>
-        <w:t>0964:                         )</w:t>
-        <w:br/>
-        <w:t>0965:                       }</w:t>
-        <w:br/>
-        <w:t>0966:                     ]}</w:t>
-        <w:br/>
-        <w:t>0967:                   /&gt;</w:t>
-        <w:br/>
-        <w:t>0968:                 &lt;/div&gt;</w:t>
-        <w:br/>
-        <w:t>0969:               )</w:t>
-        <w:br/>
-        <w:t>0970:             }</w:t>
-        <w:br/>
-        <w:t>0971:           ]}</w:t>
-        <w:br/>
-        <w:t>0972:         /&gt;</w:t>
-        <w:br/>
-        <w:t>0973:       &lt;/Card&gt;</w:t>
-        <w:br/>
-        <w:t xml:space="preserve">0974: </w:t>
-        <w:br/>
-        <w:t>0975:       {/* User Creation Modal */}</w:t>
-        <w:br/>
-        <w:t>0976:       &lt;Modal</w:t>
-        <w:br/>
-        <w:t>0977:         title={</w:t>
-        <w:br/>
-        <w:t>0978:           &lt;Title level={4} style={{ margin: 0 }}&gt;</w:t>
-        <w:br/>
-        <w:t>0979:             {language === 'en' ? 'Create New Platform Operator Account' : 'नया प्लेटफॉर्म ऑपरेटर...</w:t>
-        <w:br/>
-        <w:t>0980:           &lt;/Title&gt;</w:t>
-        <w:br/>
-        <w:t>0981:         }</w:t>
-        <w:br/>
-        <w:t>0982:         open={isAddUserOpen}</w:t>
-        <w:br/>
-        <w:t>0983:         onCancel={() =&gt; {</w:t>
-        <w:br/>
-        <w:t>0984:           setIsAddUserOpen(false);</w:t>
-        <w:br/>
-        <w:t>0985:           createUserForm.resetFields();</w:t>
-        <w:br/>
-        <w:t>0986:         }}</w:t>
-        <w:br/>
-        <w:t>0987:         footer={null}</w:t>
-        <w:br/>
-        <w:t>0988:         destroyOnClose</w:t>
-        <w:br/>
-        <w:t>0989:       &gt;</w:t>
-        <w:br/>
-        <w:t>0990:         &lt;Form</w:t>
-        <w:br/>
-        <w:t>0991:           form={createUserForm}</w:t>
-        <w:br/>
-        <w:t>0992:           layout="vertical"</w:t>
-        <w:br/>
-        <w:t>0993:           onFinish={handleCreateUser}</w:t>
-        <w:br/>
-        <w:t>0994:           style={{ marginTop: '20px' }}</w:t>
-        <w:br/>
-        <w:t>0995:         &gt;</w:t>
-        <w:br/>
-        <w:t>0996:           &lt;Form.Item</w:t>
-        <w:br/>
-        <w:t>0997:             name="username"</w:t>
-        <w:br/>
-        <w:t>0998:             label={language === 'en' ? 'Operator Username' : 'ऑपरेटर उपयोगकर्ता नाम'}</w:t>
-        <w:br/>
-        <w:t>0999:             rules={[</w:t>
-        <w:br/>
-        <w:t>1000:               { required: true, message: language === 'en' ? 'Username is mandatory' : 'उपयोगकर्...</w:t>
-        <w:br/>
-        <w:t>1001:               { pattern: /^[a-zA-Z0-9_]{4,}$/, message: language === 'en' ? 'Username must be at...</w:t>
-        <w:br/>
-        <w:t>1002:             ]}</w:t>
-        <w:br/>
-        <w:t>1003:           &gt;</w:t>
-        <w:br/>
-        <w:t>1004:             &lt;Input placeholder="Enter unique username" /&gt;</w:t>
-        <w:br/>
-        <w:t>1005:           &lt;/Form.Item&gt;</w:t>
-        <w:br/>
-        <w:t>1006:           &lt;Form.Item name="email" label={language === 'en' ? 'Operator Official Email Address' :...</w:t>
-        <w:br/>
-        <w:t>1007:             &lt;Input placeholder="e.g. name@nmpa.gov" /&gt;</w:t>
-        <w:br/>
-        <w:t>1008:           &lt;/Form.Item&gt;</w:t>
-        <w:br/>
-        <w:t>1009:           &lt;Form.Item</w:t>
-        <w:br/>
-        <w:t>1010:             name="password"</w:t>
-        <w:br/>
-        <w:t>1011:             label={language === 'en' ? 'Temporary Password Passphrase' : 'अस्थायी पासवर्ड पासफ़्...</w:t>
-        <w:br/>
-        <w:t>1012:             rules={[</w:t>
-        <w:br/>
-        <w:t>1013:               { required: true, message: language === 'en' ? 'Password is mandatory' : 'पासवर्ड ...</w:t>
-        <w:br/>
-        <w:t>1014:               { pattern: /^(?=.*[a-z])(?=.*[A-Z])(?=.*\d)(?=.*[@$!%*?&amp;])[A-Za-z\d@$!%*?&amp;]{8,}$/,...</w:t>
-        <w:br/>
-        <w:t>1015:             ]}</w:t>
-        <w:br/>
-        <w:t>1016:           &gt;</w:t>
-        <w:br/>
-        <w:t>1017:             &lt;Input.Password placeholder="e.g. TempPass@123" /&gt;</w:t>
-        <w:br/>
-        <w:t>1018:           &lt;/Form.Item&gt;</w:t>
-        <w:br/>
-        <w:t xml:space="preserve">1019: </w:t>
-        <w:br/>
-        <w:t>1020:           {/* Select dropdown restricting strictly to roles in user config array */}</w:t>
-        <w:br/>
-        <w:t>1021:           &lt;Form.Item name="role" label={t('roleLabelTbl')} rules={[{ required: true, message: la...</w:t>
-        <w:br/>
-        <w:t>1022:             &lt;Select placeholder="Assign access authorization level"&gt;</w:t>
-        <w:br/>
-        <w:t>1023:               &lt;Option value="Admin"&gt;{t('system_admin')}&lt;/Option&gt;</w:t>
-        <w:br/>
-        <w:t>1024:               &lt;Option value="Inspector"&gt;{t('inspector')}&lt;/Option&gt;</w:t>
-        <w:br/>
-        <w:t>1025:               &lt;Option value="Approver"&gt;{t('port_authority')}&lt;/Option&gt;</w:t>
-        <w:br/>
-        <w:t>1026:             &lt;/Select&gt;</w:t>
-        <w:br/>
-        <w:t>1027:           &lt;/Form.Item&gt;</w:t>
-        <w:br/>
-        <w:t xml:space="preserve">1028: </w:t>
-        <w:br/>
-        <w:t>1029:           &lt;Form.Item style={{ textAlign: 'right', marginTop: '30px', marginBottom: 0 }}&gt;</w:t>
-        <w:br/>
-        <w:t>1030:             &lt;Button style={{ marginRight: '8px' }} onClick={() =&gt; setIsAddUserOpen(false)}&gt;</w:t>
-        <w:br/>
-        <w:t>1031:               {t('cancel')}</w:t>
-        <w:br/>
-        <w:t>1032:             &lt;/Button&gt;</w:t>
-        <w:br/>
-        <w:t>1033:             &lt;Button type="primary" htmlType="submit" loading={loadingAction === 'create'}&gt;</w:t>
-        <w:br/>
-        <w:t>1034:               {language === 'en' ? 'Register Access Identity' : 'पहुंच पहचान पंजीकृत करें'}</w:t>
-        <w:br/>
-        <w:t>1035:             &lt;/Button&gt;</w:t>
-        <w:br/>
-        <w:t>1036:           &lt;/Form.Item&gt;</w:t>
-        <w:br/>
-        <w:t>1037:         &lt;/Form&gt;</w:t>
-        <w:br/>
-        <w:t>1038:       &lt;/Modal&gt;</w:t>
-        <w:br/>
-        <w:t xml:space="preserve">1039: </w:t>
-        <w:br/>
-        <w:t>1040:     &lt;/div&gt;</w:t>
-        <w:br/>
-        <w:t>1041:   );</w:t>
-        <w:br/>
-        <w:t>1042: };</w:t>
-        <w:br/>
-        <w:t xml:space="preserve">1043: </w:t>
-        <w:br/>
-        <w:t>1044: export default SystemAdmin;</w:t>
+        <w:t>0901:                                       render: (_, record) =&gt; {</w:t>
+        <w:br/>
+        <w:t>0902:                                         if (record.sla_status === 'Pending') {</w:t>
+        <w:br/>
+        <w:t>0903:                                           return (</w:t>
+        <w:br/>
+        <w:t>0904:                                             &lt;SlaCountdown</w:t>
+        <w:br/>
+        <w:t>0905:                                               deadline={record.sla_deadline}</w:t>
+        <w:br/>
+        <w:t>0906:                                               onExpired={() =&gt; {</w:t>
+        <w:br/>
+        <w:t>0907:                                                 fetchAll();</w:t>
+        <w:br/>
+        <w:t>0908:                                               }}</w:t>
+        <w:br/>
+        <w:t>0909:                                             /&gt;</w:t>
+        <w:br/>
+        <w:t>0910:                                           );</w:t>
+        <w:br/>
+        <w:t>0911:                                         }</w:t>
+        <w:br/>
+        <w:t>0912:                                         if (record.sla_status === 'SLA Breached') {</w:t>
+        <w:br/>
+        <w:t>0913:                                           return &lt;span style={{ color: '#d9534f', fontWeight: 'b...</w:t>
+        <w:br/>
+        <w:t>0914:                                         }</w:t>
+        <w:br/>
+        <w:t>0915:                                         return &lt;Tag color="success"&gt;SLA Met&lt;/Tag&gt;;</w:t>
+        <w:br/>
+        <w:t>0916:                                       }</w:t>
+        <w:br/>
+        <w:t>0917:                                     },</w:t>
+        <w:br/>
+        <w:t>0918:                                     {</w:t>
+        <w:br/>
+        <w:t>0919:                                       title: 'Actions',</w:t>
+        <w:br/>
+        <w:t>0920:                                       key: 'actions',</w:t>
+        <w:br/>
+        <w:t>0921:                                       width: '10%',</w:t>
+        <w:br/>
+        <w:t>0922:                                       render: (_, record) =&gt; {</w:t>
+        <w:br/>
+        <w:t>0923:                                         if (record.sla_status === 'Resolved') return null;</w:t>
+        <w:br/>
+        <w:t>0924:                                         return (</w:t>
+        <w:br/>
+        <w:t>0925:                                           &lt;Space size="small"&gt;</w:t>
+        <w:br/>
+        <w:t>0926:                                             {record.sla_status === 'Pending' &amp;&amp; (</w:t>
+        <w:br/>
+        <w:t>0927:                                               &lt;Button</w:t>
+        <w:br/>
+        <w:t>0928:                                                 type="primary"</w:t>
+        <w:br/>
+        <w:t>0929:                                                 size="small"</w:t>
+        <w:br/>
+        <w:t>0930:                                                 onClick={() =&gt; handleUpdateStatus(record.id, 'Un...</w:t>
+        <w:br/>
+        <w:t>0931:                                               &gt;</w:t>
+        <w:br/>
+        <w:t>0932:                                                 Investigate</w:t>
+        <w:br/>
+        <w:t>0933:                                               &lt;/Button&gt;</w:t>
+        <w:br/>
+        <w:t>0934:                                             )}</w:t>
+        <w:br/>
+        <w:t>0935:                                             {(record.sla_status === 'Pending' || record.sla_stat...</w:t>
+        <w:br/>
+        <w:t>0936:                                               &lt;Button</w:t>
+        <w:br/>
+        <w:t>0937:                                                 type="primary"</w:t>
+        <w:br/>
+        <w:t>0938:                                                 danger</w:t>
+        <w:br/>
+        <w:t>0939:                                                 size="small"</w:t>
+        <w:br/>
+        <w:t>0940:                                                 onClick={() =&gt; handleUpdateStatus(record.id, 'Re...</w:t>
+        <w:br/>
+        <w:t>0941:                                                 style={{ backgroundColor: '#2e7d32', borderColor...</w:t>
+        <w:br/>
+        <w:t>0942:                                               &gt;</w:t>
+        <w:br/>
+        <w:t>0943:                                                 Resolve</w:t>
+        <w:br/>
+        <w:t>0944:                                               &lt;/Button&gt;</w:t>
+        <w:br/>
+        <w:t>0945:                                             )}</w:t>
+        <w:br/>
+        <w:t>0946:                                           &lt;/Space&gt;</w:t>
+        <w:br/>
+        <w:t>0947:                                         );</w:t>
+        <w:br/>
+        <w:t>0948:                                       }</w:t>
+        <w:br/>
+        <w:t>0949:                                     }</w:t>
+        <w:br/>
+        <w:t>0950:                                   ]}</w:t>
+        <w:br/>
+        <w:t>0951:                                 /&gt;</w:t>
+        <w:br/>
+        <w:t>0952:                               );</w:t>
+        <w:br/>
+        <w:t>0953:                             })()}</w:t>
+        <w:br/>
+        <w:t>0954:                           &lt;/div&gt;</w:t>
+        <w:br/>
+        <w:t>0955:                         )</w:t>
+        <w:br/>
+        <w:t>0956:                       },</w:t>
+        <w:br/>
+        <w:t>0957:                       {</w:t>
+        <w:br/>
+        <w:t>0958:                         key: 'chairman',</w:t>
+        <w:br/>
+        <w:t>0959:                         label: '⚠️ Secure Chairman\'s Office Inbox',</w:t>
+        <w:br/>
+        <w:t>0960:                         children: (</w:t>
+        <w:br/>
+        <w:t>0961:                           &lt;div style={{ marginTop: '15px' }}&gt;</w:t>
+        <w:br/>
+        <w:t>0962:                             &lt;Title level={4} style={{ marginBottom: '20px', color: '#d9534f' }}&gt;</w:t>
+        <w:br/>
+        <w:t>0963:                               ⚠️ Secure Chairman's Office Inbox (Direct Escalations)</w:t>
+        <w:br/>
+        <w:t>0964:                             &lt;/Title&gt;</w:t>
+        <w:br/>
+        <w:t>0965:                             &lt;Table</w:t>
+        <w:br/>
+        <w:t>0966:                               dataSource={chairmanComplaints}</w:t>
+        <w:br/>
+        <w:t>0967:                               loading={loading}</w:t>
+        <w:br/>
+        <w:t>0968:                               rowKey="id"</w:t>
+        <w:br/>
+        <w:t>0969:                               pagination={{ pageSize: 6 }}</w:t>
+        <w:br/>
+        <w:t>0970:                               bordered</w:t>
+        <w:br/>
+        <w:t>0971:                               columns={[</w:t>
+        <w:br/>
+        <w:t>0972:                                  {</w:t>
+        <w:br/>
+        <w:t>0973:                                    title: 'Escalation Timestamp',</w:t>
+        <w:br/>
+        <w:t>0974:                                    dataIndex: 'date',</w:t>
+        <w:br/>
+        <w:t>0975:                                    key: 'date',</w:t>
+        <w:br/>
+        <w:t>0976:                                    width: '15%',</w:t>
+        <w:br/>
+        <w:t>0977:                                    render: (date) =&gt; date ? new Date(date).toLocaleString() : '—'</w:t>
+        <w:br/>
+        <w:t>0978:                                  },</w:t>
+        <w:br/>
+        <w:t>0979:                                  {</w:t>
+        <w:br/>
+        <w:t>0980:                                    title: 'Complainant Email',</w:t>
+        <w:br/>
+        <w:t>0981:                                    dataIndex: 'email',</w:t>
+        <w:br/>
+        <w:t>0982:                                    key: 'email',</w:t>
+        <w:br/>
+        <w:t>0983:                                    width: '18%',</w:t>
+        <w:br/>
+        <w:t>0984:                                    render: (email) =&gt; &lt;Text strong&gt;{email}&lt;/Text&gt;</w:t>
+        <w:br/>
+        <w:t>0985:                                  },</w:t>
+        <w:br/>
+        <w:t>0986:                                  {</w:t>
+        <w:br/>
+        <w:t>0987:                                    title: 'Category',</w:t>
+        <w:br/>
+        <w:t>0988:                                    key: 'category_cell',</w:t>
+        <w:br/>
+        <w:t>0989:                                    width: '18%',</w:t>
+        <w:br/>
+        <w:t>0990:                                    render: (_, record) =&gt; {</w:t>
+        <w:br/>
+        <w:t>0991:                                      const categoryText = record.category || record.subject;</w:t>
+        <w:br/>
+        <w:t>0992:                                      return categoryText ? (</w:t>
+        <w:br/>
+        <w:t>0993:                                        &lt;Tag color="red" style={{ fontWeight: 'bold' }}&gt;</w:t>
+        <w:br/>
+        <w:t>0994:                                          {categoryText.toUpperCase()}</w:t>
+        <w:br/>
+        <w:t>0995:                                        &lt;/Tag&gt;</w:t>
+        <w:br/>
+        <w:t>0996:                                      ) : '—';</w:t>
+        <w:br/>
+        <w:t>0997:                                    }</w:t>
+        <w:br/>
+        <w:t>0998:                                  },</w:t>
+        <w:br/>
+        <w:t>0999:                                  {</w:t>
+        <w:br/>
+        <w:t>1000:                                    title: 'Severity',</w:t>
+        <w:br/>
+        <w:t>1001:                                    dataIndex: 'severity_level',</w:t>
+        <w:br/>
+        <w:t>1002:                                    key: 'severity_level',</w:t>
+        <w:br/>
+        <w:t>1003:                                    width: '14%',</w:t>
+        <w:br/>
+        <w:t>1004:                                    render: (severity) =&gt; {</w:t>
+        <w:br/>
+        <w:t>1005:                                      let color = 'orange';</w:t>
+        <w:br/>
+        <w:t>1006:                                      if (severity === 'Critical') color = 'red';</w:t>
+        <w:br/>
+        <w:t>1007:                                      if (severity === 'High') color = 'volcano';</w:t>
+        <w:br/>
+        <w:t>1008:                                      if (severity === 'Low') color = 'blue';</w:t>
+        <w:br/>
+        <w:t>1009:                                      return &lt;Tag color={color} style={{ fontWeight: 'bold' }}&gt;{s...</w:t>
+        <w:br/>
+        <w:t>1010:                                    }</w:t>
+        <w:br/>
+        <w:t>1011:                                  },</w:t>
+        <w:br/>
+        <w:t>1012:                                  {</w:t>
+        <w:br/>
+        <w:t>1013:                                    title: 'Confidential Description',</w:t>
+        <w:br/>
+        <w:t>1014:                                    key: 'description_cell',</w:t>
+        <w:br/>
+        <w:t>1015:                                    width: '35%',</w:t>
+        <w:br/>
+        <w:t>1016:                                    render: (_, record) =&gt; {</w:t>
+        <w:br/>
+        <w:t>1017:                                      const text = record.description || record.message;</w:t>
+        <w:br/>
+        <w:t>1018:                                      return &lt;GrievanceDetailsCell message={text} isConfidential=...</w:t>
+        <w:br/>
+        <w:t>1019:                                    }</w:t>
+        <w:br/>
+        <w:t>1020:                                  }</w:t>
+        <w:br/>
+        <w:t>1021:                               ]}</w:t>
+        <w:br/>
+        <w:t>1022:                             /&gt;</w:t>
+        <w:br/>
+        <w:t>1023:                           &lt;/div&gt;</w:t>
+        <w:br/>
+        <w:t>1024:                         )</w:t>
+        <w:br/>
+        <w:t>1025:                       }</w:t>
+        <w:br/>
+        <w:t>1026:                     ]}</w:t>
+        <w:br/>
+        <w:t>1027:                   /&gt;</w:t>
+        <w:br/>
+        <w:t>1028:                 &lt;/div&gt;</w:t>
+        <w:br/>
+        <w:t>1029:               )</w:t>
+        <w:br/>
+        <w:t>1030:             }</w:t>
+        <w:br/>
+        <w:t>1031:           ]}</w:t>
+        <w:br/>
+        <w:t>1032:         /&gt;</w:t>
+        <w:br/>
+        <w:t>1033:       &lt;/Card&gt;</w:t>
+        <w:br/>
+        <w:t xml:space="preserve">1034: </w:t>
+        <w:br/>
+        <w:t>1035:       {/* User Creation Modal */}</w:t>
+        <w:br/>
+        <w:t>1036:       &lt;Modal</w:t>
+        <w:br/>
+        <w:t>1037:         title={</w:t>
+        <w:br/>
+        <w:t>1038:           &lt;Title level={4} style={{ margin: 0 }}&gt;</w:t>
+        <w:br/>
+        <w:t>1039:             {language === 'en' ? 'Create New Platform Operator Account' : 'नया प्लेटफॉर्म ऑपरेटर...</w:t>
+        <w:br/>
+        <w:t>1040:           &lt;/Title&gt;</w:t>
+        <w:br/>
+        <w:t>1041:         }</w:t>
+        <w:br/>
+        <w:t>1042:         open={isAddUserOpen}</w:t>
+        <w:br/>
+        <w:t>1043:         onCancel={() =&gt; {</w:t>
+        <w:br/>
+        <w:t>1044:           setIsAddUserOpen(false);</w:t>
+        <w:br/>
+        <w:t>1045:           createUserForm.resetFields();</w:t>
+        <w:br/>
+        <w:t>1046:         }}</w:t>
+        <w:br/>
+        <w:t>1047:         footer={null}</w:t>
+        <w:br/>
+        <w:t>1048:         destroyOnClose</w:t>
+        <w:br/>
+        <w:t>1049:       &gt;</w:t>
+        <w:br/>
+        <w:t>1050:         &lt;Form</w:t>
+      </w:r>
+    </w:p>
+    <w:p>
+      <w:pPr>
+        <w:spacing w:before="0" w:after="40" w:line="240" w:lineRule="auto"/>
+      </w:pPr>
+      <w:r>
+        <w:rPr>
+          <w:rFonts w:ascii="Courier New" w:hAnsi="Courier New"/>
+          <w:color w:val="000000"/>
+          <w:sz w:val="17"/>
+        </w:rPr>
+        <w:t>1051:           form={createUserForm}</w:t>
+        <w:br/>
+        <w:t>1052:           layout="vertical"</w:t>
+        <w:br/>
+        <w:t>1053:           onFinish={handleCreateUser}</w:t>
+        <w:br/>
+        <w:t>1054:           style={{ marginTop: '20px' }}</w:t>
+        <w:br/>
+        <w:t>1055:         &gt;</w:t>
+        <w:br/>
+        <w:t>1056:           &lt;Form.Item</w:t>
+        <w:br/>
+        <w:t>1057:             name="username"</w:t>
+        <w:br/>
+        <w:t>1058:             label={language === 'en' ? 'Operator Username' : 'ऑपरेटर उपयोगकर्ता नाम'}</w:t>
+        <w:br/>
+        <w:t>1059:             rules={[</w:t>
+        <w:br/>
+        <w:t>1060:               { required: true, message: language === 'en' ? 'Username is mandatory' : 'उपयोगकर्...</w:t>
+        <w:br/>
+        <w:t>1061:               { pattern: /^[a-zA-Z0-9_]{4,}$/, message: language === 'en' ? 'Username must be at...</w:t>
+        <w:br/>
+        <w:t>1062:             ]}</w:t>
+        <w:br/>
+        <w:t>1063:           &gt;</w:t>
+        <w:br/>
+        <w:t>1064:             &lt;Input placeholder="Enter unique username" /&gt;</w:t>
+        <w:br/>
+        <w:t>1065:           &lt;/Form.Item&gt;</w:t>
+        <w:br/>
+        <w:t>1066:           &lt;Form.Item name="email" label={language === 'en' ? 'Operator Official Email Address' :...</w:t>
+        <w:br/>
+        <w:t>1067:             &lt;Input placeholder="e.g. name@nmpa.gov" /&gt;</w:t>
+        <w:br/>
+        <w:t>1068:           &lt;/Form.Item&gt;</w:t>
+        <w:br/>
+        <w:t>1069:           &lt;Form.Item</w:t>
+        <w:br/>
+        <w:t>1070:             name="password"</w:t>
+        <w:br/>
+        <w:t>1071:             label={language === 'en' ? 'Temporary Password Passphrase' : 'अस्थायी पासवर्ड पासफ़्...</w:t>
+        <w:br/>
+        <w:t>1072:             rules={[</w:t>
+        <w:br/>
+        <w:t>1073:               { required: true, message: language === 'en' ? 'Password is mandatory' : 'पासवर्ड ...</w:t>
+        <w:br/>
+        <w:t>1074:               { pattern: /^(?=.*[a-z])(?=.*[A-Z])(?=.*\d)(?=.*[@$!%*?&amp;])[A-Za-z\d@$!%*?&amp;]{8,}$/,...</w:t>
+        <w:br/>
+        <w:t>1075:             ]}</w:t>
+        <w:br/>
+        <w:t>1076:           &gt;</w:t>
+        <w:br/>
+        <w:t>1077:             &lt;Input.Password placeholder="e.g. TempPass@123" /&gt;</w:t>
+        <w:br/>
+        <w:t>1078:           &lt;/Form.Item&gt;</w:t>
+        <w:br/>
+        <w:t xml:space="preserve">1079: </w:t>
+        <w:br/>
+        <w:t>1080:           {/* Select dropdown restricting strictly to roles in user config array */}</w:t>
+        <w:br/>
+        <w:t>1081:           &lt;Form.Item name="role" label={t('roleLabelTbl')} rules={[{ required: true, message: la...</w:t>
+        <w:br/>
+        <w:t>1082:             &lt;Select placeholder="Assign access authorization level"&gt;</w:t>
+        <w:br/>
+        <w:t>1083:               &lt;Option value="Admin"&gt;{t('system_admin')}&lt;/Option&gt;</w:t>
+        <w:br/>
+        <w:t>1084:               &lt;Option value="Inspector"&gt;{t('inspector')}&lt;/Option&gt;</w:t>
+        <w:br/>
+        <w:t>1085:               &lt;Option value="Approver"&gt;{t('port_authority')}&lt;/Option&gt;</w:t>
+        <w:br/>
+        <w:t>1086:             &lt;/Select&gt;</w:t>
+        <w:br/>
+        <w:t>1087:           &lt;/Form.Item&gt;</w:t>
+        <w:br/>
+        <w:t xml:space="preserve">1088: </w:t>
+        <w:br/>
+        <w:t>1089:           &lt;Form.Item style={{ textAlign: 'right', marginTop: '30px', marginBottom: 0 }}&gt;</w:t>
+        <w:br/>
+        <w:t>1090:             &lt;Button style={{ marginRight: '8px' }} onClick={() =&gt; setIsAddUserOpen(false)}&gt;</w:t>
+        <w:br/>
+        <w:t>1091:               {t('cancel')}</w:t>
+        <w:br/>
+        <w:t>1092:             &lt;/Button&gt;</w:t>
+        <w:br/>
+        <w:t>1093:             &lt;Button type="primary" htmlType="submit" loading={loadingAction === 'create'}&gt;</w:t>
+        <w:br/>
+        <w:t>1094:               {language === 'en' ? 'Register Access Identity' : 'पहुंच पहचान पंजीकृत करें'}</w:t>
+        <w:br/>
+        <w:t>1095:             &lt;/Button&gt;</w:t>
+        <w:br/>
+        <w:t>1096:           &lt;/Form.Item&gt;</w:t>
+        <w:br/>
+        <w:t>1097:         &lt;/Form&gt;</w:t>
+        <w:br/>
+        <w:t>1098:       &lt;/Modal&gt;</w:t>
+        <w:br/>
+        <w:t xml:space="preserve">1099: </w:t>
+        <w:br/>
+        <w:t>1100:     &lt;/div&gt;</w:t>
+        <w:br/>
+        <w:t>1101:   );</w:t>
+        <w:br/>
+        <w:t>1102: };</w:t>
+        <w:br/>
+        <w:t xml:space="preserve">1103: </w:t>
+        <w:br/>
+        <w:t>1104: export default SystemAdmin;</w:t>
       </w:r>
     </w:p>
     <w:p>
@@ -22984,197 +23115,197 @@
         <w:br/>
         <w:t>0954:                     &lt;Col span={24}&gt;</w:t>
         <w:br/>
-        <w:t>0955:                       &lt;Card title={t('splitsTitle')} style={{ height: '300px' }}&gt;</w:t>
-        <w:br/>
-        <w:t>0956:                         &lt;div style={{ display: 'flex', flexDirection: 'column', justifyContent: ...</w:t>
-        <w:br/>
-        <w:t>0957:                           &lt;div&gt;</w:t>
-        <w:br/>
-        <w:t>0958:                             &lt;div style={{ display: 'flex', justifyContent: 'space-between', marg...</w:t>
-        <w:br/>
-        <w:t>0959:                               &lt;Text&gt;{t('splitsPcc')}&lt;/Text&gt;</w:t>
-        <w:br/>
-        <w:t>0960:                               &lt;Text strong&gt;{(clearedCount / (clearedCount + detainedCount || 1) ...</w:t>
-        <w:br/>
-        <w:t>0961:                             &lt;/div&gt;</w:t>
-        <w:br/>
-        <w:t>0962:                             &lt;div style={{ width: '100%', height: '12px', background: '#f5f5f5', ...</w:t>
-        <w:br/>
-        <w:t>0963:                               &lt;div style={{ width: `${(clearedCount / (clearedCount + detainedCo...</w:t>
-        <w:br/>
-        <w:t>0964:                             &lt;/div&gt;</w:t>
-        <w:br/>
-        <w:t>0965:                           &lt;/div&gt;</w:t>
-        <w:br/>
-        <w:t xml:space="preserve">0966: </w:t>
-        <w:br/>
-        <w:t>0967:                           &lt;div&gt;</w:t>
-        <w:br/>
-        <w:t>0968:                             &lt;div style={{ display: 'flex', justifyContent: 'space-between', marg...</w:t>
-        <w:br/>
-        <w:t>0969:                               &lt;Text&gt;{t('splitsQdo')}&lt;/Text&gt;</w:t>
-        <w:br/>
-        <w:t>0970:                               &lt;Text strong&gt;{(detainedCount / (clearedCount + detainedCount || 1)...</w:t>
-        <w:br/>
-        <w:t>0971:                             &lt;/div&gt;</w:t>
-        <w:br/>
-        <w:t>0972:                             &lt;div style={{ width: '100%', height: '12px', background: '#f5f5f5', ...</w:t>
-        <w:br/>
-        <w:t>0973:                               &lt;div style={{ width: `${(detainedCount / (clearedCount + detainedC...</w:t>
-        <w:br/>
-        <w:t>0974:                             &lt;/div&gt;</w:t>
-        <w:br/>
-        <w:t>0975:                           &lt;/div&gt;</w:t>
-        <w:br/>
-        <w:t>0976:                         &lt;/div&gt;</w:t>
-        <w:br/>
-        <w:t>0977:                       &lt;/Card&gt;</w:t>
-        <w:br/>
-        <w:t>0978:                     &lt;/Col&gt;</w:t>
-        <w:br/>
-        <w:t>0979:                   &lt;/Row&gt;</w:t>
-        <w:br/>
-        <w:t xml:space="preserve">0980: </w:t>
-        <w:br/>
-        <w:t>0981:                   &lt;Title level={4} style={{ marginBottom: '15px' }}&gt;{t('allVesselLedgerTitle')}&lt;...</w:t>
-        <w:br/>
-        <w:t>0982:                   &lt;Table</w:t>
-        <w:br/>
-        <w:t>0983:                     dataSource={inspectedCargoList}</w:t>
-        <w:br/>
-        <w:t>0984:                     columns={[</w:t>
-        <w:br/>
-        <w:t>0985:                       {</w:t>
-        <w:br/>
-        <w:t>0986:                         title: t('tblBlRef'),</w:t>
-        <w:br/>
-        <w:t>0987:                         dataIndex: 'manifestId',</w:t>
-        <w:br/>
-        <w:t>0988:                         key: 'manifestId',</w:t>
-        <w:br/>
-        <w:t>0989:                         render: (text) =&gt; &lt;Text strong&gt;{text}&lt;/Text&gt;</w:t>
-        <w:br/>
-        <w:t>0990:                       },</w:t>
-        <w:br/>
-        <w:t>0991:                       {</w:t>
-        <w:br/>
-        <w:t>0992:                         title: t('tblVesselName'),</w:t>
-        <w:br/>
-        <w:t>0993:                         dataIndex: 'vesselName',</w:t>
-        <w:br/>
-        <w:t>0994:                         key: 'vesselName',</w:t>
-        <w:br/>
-        <w:t>0995:                       },</w:t>
-        <w:br/>
-        <w:t>0996:                       {</w:t>
-        <w:br/>
-        <w:t>0997:                         title: t('tblCargoType'),</w:t>
-        <w:br/>
-        <w:t>0998:                         dataIndex: 'cargoType',</w:t>
-        <w:br/>
-        <w:t>0999:                         key: 'cargoType',</w:t>
-        <w:br/>
-        <w:t>1000:                       },</w:t>
-        <w:br/>
-        <w:t>1001:                       {</w:t>
-        <w:br/>
-        <w:t>1002:                         title: t('tblRmsMemo'),</w:t>
-        <w:br/>
-        <w:t>1003:                         dataIndex: 'rmsRiskLevel',</w:t>
-        <w:br/>
-        <w:t>1004:                         key: 'rmsRiskLevel',</w:t>
-        <w:br/>
-        <w:t>1005:                         render: (level) =&gt; {</w:t>
-        <w:br/>
-        <w:t>1006:                           let color = 'green';</w:t>
-        <w:br/>
-        <w:t>1007:                           let riskText = level || 'ROUTINE RISK';</w:t>
-        <w:br/>
-        <w:t>1008:                           if (level === 'CRITICAL RISK') { color = 'red'; riskText = t('riskCrit...</w:t>
-        <w:br/>
-        <w:t>1009:                           else if (level === 'ELEVATED RISK') { color = 'orange'; riskText = t('...</w:t>
-        <w:br/>
-        <w:t>1010:                           else if (level === 'ROUTINE RISK') { riskText = t('riskRoutine'); }</w:t>
-        <w:br/>
-        <w:t>1011:                           return &lt;Tag color={color}&gt;{riskText}&lt;/Tag&gt;;</w:t>
-        <w:br/>
-        <w:t>1012:                         }</w:t>
-        <w:br/>
-        <w:t>1013:                       },</w:t>
-        <w:br/>
-        <w:t>1014:                       {</w:t>
-        <w:br/>
-        <w:t>1015:                         title: t('tblStatus'),</w:t>
-        <w:br/>
-        <w:t>1016:                         dataIndex: 'status',</w:t>
-        <w:br/>
-        <w:t>1017:                         key: 'status',</w:t>
-        <w:br/>
-        <w:t>1018:                         render: (status) =&gt; renderStatusTag(status)</w:t>
-        <w:br/>
-        <w:t>1019:                       },</w:t>
-        <w:br/>
-        <w:t>1020:                       {</w:t>
-        <w:br/>
-        <w:t>1021:                         title: t('tblAction'),</w:t>
-        <w:br/>
-        <w:t>1022:                         key: 'action',</w:t>
-        <w:br/>
-        <w:t>1023:                         render: (_, record) =&gt; {</w:t>
-        <w:br/>
-        <w:t>1024:                           const isCleared = record.status === 'Port Clearance Granted' || record...</w:t>
-        <w:br/>
-        <w:t>1025:                           const isDetained = record.status === 'Clearance Denied - Detained for ...</w:t>
-        <w:br/>
-        <w:t xml:space="preserve">1026: </w:t>
-        <w:br/>
-        <w:t>1027:                           if (isCleared) {</w:t>
-        <w:br/>
-        <w:t>1028:                             return (</w:t>
-        <w:br/>
-        <w:t>1029:                               &lt;Button</w:t>
-        <w:br/>
-        <w:t>1030:                                 type="primary"</w:t>
-        <w:br/>
-        <w:t>1031:                                 icon={&lt;PrinterOutlined /&gt;}</w:t>
-        <w:br/>
-        <w:t>1032:                                 size="small"</w:t>
-        <w:br/>
-        <w:t>1033:                                 onClick={() =&gt; printCertificate(record, record.qrToken, null, la...</w:t>
-        <w:br/>
-        <w:t>1034:                                 style={{ backgroundColor: '#52c41a', borderColor: '#52c41a' }}</w:t>
-        <w:br/>
-        <w:t>1035:                               &gt;</w:t>
-        <w:br/>
-        <w:t>1036:                                 {language === 'en' ? 'Print PCC' : 'पीसीसी प्रिंट करें'}</w:t>
-        <w:br/>
-        <w:t>1037:                               &lt;/Button&gt;</w:t>
-        <w:br/>
-        <w:t>1038:                             );</w:t>
-        <w:br/>
-        <w:t>1039:                           } else if (isDetained) {</w:t>
-        <w:br/>
-        <w:t>1040:                             return (</w:t>
-        <w:br/>
-        <w:t>1041:                               &lt;Button</w:t>
-        <w:br/>
-        <w:t>1042:                                 type="primary"</w:t>
-        <w:br/>
-        <w:t>1043:                                 danger</w:t>
-        <w:br/>
-        <w:t>1044:                                 icon={&lt;PrinterOutlined /&gt;}</w:t>
-        <w:br/>
-        <w:t>1045:                                 size="small"</w:t>
-        <w:br/>
-        <w:t>1046:                                 onClick={() =&gt; printCertificate(record, record.qrToken, null, la...</w:t>
-        <w:br/>
-        <w:t>1047:                               &gt;</w:t>
-        <w:br/>
-        <w:t>1048:                                 {language === 'en' ? 'Print QDO' : 'क्यूडीओ प्रिंट करें'}</w:t>
-        <w:br/>
-        <w:t>1049:                               &lt;/Button&gt;</w:t>
-        <w:br/>
-        <w:t>1050:                             );</w:t>
+        <w:t>0955:                       &lt;Card title={t('splitsTitle')} style={{ height: '320px' }}&gt;</w:t>
+        <w:br/>
+        <w:t>0956:                         &lt;div style={{ display: 'flex', alignItems: 'center', justifyContent: 'sp...</w:t>
+        <w:br/>
+        <w:t>0957:                           {/* SVG Donut Chart */}</w:t>
+        <w:br/>
+        <w:t>0958:                           &lt;div style={{ position: 'relative', width: '160px', height: '160px' }}&gt;</w:t>
+        <w:br/>
+        <w:t>0959:                             &lt;svg width="160" height="160" viewBox="0 0 120 120" style={{ transfo...</w:t>
+        <w:br/>
+        <w:t>0960:                               &lt;circle</w:t>
+        <w:br/>
+        <w:t>0961:                                 cx="60"</w:t>
+        <w:br/>
+        <w:t>0962:                                 cy="60"</w:t>
+        <w:br/>
+        <w:t>0963:                                 r="48"</w:t>
+        <w:br/>
+        <w:t>0964:                                 fill="transparent"</w:t>
+        <w:br/>
+        <w:t>0965:                                 stroke="#f5f5f5"</w:t>
+        <w:br/>
+        <w:t>0966:                                 strokeWidth="12"</w:t>
+        <w:br/>
+        <w:t>0967:                               /&gt;</w:t>
+        <w:br/>
+        <w:t>0968:                               {(clearedCount + detainedCount) &gt; 0 ? (</w:t>
+        <w:br/>
+        <w:t>0969:                                 &lt;&gt;</w:t>
+        <w:br/>
+        <w:t>0970:                                   &lt;circle</w:t>
+        <w:br/>
+        <w:t>0971:                                     cx="60"</w:t>
+        <w:br/>
+        <w:t>0972:                                     cy="60"</w:t>
+        <w:br/>
+        <w:t>0973:                                     r="48"</w:t>
+        <w:br/>
+        <w:t>0974:                                     fill="transparent"</w:t>
+        <w:br/>
+        <w:t>0975:                                     stroke="#52c41a"</w:t>
+        <w:br/>
+        <w:t>0976:                                     strokeWidth="12"</w:t>
+        <w:br/>
+        <w:t>0977:                                     strokeDasharray={`${(clearedCount / (clearedCount + detained...</w:t>
+        <w:br/>
+        <w:t>0978:                                     strokeLinecap="round"</w:t>
+        <w:br/>
+        <w:t>0979:                                   /&gt;</w:t>
+        <w:br/>
+        <w:t>0980:                                   &lt;circle</w:t>
+        <w:br/>
+        <w:t>0981:                                     cx="60"</w:t>
+        <w:br/>
+        <w:t>0982:                                     cy="60"</w:t>
+        <w:br/>
+        <w:t>0983:                                     r="48"</w:t>
+        <w:br/>
+        <w:t>0984:                                     fill="transparent"</w:t>
+        <w:br/>
+        <w:t>0985:                                     stroke="#ff4d4f"</w:t>
+        <w:br/>
+        <w:t>0986:                                     strokeWidth="12"</w:t>
+        <w:br/>
+        <w:t>0987:                                     strokeDasharray={`${(detainedCount / (clearedCount + detaine...</w:t>
+        <w:br/>
+        <w:t>0988:                                     strokeDashoffset={-((clearedCount / (clearedCount + detained...</w:t>
+        <w:br/>
+        <w:t>0989:                                     strokeLinecap="round"</w:t>
+        <w:br/>
+        <w:t>0990:                                   /&gt;</w:t>
+        <w:br/>
+        <w:t>0991:                                 &lt;/&gt;</w:t>
+        <w:br/>
+        <w:t>0992:                               ) : null}</w:t>
+        <w:br/>
+        <w:t>0993:                             &lt;/svg&gt;</w:t>
+        <w:br/>
+        <w:t>0994:                             &lt;div style={{</w:t>
+        <w:br/>
+        <w:t>0995:                               position: 'absolute',</w:t>
+        <w:br/>
+        <w:t>0996:                               top: 0,</w:t>
+        <w:br/>
+        <w:t>0997:                               left: 0,</w:t>
+        <w:br/>
+        <w:t>0998:                               width: '160px',</w:t>
+        <w:br/>
+        <w:t>0999:                               height: '160px',</w:t>
+        <w:br/>
+        <w:t>1000:                               display: 'flex',</w:t>
+        <w:br/>
+        <w:t>1001:                               flexDirection: 'column',</w:t>
+        <w:br/>
+        <w:t>1002:                               alignItems: 'center',</w:t>
+        <w:br/>
+        <w:t>1003:                               justifyContent: 'center'</w:t>
+        <w:br/>
+        <w:t>1004:                             }}&gt;</w:t>
+        <w:br/>
+        <w:t>1005:                               &lt;Text style={{ fontSize: '20px', fontWeight: 'bold', margin: 0, co...</w:t>
+        <w:br/>
+        <w:t>1006:                                 {clearedCount + detainedCount}</w:t>
+        <w:br/>
+        <w:t>1007:                               &lt;/Text&gt;</w:t>
+        <w:br/>
+        <w:t>1008:                               &lt;Text style={{ fontSize: '10px', color: '#8c8c8c', margin: 0 }}&gt;</w:t>
+        <w:br/>
+        <w:t>1009:                                 {language === 'en' ? 'Total Actions' : 'कुल गतिविधियां'}</w:t>
+        <w:br/>
+        <w:t>1010:                               &lt;/Text&gt;</w:t>
+        <w:br/>
+        <w:t>1011:                             &lt;/div&gt;</w:t>
+        <w:br/>
+        <w:t>1012:                           &lt;/div&gt;</w:t>
+        <w:br/>
+        <w:t xml:space="preserve">1013: </w:t>
+        <w:br/>
+        <w:t>1014:                           {/* Legend / Details */}</w:t>
+        <w:br/>
+        <w:t>1015:                           &lt;div style={{ display: 'flex', flexDirection: 'column', gap: '15px', m...</w:t>
+        <w:br/>
+        <w:t>1016:                             &lt;div&gt;</w:t>
+        <w:br/>
+        <w:t>1017:                               &lt;div style={{ display: 'flex', alignItems: 'center', gap: '8px', m...</w:t>
+        <w:br/>
+        <w:t>1018:                                 &lt;div style={{ width: '12px', height: '12px', borderRadius: '50%'...</w:t>
+        <w:br/>
+        <w:t>1019:                                 &lt;Text strong style={{ fontSize: '14px' }}&gt;{t('splitsPcc')}&lt;/Text&gt;</w:t>
+        <w:br/>
+        <w:t>1020:                               &lt;/div&gt;</w:t>
+        <w:br/>
+        <w:t>1021:                               &lt;Text type="secondary" style={{ marginLeft: '20px' }}&gt;</w:t>
+        <w:br/>
+        <w:t>1022:                                 {clearedCount} {language === 'en' ? 'Certificates Issued' : 'प्र...</w:t>
+        <w:br/>
+        <w:t>1023:                               &lt;/Text&gt;</w:t>
+        <w:br/>
+        <w:t>1024:                             &lt;/div&gt;</w:t>
+        <w:br/>
+        <w:t xml:space="preserve">1025: </w:t>
+        <w:br/>
+        <w:t>1026:                             &lt;div&gt;</w:t>
+        <w:br/>
+        <w:t>1027:                               &lt;div style={{ display: 'flex', alignItems: 'center', gap: '8px', m...</w:t>
+        <w:br/>
+        <w:t>1028:                                 &lt;div style={{ width: '12px', height: '12px', borderRadius: '50%'...</w:t>
+        <w:br/>
+        <w:t>1029:                                 &lt;Text strong style={{ fontSize: '14px' }}&gt;{t('splitsQdo')}&lt;/Text&gt;</w:t>
+        <w:br/>
+        <w:t>1030:                               &lt;/div&gt;</w:t>
+        <w:br/>
+        <w:t>1031:                               &lt;Text type="secondary" style={{ marginLeft: '20px' }}&gt;</w:t>
+        <w:br/>
+        <w:t>1032:                                 {detainedCount} {language === 'en' ? 'Orders Active' : 'सक्रिय आ...</w:t>
+        <w:br/>
+        <w:t>1033:                               &lt;/Text&gt;</w:t>
+        <w:br/>
+        <w:t>1034:                             &lt;/div&gt;</w:t>
+        <w:br/>
+        <w:t>1035:                           &lt;/div&gt;</w:t>
+        <w:br/>
+        <w:t>1036:                         &lt;/div&gt;</w:t>
+        <w:br/>
+        <w:t>1037:                       &lt;/Card&gt;</w:t>
+        <w:br/>
+        <w:t>1038:                     &lt;/Col&gt;</w:t>
+        <w:br/>
+        <w:t>1039:                   &lt;/Row&gt;</w:t>
+        <w:br/>
+        <w:t xml:space="preserve">1040: </w:t>
+        <w:br/>
+        <w:t>1041:                   &lt;Title level={4} style={{ marginBottom: '15px' }}&gt;{t('allVesselLedgerTitle')}&lt;...</w:t>
+        <w:br/>
+        <w:t>1042:                   &lt;Table</w:t>
+        <w:br/>
+        <w:t>1043:                     dataSource={inspectedCargoList}</w:t>
+        <w:br/>
+        <w:t>1044:                     columns={[</w:t>
+        <w:br/>
+        <w:t>1045:                       {</w:t>
+        <w:br/>
+        <w:t>1046:                         title: t('tblBlRef'),</w:t>
+        <w:br/>
+        <w:t>1047:                         dataIndex: 'manifestId',</w:t>
+        <w:br/>
+        <w:t>1048:                         key: 'manifestId',</w:t>
+        <w:br/>
+        <w:t>1049:                         render: (text) =&gt; &lt;Text strong&gt;{text}&lt;/Text&gt;</w:t>
+        <w:br/>
+        <w:t>1050:                       },</w:t>
       </w:r>
     </w:p>
     <w:p>
@@ -23187,305 +23318,305 @@
           <w:color w:val="000000"/>
           <w:sz w:val="17"/>
         </w:rPr>
-        <w:t>1051:                           }</w:t>
-        <w:br/>
-        <w:t>1052:                           return &lt;Text type="secondary"&gt;—&lt;/Text&gt;;</w:t>
-        <w:br/>
-        <w:t>1053:                         }</w:t>
-        <w:br/>
-        <w:t>1054:                       }</w:t>
-        <w:br/>
-        <w:t>1055:                     ]}</w:t>
-        <w:br/>
-        <w:t>1056:                     loading={loading}</w:t>
-        <w:br/>
-        <w:t>1057:                     rowKey="id"</w:t>
-        <w:br/>
-        <w:t>1058:                     pagination={{ pageSize: 8 }}</w:t>
-        <w:br/>
-        <w:t>1059:                   /&gt;</w:t>
-        <w:br/>
-        <w:t>1060:                 &lt;/div&gt;</w:t>
-        <w:br/>
-        <w:t>1061:               )</w:t>
-        <w:br/>
-        <w:t>1062:             }</w:t>
-        <w:br/>
-        <w:t>1063:           ]}</w:t>
-        <w:br/>
-        <w:t>1064:         /&gt;</w:t>
-        <w:br/>
-        <w:t>1065:       &lt;/Card&gt;</w:t>
-        <w:br/>
-        <w:t xml:space="preserve">1066: </w:t>
-        <w:br/>
-        <w:t>1067:       {/* 3. SIDE-BY-SIDE Drawer Review Container */}</w:t>
-        <w:br/>
-        <w:t>1068:       &lt;Drawer</w:t>
-        <w:br/>
-        <w:t>1069:         title={</w:t>
-        <w:br/>
-        <w:t>1070:           &lt;Space&gt;</w:t>
-        <w:br/>
-        <w:t>1071:             &lt;SafetyCertificateOutlined style={{ color: '#1890ff' }} /&gt;</w:t>
-        <w:br/>
-        <w:t>1072:             &lt;span&gt;{t('dossierPanelTitle')}: {activeDossier?.manifestId}&lt;/span&gt;</w:t>
-        <w:br/>
-        <w:t>1073:           &lt;/Space&gt;</w:t>
-        <w:br/>
-        <w:t>1074:         }</w:t>
-        <w:br/>
-        <w:t>1075:         width={750}</w:t>
-        <w:br/>
-        <w:t>1076:         open={reviewDrawerVisible}</w:t>
-        <w:br/>
-        <w:t>1077:         onClose={() =&gt; setReviewDrawerVisible(false)}</w:t>
-        <w:br/>
-        <w:t>1078:         destroyOnClose</w:t>
-        <w:br/>
-        <w:t>1079:       &gt;</w:t>
-        <w:br/>
-        <w:t>1080:         {activeDossier &amp;&amp; (</w:t>
-        <w:br/>
-        <w:t>1081:           &lt;div style={{ display: 'flex', flexDirection: 'column', height: '100%' }}&gt;</w:t>
-        <w:br/>
-        <w:t xml:space="preserve">1082: </w:t>
-        <w:br/>
-        <w:t>1083:             {/* Weight discrepancy warning alert */}</w:t>
-        <w:br/>
-        <w:t>1084:             {(() =&gt; {</w:t>
-        <w:br/>
-        <w:t>1085:               const declared = activeDossier.declaredWeight || 0;</w:t>
-        <w:br/>
-        <w:t>1086:               const actual = activeDossier.actualWeight;</w:t>
-        <w:br/>
-        <w:t>1087:               if (actual !== null &amp;&amp; declared &gt; 0) {</w:t>
-        <w:br/>
-        <w:t>1088:                 const threshold = parseFloat(localStorage.getItem('weightTolerancePercentage')) ...</w:t>
-        <w:br/>
-        <w:t>1089:                 const deviation = (Math.abs(actual - declared) / declared) * 100;</w:t>
-        <w:br/>
-        <w:t>1090:                 if (deviation &gt; threshold) {</w:t>
-        <w:br/>
-        <w:t>1091:                   return (</w:t>
-        <w:br/>
-        <w:t>1092:                     &lt;Alert</w:t>
-        <w:br/>
-        <w:t>1093:                       message={</w:t>
-        <w:br/>
-        <w:t>1094:                         &lt;span&gt;</w:t>
-        <w:br/>
-        <w:t>1095:                           &lt;strong&gt;Warning: &lt;/strong&gt;</w:t>
-        <w:br/>
-        <w:t>1096:                           Weight deviation is {deviation.toFixed(2)}% which exceeds the configur...</w:t>
-        <w:br/>
-        <w:t>1097:                         &lt;/span&gt;</w:t>
-        <w:br/>
-        <w:t>1098:                       }</w:t>
-        <w:br/>
-        <w:t>1099:                       type="warning"</w:t>
-        <w:br/>
-        <w:t>1100:                       showIcon</w:t>
-        <w:br/>
-        <w:t>1101:                       style={{ marginBottom: '20px' }}</w:t>
-        <w:br/>
-        <w:t>1102:                     /&gt;</w:t>
-        <w:br/>
-        <w:t>1103:                   );</w:t>
-        <w:br/>
-        <w:t>1104:                 }</w:t>
-        <w:br/>
-        <w:t>1105:               }</w:t>
-        <w:br/>
-        <w:t>1106:               return null;</w:t>
-        <w:br/>
-        <w:t>1107:             })()}</w:t>
-        <w:br/>
-        <w:t xml:space="preserve">1108: </w:t>
-        <w:br/>
-        <w:t>1109:             {/* Side by side columns */}</w:t>
-        <w:br/>
-        <w:t>1110:             &lt;Row gutter={24} style={{ flex: 1, overflowY: 'auto' }}&gt;</w:t>
-        <w:br/>
-        <w:t xml:space="preserve">1111: </w:t>
-        <w:br/>
-        <w:t>1112:               {/* Left Column: Declared parameters */}</w:t>
-        <w:br/>
-        <w:t>1113:               &lt;Col span={12} style={{ borderRight: '1px solid #f0f0f0', paddingRight: '20px' }}&gt;</w:t>
-        <w:br/>
-        <w:t>1114:                 &lt;Descriptions title={t('declaredDetailsTitle')} bordered column={1} size="small"&gt;</w:t>
-        <w:br/>
-        <w:t>1115:                   &lt;Descriptions.Item label={t('tblBlRef')}&gt;{activeDossier.manifestId}&lt;/Descripti...</w:t>
-        <w:br/>
-        <w:t>1116:                   &lt;Descriptions.Item label={t('tblCargoType')}&gt;{activeDossier.cargoType?.toUpper...</w:t>
-        <w:br/>
-        <w:t>1117:                   &lt;Descriptions.Item label={t('tblContainerNo')}&gt;{activeDossier.containerNo}&lt;/De...</w:t>
-        <w:br/>
-        <w:t>1118:                   &lt;Descriptions.Item label={t('tblGrossTonnage')}&gt;{activeDossier.declaredWeight}...</w:t>
-        <w:br/>
-        <w:t>1119:                   &lt;Descriptions.Item label={language === 'en' ? 'AI RMS Risk Level' : 'एआई आरएमए...</w:t>
-        <w:br/>
-        <w:t>1120:                     {(() =&gt; {</w:t>
-        <w:br/>
-        <w:t>1121:                       const level = activeDossier.rmsRiskLevel || 'ROUTINE RISK';</w:t>
-        <w:br/>
-        <w:t>1122:                       let color = 'green';</w:t>
-        <w:br/>
-        <w:t>1123:                       if (level === 'CRITICAL RISK') color = 'red';</w:t>
-        <w:br/>
-        <w:t>1124:                       else if (level === 'ELEVATED RISK') color = 'orange';</w:t>
-        <w:br/>
-        <w:t>1125:                       return &lt;Tag color={color} style={{ fontWeight: 'bold' }}&gt;{level}&lt;/Tag&gt;;</w:t>
-        <w:br/>
-        <w:t>1126:                     })()}</w:t>
-        <w:br/>
-        <w:t>1127:                   &lt;/Descriptions.Item&gt;</w:t>
-        <w:br/>
-        <w:t>1128:                   &lt;Descriptions.Item label={language === 'en' ? 'AI RMS Analysis' : 'एआई आरएमएस ...</w:t>
-        <w:br/>
-        <w:t>1129:                     {(() =&gt; {</w:t>
-        <w:br/>
-        <w:t>1130:                       const memo = activeDossier.rmsAnalysisMemo;</w:t>
-        <w:br/>
-        <w:t>1131:                       if (memo &amp;&amp; memo.trim().startsWith('{')) {</w:t>
-        <w:br/>
-        <w:t>1132:                         try {</w:t>
-        <w:br/>
-        <w:t>1133:                           const parsed = JSON.parse(memo);</w:t>
-        <w:br/>
-        <w:t>1134:                           return (</w:t>
-        <w:br/>
-        <w:t>1135:                             &lt;div style={{ display: 'flex', flexDirection: 'column', gap: '4px' }}&gt;</w:t>
-        <w:br/>
-        <w:t>1136:                               &lt;div&gt;</w:t>
-        <w:br/>
-        <w:t>1137:                                 &lt;span style={{ fontWeight: 'bold', color: '#096dd9' }}&gt;TRIGGER: ...</w:t>
-        <w:br/>
-        <w:t>1138:                                 &lt;Tag color="cyan" style={{ fontSize: '0.7rem', padding: '0 4px',...</w:t>
-        <w:br/>
-        <w:t>1139:                                 &lt;span style={{ color: '#888', fontSize: '0.75rem' }}&gt; ({Math.rou...</w:t>
-        <w:br/>
-        <w:t>1140:                               &lt;/div&gt;</w:t>
-        <w:br/>
-        <w:t>1141:                               &lt;div style={{ fontSize: '0.78rem', color: '#555', lineHeight: 1.3 }}&gt;</w:t>
-        <w:br/>
-        <w:t>1142:                                 &lt;span style={{ fontWeight: 'bold' }}&gt;Focus:&lt;/span&gt; {parsed.inspe...</w:t>
-        <w:br/>
-        <w:t>1143:                               &lt;/div&gt;</w:t>
-        <w:br/>
-        <w:t>1144:                             &lt;/div&gt;</w:t>
-        <w:br/>
-        <w:t>1145:                           );</w:t>
-        <w:br/>
-        <w:t>1146:                         } catch (e) {</w:t>
-        <w:br/>
-        <w:t>1147:                           // fallback</w:t>
-        <w:br/>
-        <w:t>1148:                         }</w:t>
-        <w:br/>
-        <w:t>1149:                       }</w:t>
-        <w:br/>
-        <w:t>1150:                       return memo || 'No details available';</w:t>
-        <w:br/>
-        <w:t>1151:                     })()}</w:t>
-        <w:br/>
-        <w:t>1152:                   &lt;/Descriptions.Item&gt;</w:t>
-        <w:br/>
-        <w:t>1153:                 &lt;/Descriptions&gt;</w:t>
-        <w:br/>
-        <w:t>1154:               &lt;/Col&gt;</w:t>
-        <w:br/>
-        <w:t xml:space="preserve">1155: </w:t>
-        <w:br/>
-        <w:t>1156:               {/* Right Column: Physical inspector inputs */}</w:t>
-        <w:br/>
-        <w:t>1157:               &lt;Col span={12} style={{ paddingLeft: '20px' }}&gt;</w:t>
-        <w:br/>
-        <w:t>1158:                 &lt;Descriptions title={language === 'en' ? 'Physical Gate Inspection Details' : 'भ...</w:t>
-        <w:br/>
-        <w:t>1159:                   &lt;Descriptions.Item label={t('measuredWeight')}&gt;</w:t>
-        <w:br/>
-        <w:t>1160:                     {activeDossier.actualWeight !== null ? (</w:t>
-        <w:br/>
-        <w:t>1161:                       &lt;span style={{</w:t>
-        <w:br/>
-        <w:t>1162:                         fontWeight: 'bold',</w:t>
-        <w:br/>
-        <w:t>1163:                         color: Math.abs(activeDossier.actualWeight - activeDossier.declaredWeigh...</w:t>
-        <w:br/>
-        <w:t>1164:                       }}&gt;</w:t>
-        <w:br/>
-        <w:t>1165:                         {activeDossier.actualWeight} MT</w:t>
-        <w:br/>
-        <w:t>1166:                       &lt;/span&gt;</w:t>
-        <w:br/>
-        <w:t>1167:                     ) : t('certNotVerified')}</w:t>
-        <w:br/>
-        <w:t>1168:                   &lt;/Descriptions.Item&gt;</w:t>
-        <w:br/>
-        <w:t>1169:                   &lt;Descriptions.Item label={t('sealIntegrityLabel')}&gt;</w:t>
-        <w:br/>
-        <w:t>1170:                     {activeDossier.sealIntact ? (</w:t>
-        <w:br/>
-        <w:t>1171:                       &lt;Tag color="success"&gt;{t('sealIntact')?.toUpperCase()} ✓&lt;/Tag&gt;</w:t>
-        <w:br/>
-        <w:t>1172:                     ) : (</w:t>
-        <w:br/>
-        <w:t>1173:                       &lt;Tag color="error"&gt;{t('sealBroken')?.toUpperCase()} ✗&lt;/Tag&gt;</w:t>
-        <w:br/>
-        <w:t>1174:                     )}</w:t>
-        <w:br/>
-        <w:t>1175:                   &lt;/Descriptions.Item&gt;</w:t>
-        <w:br/>
-        <w:t>1176:                   &lt;Descriptions.Item label={t('structuralDamageLabel')}&gt;</w:t>
-        <w:br/>
-        <w:t>1177:                     {activeDossier.structuralDamage ? (</w:t>
-        <w:br/>
-        <w:t>1178:                       &lt;Tag color="error"&gt;{t('damageDetected')?.toUpperCase()} ✗&lt;/Tag&gt;</w:t>
-        <w:br/>
-        <w:t>1179:                     ) : (</w:t>
-        <w:br/>
-        <w:t>1180:                       &lt;Tag color="success"&gt;{t('damageNone')?.toUpperCase()} ✓&lt;/Tag&gt;</w:t>
-        <w:br/>
-        <w:t>1181:                     )}</w:t>
-        <w:br/>
-        <w:t>1182:                   &lt;/Descriptions.Item&gt;</w:t>
-        <w:br/>
-        <w:t>1183:                 &lt;/Descriptions&gt;</w:t>
-        <w:br/>
-        <w:t xml:space="preserve">1184: </w:t>
-        <w:br/>
-        <w:t>1185:                 {/* Evidence Image Zoom Component */}</w:t>
-        <w:br/>
-        <w:t>1186:                 &lt;Card title={t('evidenceCardTitle')} size="small" style={{ textAlign: 'center' }}&gt;</w:t>
-        <w:br/>
-        <w:t>1187:                   &lt;Image</w:t>
-        <w:br/>
-        <w:t>1188:                     src={activeDossier.imagePath}</w:t>
-        <w:br/>
-        <w:t>1189:                     fallback={placeholderBase64}</w:t>
-        <w:br/>
-        <w:t>1190:                     preview={{</w:t>
-        <w:br/>
-        <w:t>1191:                       visible: previewOpen,</w:t>
-        <w:br/>
-        <w:t>1192:                       onVisibleChange: (val) =&gt; setPreviewOpen(val)</w:t>
-        <w:br/>
-        <w:t>1193:                     }}</w:t>
-        <w:br/>
-        <w:t>1194:                     style={{ maxHeight: '180px', borderRadius: '4px', objectFit: 'contain' }}</w:t>
-        <w:br/>
-        <w:t>1195:                   /&gt;</w:t>
-        <w:br/>
-        <w:t>1196:                 &lt;/Card&gt;</w:t>
-        <w:br/>
-        <w:t>1197:               &lt;/Col&gt;</w:t>
-        <w:br/>
-        <w:t>1198:             &lt;/Row&gt;</w:t>
-        <w:br/>
-        <w:t xml:space="preserve">1199: </w:t>
-        <w:br/>
-        <w:t>1200:             {/* Adjudication Decision Panel */}</w:t>
+        <w:t>1051:                       {</w:t>
+        <w:br/>
+        <w:t>1052:                         title: t('tblVesselName'),</w:t>
+        <w:br/>
+        <w:t>1053:                         dataIndex: 'vesselName',</w:t>
+        <w:br/>
+        <w:t>1054:                         key: 'vesselName',</w:t>
+        <w:br/>
+        <w:t>1055:                       },</w:t>
+        <w:br/>
+        <w:t>1056:                       {</w:t>
+        <w:br/>
+        <w:t>1057:                         title: t('tblCargoType'),</w:t>
+        <w:br/>
+        <w:t>1058:                         dataIndex: 'cargoType',</w:t>
+        <w:br/>
+        <w:t>1059:                         key: 'cargoType',</w:t>
+        <w:br/>
+        <w:t>1060:                       },</w:t>
+        <w:br/>
+        <w:t>1061:                       {</w:t>
+        <w:br/>
+        <w:t>1062:                         title: t('tblRmsMemo'),</w:t>
+        <w:br/>
+        <w:t>1063:                         dataIndex: 'rmsRiskLevel',</w:t>
+        <w:br/>
+        <w:t>1064:                         key: 'rmsRiskLevel',</w:t>
+        <w:br/>
+        <w:t>1065:                         render: (level) =&gt; {</w:t>
+        <w:br/>
+        <w:t>1066:                           let color = 'green';</w:t>
+        <w:br/>
+        <w:t>1067:                           let riskText = level || 'ROUTINE RISK';</w:t>
+        <w:br/>
+        <w:t>1068:                           if (level === 'CRITICAL RISK') { color = 'red'; riskText = t('riskCrit...</w:t>
+        <w:br/>
+        <w:t>1069:                           else if (level === 'ELEVATED RISK') { color = 'orange'; riskText = t('...</w:t>
+        <w:br/>
+        <w:t>1070:                           else if (level === 'ROUTINE RISK') { riskText = t('riskRoutine'); }</w:t>
+        <w:br/>
+        <w:t>1071:                           return &lt;Tag color={color}&gt;{riskText}&lt;/Tag&gt;;</w:t>
+        <w:br/>
+        <w:t>1072:                         }</w:t>
+        <w:br/>
+        <w:t>1073:                       },</w:t>
+        <w:br/>
+        <w:t>1074:                       {</w:t>
+        <w:br/>
+        <w:t>1075:                         title: t('tblStatus'),</w:t>
+        <w:br/>
+        <w:t>1076:                         dataIndex: 'status',</w:t>
+        <w:br/>
+        <w:t>1077:                         key: 'status',</w:t>
+        <w:br/>
+        <w:t>1078:                         render: (status) =&gt; renderStatusTag(status)</w:t>
+        <w:br/>
+        <w:t>1079:                       },</w:t>
+        <w:br/>
+        <w:t>1080:                       {</w:t>
+        <w:br/>
+        <w:t>1081:                         title: t('tblAction'),</w:t>
+        <w:br/>
+        <w:t>1082:                         key: 'action',</w:t>
+        <w:br/>
+        <w:t>1083:                         render: (_, record) =&gt; {</w:t>
+        <w:br/>
+        <w:t>1084:                           const isCleared = record.status === 'Port Clearance Granted' || record...</w:t>
+        <w:br/>
+        <w:t>1085:                           const isDetained = record.status === 'Clearance Denied - Detained for ...</w:t>
+        <w:br/>
+        <w:t xml:space="preserve">1086: </w:t>
+        <w:br/>
+        <w:t>1087:                           if (isCleared) {</w:t>
+        <w:br/>
+        <w:t>1088:                             return (</w:t>
+        <w:br/>
+        <w:t>1089:                               &lt;Button</w:t>
+        <w:br/>
+        <w:t>1090:                                 type="primary"</w:t>
+        <w:br/>
+        <w:t>1091:                                 icon={&lt;PrinterOutlined /&gt;}</w:t>
+        <w:br/>
+        <w:t>1092:                                 size="small"</w:t>
+        <w:br/>
+        <w:t>1093:                                 onClick={() =&gt; printCertificate(record, record.qrToken, null, la...</w:t>
+        <w:br/>
+        <w:t>1094:                                 style={{ backgroundColor: '#52c41a', borderColor: '#52c41a' }}</w:t>
+        <w:br/>
+        <w:t>1095:                               &gt;</w:t>
+        <w:br/>
+        <w:t>1096:                                 {language === 'en' ? 'Print PCC' : 'पीसीसी प्रिंट करें'}</w:t>
+        <w:br/>
+        <w:t>1097:                               &lt;/Button&gt;</w:t>
+        <w:br/>
+        <w:t>1098:                             );</w:t>
+        <w:br/>
+        <w:t>1099:                           } else if (isDetained) {</w:t>
+        <w:br/>
+        <w:t>1100:                             return (</w:t>
+        <w:br/>
+        <w:t>1101:                               &lt;Button</w:t>
+        <w:br/>
+        <w:t>1102:                                 type="primary"</w:t>
+        <w:br/>
+        <w:t>1103:                                 danger</w:t>
+        <w:br/>
+        <w:t>1104:                                 icon={&lt;PrinterOutlined /&gt;}</w:t>
+        <w:br/>
+        <w:t>1105:                                 size="small"</w:t>
+        <w:br/>
+        <w:t>1106:                                 onClick={() =&gt; printCertificate(record, record.qrToken, null, la...</w:t>
+        <w:br/>
+        <w:t>1107:                               &gt;</w:t>
+        <w:br/>
+        <w:t>1108:                                 {language === 'en' ? 'Print QDO' : 'क्यूडीओ प्रिंट करें'}</w:t>
+        <w:br/>
+        <w:t>1109:                               &lt;/Button&gt;</w:t>
+        <w:br/>
+        <w:t>1110:                             );</w:t>
+        <w:br/>
+        <w:t>1111:                           }</w:t>
+        <w:br/>
+        <w:t>1112:                           return &lt;Text type="secondary"&gt;—&lt;/Text&gt;;</w:t>
+        <w:br/>
+        <w:t>1113:                         }</w:t>
+        <w:br/>
+        <w:t>1114:                       }</w:t>
+        <w:br/>
+        <w:t>1115:                     ]}</w:t>
+        <w:br/>
+        <w:t>1116:                     loading={loading}</w:t>
+        <w:br/>
+        <w:t>1117:                     rowKey="id"</w:t>
+        <w:br/>
+        <w:t>1118:                     pagination={{ pageSize: 8 }}</w:t>
+        <w:br/>
+        <w:t>1119:                   /&gt;</w:t>
+        <w:br/>
+        <w:t>1120:                 &lt;/div&gt;</w:t>
+        <w:br/>
+        <w:t>1121:               )</w:t>
+        <w:br/>
+        <w:t>1122:             }</w:t>
+        <w:br/>
+        <w:t>1123:           ]}</w:t>
+        <w:br/>
+        <w:t>1124:         /&gt;</w:t>
+        <w:br/>
+        <w:t>1125:       &lt;/Card&gt;</w:t>
+        <w:br/>
+        <w:t xml:space="preserve">1126: </w:t>
+        <w:br/>
+        <w:t>1127:       {/* 3. SIDE-BY-SIDE Drawer Review Container */}</w:t>
+        <w:br/>
+        <w:t>1128:       &lt;Drawer</w:t>
+        <w:br/>
+        <w:t>1129:         title={</w:t>
+        <w:br/>
+        <w:t>1130:           &lt;Space&gt;</w:t>
+        <w:br/>
+        <w:t>1131:             &lt;SafetyCertificateOutlined style={{ color: '#1890ff' }} /&gt;</w:t>
+        <w:br/>
+        <w:t>1132:             &lt;span&gt;{t('dossierPanelTitle')}: {activeDossier?.manifestId}&lt;/span&gt;</w:t>
+        <w:br/>
+        <w:t>1133:           &lt;/Space&gt;</w:t>
+        <w:br/>
+        <w:t>1134:         }</w:t>
+        <w:br/>
+        <w:t>1135:         width={750}</w:t>
+        <w:br/>
+        <w:t>1136:         open={reviewDrawerVisible}</w:t>
+        <w:br/>
+        <w:t>1137:         onClose={() =&gt; setReviewDrawerVisible(false)}</w:t>
+        <w:br/>
+        <w:t>1138:         destroyOnClose</w:t>
+        <w:br/>
+        <w:t>1139:       &gt;</w:t>
+        <w:br/>
+        <w:t>1140:         {activeDossier &amp;&amp; (</w:t>
+        <w:br/>
+        <w:t>1141:           &lt;div style={{ display: 'flex', flexDirection: 'column', height: '100%' }}&gt;</w:t>
+        <w:br/>
+        <w:t xml:space="preserve">1142: </w:t>
+        <w:br/>
+        <w:t>1143:             {/* Weight discrepancy warning alert */}</w:t>
+        <w:br/>
+        <w:t>1144:             {(() =&gt; {</w:t>
+        <w:br/>
+        <w:t>1145:               const declared = activeDossier.declaredWeight || 0;</w:t>
+        <w:br/>
+        <w:t>1146:               const actual = activeDossier.actualWeight;</w:t>
+        <w:br/>
+        <w:t>1147:               if (actual !== null &amp;&amp; declared &gt; 0) {</w:t>
+        <w:br/>
+        <w:t>1148:                 const threshold = parseFloat(localStorage.getItem('weightTolerancePercentage')) ...</w:t>
+        <w:br/>
+        <w:t>1149:                 const deviation = (Math.abs(actual - declared) / declared) * 100;</w:t>
+        <w:br/>
+        <w:t>1150:                 if (deviation &gt; threshold) {</w:t>
+        <w:br/>
+        <w:t>1151:                   return (</w:t>
+        <w:br/>
+        <w:t>1152:                     &lt;Alert</w:t>
+        <w:br/>
+        <w:t>1153:                       message={</w:t>
+        <w:br/>
+        <w:t>1154:                         &lt;span&gt;</w:t>
+        <w:br/>
+        <w:t>1155:                           &lt;strong&gt;Warning: &lt;/strong&gt;</w:t>
+        <w:br/>
+        <w:t>1156:                           Weight deviation is {deviation.toFixed(2)}% which exceeds the configur...</w:t>
+        <w:br/>
+        <w:t>1157:                         &lt;/span&gt;</w:t>
+        <w:br/>
+        <w:t>1158:                       }</w:t>
+        <w:br/>
+        <w:t>1159:                       type="warning"</w:t>
+        <w:br/>
+        <w:t>1160:                       showIcon</w:t>
+        <w:br/>
+        <w:t>1161:                       style={{ marginBottom: '20px' }}</w:t>
+        <w:br/>
+        <w:t>1162:                     /&gt;</w:t>
+        <w:br/>
+        <w:t>1163:                   );</w:t>
+        <w:br/>
+        <w:t>1164:                 }</w:t>
+        <w:br/>
+        <w:t>1165:               }</w:t>
+        <w:br/>
+        <w:t>1166:               return null;</w:t>
+        <w:br/>
+        <w:t>1167:             })()}</w:t>
+        <w:br/>
+        <w:t xml:space="preserve">1168: </w:t>
+        <w:br/>
+        <w:t>1169:             {/* Side by side columns */}</w:t>
+        <w:br/>
+        <w:t>1170:             &lt;Row gutter={24} style={{ flex: 1, overflowY: 'auto' }}&gt;</w:t>
+        <w:br/>
+        <w:t xml:space="preserve">1171: </w:t>
+        <w:br/>
+        <w:t>1172:               {/* Left Column: Declared parameters */}</w:t>
+        <w:br/>
+        <w:t>1173:               &lt;Col span={12} style={{ borderRight: '1px solid #f0f0f0', paddingRight: '20px' }}&gt;</w:t>
+        <w:br/>
+        <w:t>1174:                 &lt;Descriptions title={t('declaredDetailsTitle')} bordered column={1} size="small"&gt;</w:t>
+        <w:br/>
+        <w:t>1175:                   &lt;Descriptions.Item label={t('tblBlRef')}&gt;{activeDossier.manifestId}&lt;/Descripti...</w:t>
+        <w:br/>
+        <w:t>1176:                   &lt;Descriptions.Item label={t('tblCargoType')}&gt;{activeDossier.cargoType?.toUpper...</w:t>
+        <w:br/>
+        <w:t>1177:                   &lt;Descriptions.Item label={t('tblContainerNo')}&gt;{activeDossier.containerNo}&lt;/De...</w:t>
+        <w:br/>
+        <w:t>1178:                   &lt;Descriptions.Item label={t('tblGrossTonnage')}&gt;{activeDossier.declaredWeight}...</w:t>
+        <w:br/>
+        <w:t>1179:                   &lt;Descriptions.Item label={language === 'en' ? 'AI RMS Risk Level' : 'एआई आरएमए...</w:t>
+        <w:br/>
+        <w:t>1180:                     {(() =&gt; {</w:t>
+        <w:br/>
+        <w:t>1181:                       const level = activeDossier.rmsRiskLevel || 'ROUTINE RISK';</w:t>
+        <w:br/>
+        <w:t>1182:                       let color = 'green';</w:t>
+        <w:br/>
+        <w:t>1183:                       if (level === 'CRITICAL RISK') color = 'red';</w:t>
+        <w:br/>
+        <w:t>1184:                       else if (level === 'ELEVATED RISK') color = 'orange';</w:t>
+        <w:br/>
+        <w:t>1185:                       return &lt;Tag color={color} style={{ fontWeight: 'bold' }}&gt;{level}&lt;/Tag&gt;;</w:t>
+        <w:br/>
+        <w:t>1186:                     })()}</w:t>
+        <w:br/>
+        <w:t>1187:                   &lt;/Descriptions.Item&gt;</w:t>
+        <w:br/>
+        <w:t>1188:                   &lt;Descriptions.Item label={language === 'en' ? 'AI RMS Analysis' : 'एआई आरएमएस ...</w:t>
+        <w:br/>
+        <w:t>1189:                     {(() =&gt; {</w:t>
+        <w:br/>
+        <w:t>1190:                       const memo = activeDossier.rmsAnalysisMemo;</w:t>
+        <w:br/>
+        <w:t>1191:                       if (memo &amp;&amp; memo.trim().startsWith('{')) {</w:t>
+        <w:br/>
+        <w:t>1192:                         try {</w:t>
+        <w:br/>
+        <w:t>1193:                           const parsed = JSON.parse(memo);</w:t>
+        <w:br/>
+        <w:t>1194:                           return (</w:t>
+        <w:br/>
+        <w:t>1195:                             &lt;div style={{ display: 'flex', flexDirection: 'column', gap: '4px' }}&gt;</w:t>
+        <w:br/>
+        <w:t>1196:                               &lt;div&gt;</w:t>
+        <w:br/>
+        <w:t>1197:                                 &lt;span style={{ fontWeight: 'bold', color: '#096dd9' }}&gt;TRIGGER: ...</w:t>
+        <w:br/>
+        <w:t>1198:                                 &lt;Tag color="cyan" style={{ fontSize: '0.7rem', padding: '0 4px',...</w:t>
+        <w:br/>
+        <w:t>1199:                                 &lt;span style={{ color: '#888', fontSize: '0.75rem' }}&gt; ({Math.rou...</w:t>
+        <w:br/>
+        <w:t>1200:                               &lt;/div&gt;</w:t>
       </w:r>
     </w:p>
     <w:p>
@@ -23498,121 +23629,241 @@
           <w:color w:val="000000"/>
           <w:sz w:val="17"/>
         </w:rPr>
-        <w:t>1201:             {activeDossier.status === 'Approved' || activeDossier.status === 'Port Clearance Gra...</w:t>
-        <w:br/>
-        <w:t>1202:               &lt;div style={{ marginTop: '30px', paddingTop: '20px', borderTop: '1px solid #f0f0f0...</w:t>
-        <w:br/>
-        <w:t>1203:                 &lt;Alert</w:t>
-        <w:br/>
-        <w:t>1204:                   message={t('accessClearanceLocked')}</w:t>
-        <w:br/>
-        <w:t>1205:                   description={t('accessLockedDesc')}</w:t>
-        <w:br/>
-        <w:t>1206:                   type="success"</w:t>
-        <w:br/>
-        <w:t>1207:                   showIcon</w:t>
-        <w:br/>
-        <w:t>1208:                 /&gt;</w:t>
-        <w:br/>
-        <w:t>1209:               &lt;/div&gt;</w:t>
-        <w:br/>
-        <w:t>1210:             ) : (</w:t>
-        <w:br/>
-        <w:t>1211:               &lt;div style={{ marginTop: '20px', paddingTop: '20px', borderTop: '1px solid #f0f0f0...</w:t>
-        <w:br/>
-        <w:t>1212:                 &lt;Title level={5} style={{ marginBottom: '15px', color: '#0f3057' }}&gt;Adjudication...</w:t>
-        <w:br/>
-        <w:t>1213:                 &lt;div style={{ display: 'flex', flexDirection: 'column', gap: '15px' }}&gt;</w:t>
-        <w:br/>
-        <w:t>1214:                   &lt;div&gt;</w:t>
-        <w:br/>
-        <w:t>1215:                     &lt;label style={{ fontWeight: 600, display: 'block', marginBottom: '5px' }}&gt;Se...</w:t>
-        <w:br/>
-        <w:t>1216:                     &lt;Select</w:t>
-        <w:br/>
-        <w:t>1217:                       value={adjStatus}</w:t>
-        <w:br/>
-        <w:t>1218:                       onChange={(val) =&gt; setAdjStatus(val)}</w:t>
-        <w:br/>
-        <w:t>1219:                       style={{ width: '100%' }}</w:t>
-        <w:br/>
-        <w:t>1220:                     &gt;</w:t>
-        <w:br/>
-        <w:t>1221:                       &lt;Select.Option value="Port Clearance Granted"&gt;Port Clearance Granted&lt;/Sele...</w:t>
-        <w:br/>
-        <w:t>1222:                       &lt;Select.Option value="Clearance Denied - Detained for Physical Audit"&gt;Clea...</w:t>
-        <w:br/>
-        <w:t>1223:                       &lt;Select.Option value="Re-Inspect"&gt;Re-Inspect&lt;/Select.Option&gt;</w:t>
-        <w:br/>
-        <w:t>1224:                     &lt;/Select&gt;</w:t>
-        <w:br/>
-        <w:t>1225:                   &lt;/div&gt;</w:t>
-        <w:br/>
-        <w:t>1226:                   &lt;div&gt;</w:t>
-        <w:br/>
-        <w:t>1227:                     &lt;label style={{ fontWeight: 600, display: 'block', marginBottom: '5px' }}&gt;Re...</w:t>
-        <w:br/>
-        <w:t>1228:                     &lt;Input.TextArea</w:t>
-        <w:br/>
-        <w:t>1229:                       rows={3}</w:t>
-        <w:br/>
-        <w:t>1230:                       value={adjNotes}</w:t>
-        <w:br/>
-        <w:t>1231:                       onChange={(e) =&gt; setAdjNotes(e.target.value)}</w:t>
-        <w:br/>
-        <w:t>1232:                       placeholder="Enter adjudication or review remarks..."</w:t>
-        <w:br/>
-        <w:t>1233:                       style={{ resize: 'none' }}</w:t>
-        <w:br/>
-        <w:t>1234:                     /&gt;</w:t>
-        <w:br/>
-        <w:t>1235:                   &lt;/div&gt;</w:t>
-        <w:br/>
-        <w:t>1236:                   &lt;div style={{ textAlign: 'right' }}&gt;</w:t>
-        <w:br/>
-        <w:t>1237:                     &lt;Button</w:t>
-        <w:br/>
-        <w:t>1238:                       type="primary"</w:t>
-        <w:br/>
-        <w:t>1239:                       onClick={() =&gt; handleSubmitAdjudication(adjStatus, adjNotes)}</w:t>
-        <w:br/>
-        <w:t>1240:                       loading={isSubmittingAction}</w:t>
-        <w:br/>
-        <w:t>1241:                       style={{ backgroundColor: adjStatus === 'Port Clearance Granted' ? '#52c41...</w:t>
-        <w:br/>
-        <w:t>1242:                     &gt;</w:t>
-        <w:br/>
-        <w:t>1243:                       Submit Adjudication</w:t>
-        <w:br/>
-        <w:t>1244:                     &lt;/Button&gt;</w:t>
-        <w:br/>
-        <w:t>1245:                   &lt;/div&gt;</w:t>
-        <w:br/>
-        <w:t>1246:                 &lt;/div&gt;</w:t>
-        <w:br/>
-        <w:t>1247:               &lt;/div&gt;</w:t>
-        <w:br/>
-        <w:t>1248:             )}</w:t>
-        <w:br/>
-        <w:t xml:space="preserve">1249: </w:t>
-        <w:br/>
-        <w:t>1250:           &lt;/div&gt;</w:t>
-        <w:br/>
-        <w:t>1251:         )}</w:t>
-        <w:br/>
-        <w:t>1252:       &lt;/Drawer&gt;</w:t>
-        <w:br/>
-        <w:t xml:space="preserve">1253: </w:t>
-        <w:br/>
-        <w:t>1254:     &lt;/div&gt;</w:t>
-        <w:br/>
-        <w:t>1255:   );</w:t>
-        <w:br/>
-        <w:t>1256: };</w:t>
-        <w:br/>
-        <w:t xml:space="preserve">1257: </w:t>
-        <w:br/>
-        <w:t>1258: export default PortAuthority;</w:t>
+        <w:t>1201:                               &lt;div style={{ fontSize: '0.78rem', color: '#555', lineHeight: 1.3 }}&gt;</w:t>
+        <w:br/>
+        <w:t>1202:                                 &lt;span style={{ fontWeight: 'bold' }}&gt;Focus:&lt;/span&gt; {parsed.inspe...</w:t>
+        <w:br/>
+        <w:t>1203:                               &lt;/div&gt;</w:t>
+        <w:br/>
+        <w:t>1204:                             &lt;/div&gt;</w:t>
+        <w:br/>
+        <w:t>1205:                           );</w:t>
+        <w:br/>
+        <w:t>1206:                         } catch (e) {</w:t>
+        <w:br/>
+        <w:t>1207:                           // fallback</w:t>
+        <w:br/>
+        <w:t>1208:                         }</w:t>
+        <w:br/>
+        <w:t>1209:                       }</w:t>
+        <w:br/>
+        <w:t>1210:                       return memo || 'No details available';</w:t>
+        <w:br/>
+        <w:t>1211:                     })()}</w:t>
+        <w:br/>
+        <w:t>1212:                   &lt;/Descriptions.Item&gt;</w:t>
+        <w:br/>
+        <w:t>1213:                 &lt;/Descriptions&gt;</w:t>
+        <w:br/>
+        <w:t>1214:               &lt;/Col&gt;</w:t>
+        <w:br/>
+        <w:t xml:space="preserve">1215: </w:t>
+        <w:br/>
+        <w:t>1216:               {/* Right Column: Physical inspector inputs */}</w:t>
+        <w:br/>
+        <w:t>1217:               &lt;Col span={12} style={{ paddingLeft: '20px' }}&gt;</w:t>
+        <w:br/>
+        <w:t>1218:                 &lt;Descriptions title={language === 'en' ? 'Physical Gate Inspection Details' : 'भ...</w:t>
+        <w:br/>
+        <w:t>1219:                   &lt;Descriptions.Item label={t('measuredWeight')}&gt;</w:t>
+        <w:br/>
+        <w:t>1220:                     {activeDossier.actualWeight !== null ? (</w:t>
+        <w:br/>
+        <w:t>1221:                       &lt;span style={{</w:t>
+        <w:br/>
+        <w:t>1222:                         fontWeight: 'bold',</w:t>
+        <w:br/>
+        <w:t>1223:                         color: Math.abs(activeDossier.actualWeight - activeDossier.declaredWeigh...</w:t>
+        <w:br/>
+        <w:t>1224:                       }}&gt;</w:t>
+        <w:br/>
+        <w:t>1225:                         {activeDossier.actualWeight} MT</w:t>
+        <w:br/>
+        <w:t>1226:                       &lt;/span&gt;</w:t>
+        <w:br/>
+        <w:t>1227:                     ) : t('certNotVerified')}</w:t>
+        <w:br/>
+        <w:t>1228:                   &lt;/Descriptions.Item&gt;</w:t>
+        <w:br/>
+        <w:t>1229:                   &lt;Descriptions.Item label={t('sealIntegrityLabel')}&gt;</w:t>
+        <w:br/>
+        <w:t>1230:                     {activeDossier.sealIntact ? (</w:t>
+        <w:br/>
+        <w:t>1231:                       &lt;Tag color="success"&gt;{t('sealIntact')?.toUpperCase()} ✓&lt;/Tag&gt;</w:t>
+        <w:br/>
+        <w:t>1232:                     ) : (</w:t>
+        <w:br/>
+        <w:t>1233:                       &lt;Tag color="error"&gt;{t('sealBroken')?.toUpperCase()} ✗&lt;/Tag&gt;</w:t>
+        <w:br/>
+        <w:t>1234:                     )}</w:t>
+        <w:br/>
+        <w:t>1235:                   &lt;/Descriptions.Item&gt;</w:t>
+        <w:br/>
+        <w:t>1236:                   &lt;Descriptions.Item label={t('structuralDamageLabel')}&gt;</w:t>
+        <w:br/>
+        <w:t>1237:                     {activeDossier.structuralDamage ? (</w:t>
+        <w:br/>
+        <w:t>1238:                       &lt;Tag color="error"&gt;{t('damageDetected')?.toUpperCase()} ✗&lt;/Tag&gt;</w:t>
+        <w:br/>
+        <w:t>1239:                     ) : (</w:t>
+        <w:br/>
+        <w:t>1240:                       &lt;Tag color="success"&gt;{t('damageNone')?.toUpperCase()} ✓&lt;/Tag&gt;</w:t>
+        <w:br/>
+        <w:t>1241:                     )}</w:t>
+        <w:br/>
+        <w:t>1242:                   &lt;/Descriptions.Item&gt;</w:t>
+        <w:br/>
+        <w:t>1243:                 &lt;/Descriptions&gt;</w:t>
+        <w:br/>
+        <w:t xml:space="preserve">1244: </w:t>
+        <w:br/>
+        <w:t>1245:                 {/* Evidence Image Zoom Component */}</w:t>
+        <w:br/>
+        <w:t>1246:                 &lt;Card title={t('evidenceCardTitle')} size="small" style={{ textAlign: 'center' }}&gt;</w:t>
+        <w:br/>
+        <w:t>1247:                   &lt;Image</w:t>
+        <w:br/>
+        <w:t>1248:                     src={activeDossier.imagePath}</w:t>
+        <w:br/>
+        <w:t>1249:                     fallback={placeholderBase64}</w:t>
+        <w:br/>
+        <w:t>1250:                     preview={{</w:t>
+        <w:br/>
+        <w:t>1251:                       visible: previewOpen,</w:t>
+        <w:br/>
+        <w:t>1252:                       onVisibleChange: (val) =&gt; setPreviewOpen(val)</w:t>
+        <w:br/>
+        <w:t>1253:                     }}</w:t>
+        <w:br/>
+        <w:t>1254:                     style={{ maxHeight: '180px', borderRadius: '4px', objectFit: 'contain' }}</w:t>
+        <w:br/>
+        <w:t>1255:                   /&gt;</w:t>
+        <w:br/>
+        <w:t>1256:                 &lt;/Card&gt;</w:t>
+        <w:br/>
+        <w:t>1257:               &lt;/Col&gt;</w:t>
+        <w:br/>
+        <w:t>1258:             &lt;/Row&gt;</w:t>
+        <w:br/>
+        <w:t xml:space="preserve">1259: </w:t>
+        <w:br/>
+        <w:t>1260:             {/* Adjudication Decision Panel */}</w:t>
+        <w:br/>
+        <w:t>1261:             {activeDossier.status === 'Approved' || activeDossier.status === 'Port Clearance Gra...</w:t>
+        <w:br/>
+        <w:t>1262:               &lt;div style={{ marginTop: '30px', paddingTop: '20px', borderTop: '1px solid #f0f0f0...</w:t>
+        <w:br/>
+        <w:t>1263:                 &lt;Alert</w:t>
+        <w:br/>
+        <w:t>1264:                   message={t('accessClearanceLocked')}</w:t>
+        <w:br/>
+        <w:t>1265:                   description={t('accessLockedDesc')}</w:t>
+        <w:br/>
+        <w:t>1266:                   type="success"</w:t>
+        <w:br/>
+        <w:t>1267:                   showIcon</w:t>
+        <w:br/>
+        <w:t>1268:                 /&gt;</w:t>
+        <w:br/>
+        <w:t>1269:               &lt;/div&gt;</w:t>
+        <w:br/>
+        <w:t>1270:             ) : (</w:t>
+        <w:br/>
+        <w:t>1271:               &lt;div style={{ marginTop: '20px', paddingTop: '20px', borderTop: '1px solid #f0f0f0...</w:t>
+        <w:br/>
+        <w:t>1272:                 &lt;Title level={5} style={{ marginBottom: '15px', color: '#0f3057' }}&gt;Adjudication...</w:t>
+        <w:br/>
+        <w:t>1273:                 &lt;div style={{ display: 'flex', flexDirection: 'column', gap: '15px' }}&gt;</w:t>
+        <w:br/>
+        <w:t>1274:                   &lt;div&gt;</w:t>
+        <w:br/>
+        <w:t>1275:                     &lt;label style={{ fontWeight: 600, display: 'block', marginBottom: '5px' }}&gt;Se...</w:t>
+        <w:br/>
+        <w:t>1276:                     &lt;Select</w:t>
+        <w:br/>
+        <w:t>1277:                       value={adjStatus}</w:t>
+        <w:br/>
+        <w:t>1278:                       onChange={(val) =&gt; setAdjStatus(val)}</w:t>
+        <w:br/>
+        <w:t>1279:                       style={{ width: '100%' }}</w:t>
+        <w:br/>
+        <w:t>1280:                     &gt;</w:t>
+        <w:br/>
+        <w:t>1281:                       &lt;Select.Option value="Port Clearance Granted"&gt;Port Clearance Granted&lt;/Sele...</w:t>
+        <w:br/>
+        <w:t>1282:                       &lt;Select.Option value="Clearance Denied - Detained for Physical Audit"&gt;Clea...</w:t>
+        <w:br/>
+        <w:t>1283:                       &lt;Select.Option value="Re-Inspect"&gt;Re-Inspect&lt;/Select.Option&gt;</w:t>
+        <w:br/>
+        <w:t>1284:                     &lt;/Select&gt;</w:t>
+        <w:br/>
+        <w:t>1285:                   &lt;/div&gt;</w:t>
+        <w:br/>
+        <w:t>1286:                   &lt;div&gt;</w:t>
+        <w:br/>
+        <w:t>1287:                     &lt;label style={{ fontWeight: 600, display: 'block', marginBottom: '5px' }}&gt;Re...</w:t>
+        <w:br/>
+        <w:t>1288:                     &lt;Input.TextArea</w:t>
+        <w:br/>
+        <w:t>1289:                       rows={3}</w:t>
+        <w:br/>
+        <w:t>1290:                       value={adjNotes}</w:t>
+        <w:br/>
+        <w:t>1291:                       onChange={(e) =&gt; setAdjNotes(e.target.value)}</w:t>
+        <w:br/>
+        <w:t>1292:                       placeholder="Enter adjudication or review remarks..."</w:t>
+        <w:br/>
+        <w:t>1293:                       style={{ resize: 'none' }}</w:t>
+        <w:br/>
+        <w:t>1294:                     /&gt;</w:t>
+        <w:br/>
+        <w:t>1295:                   &lt;/div&gt;</w:t>
+        <w:br/>
+        <w:t>1296:                   &lt;div style={{ textAlign: 'right' }}&gt;</w:t>
+        <w:br/>
+        <w:t>1297:                     &lt;Button</w:t>
+        <w:br/>
+        <w:t>1298:                       type="primary"</w:t>
+        <w:br/>
+        <w:t>1299:                       onClick={() =&gt; handleSubmitAdjudication(adjStatus, adjNotes)}</w:t>
+        <w:br/>
+        <w:t>1300:                       loading={isSubmittingAction}</w:t>
+        <w:br/>
+        <w:t>1301:                       style={{ backgroundColor: adjStatus === 'Port Clearance Granted' ? '#52c41...</w:t>
+        <w:br/>
+        <w:t>1302:                     &gt;</w:t>
+        <w:br/>
+        <w:t>1303:                       Submit Adjudication</w:t>
+        <w:br/>
+        <w:t>1304:                     &lt;/Button&gt;</w:t>
+        <w:br/>
+        <w:t>1305:                   &lt;/div&gt;</w:t>
+        <w:br/>
+        <w:t>1306:                 &lt;/div&gt;</w:t>
+        <w:br/>
+        <w:t>1307:               &lt;/div&gt;</w:t>
+        <w:br/>
+        <w:t>1308:             )}</w:t>
+        <w:br/>
+        <w:t xml:space="preserve">1309: </w:t>
+        <w:br/>
+        <w:t>1310:           &lt;/div&gt;</w:t>
+        <w:br/>
+        <w:t>1311:         )}</w:t>
+        <w:br/>
+        <w:t>1312:       &lt;/Drawer&gt;</w:t>
+        <w:br/>
+        <w:t xml:space="preserve">1313: </w:t>
+        <w:br/>
+        <w:t>1314:     &lt;/div&gt;</w:t>
+        <w:br/>
+        <w:t>1315:   );</w:t>
+        <w:br/>
+        <w:t>1316: };</w:t>
+        <w:br/>
+        <w:t xml:space="preserve">1317: </w:t>
+        <w:br/>
+        <w:t>1318: export default PortAuthority;</w:t>
       </w:r>
     </w:p>
     <w:p>

</xml_diff>

<commit_message>
feat: replace generic login statistics banner with project-specific metrics (manifests, QDO holds, grievances, and SLA breaches); regenerate reports
</commit_message>
<xml_diff>
--- a/NMPA_Project_Report_Final.docx
+++ b/NMPA_Project_Report_Final.docx
@@ -11625,63 +11625,63 @@
         <w:br/>
         <w:t>0721: def get_public_metrics():</w:t>
         <w:br/>
-        <w:t>0722:     total_inspections = inspections_col.count_documents({})</w:t>
-        <w:br/>
-        <w:t>0723:     pending_inspections = inspections_col.count_documents({"status": {"$in": ["Pending", "Awaiti...</w:t>
-        <w:br/>
-        <w:t>0724:     completed_inspections = inspections_col.count_documents({"status": {"$nin": ["Pending", "Awa...</w:t>
+        <w:t>0722:     manifests_processed = inspections_col.count_documents({"status": {"$in": ["Approved", "Port ...</w:t>
+        <w:br/>
+        <w:t>0723:     active_holds = inspections_col.count_documents({"status": {"$in": ["Clearance Denied - Detai...</w:t>
+        <w:br/>
+        <w:t>0724:     total_grievances = grievances_col.count_documents({})</w:t>
         <w:br/>
         <w:t xml:space="preserve">0725: </w:t>
         <w:br/>
-        <w:t>0726:     pre_berthing = max(0.2, round(0.78 + (pending_inspections * 0.02), 2))</w:t>
-        <w:br/>
-        <w:t>0727:     trt = max(10.0, round(43.23 + (pending_inspections * 0.15), 2))</w:t>
-        <w:br/>
-        <w:t xml:space="preserve">0728: </w:t>
-        <w:br/>
-        <w:t>0729:     cleared_tonnage = 0</w:t>
-        <w:br/>
-        <w:t>0730:     for doc in inspections_col.find({"status": {"$in": ["Approved", "Port Clearance Granted"]}}):</w:t>
-        <w:br/>
-        <w:t>0731:         cleared_tonnage += doc.get("gross_tonnage") or doc.get("weight") or 0</w:t>
-        <w:br/>
-        <w:t>0732:     berth_output = int(19535 + (cleared_tonnage / 20))</w:t>
-        <w:br/>
-        <w:t xml:space="preserve">0733: </w:t>
-        <w:br/>
-        <w:t>0734:     operating_ratio = 38.61</w:t>
-        <w:br/>
-        <w:t>0735:     if total_inspections &gt; 0:</w:t>
-        <w:br/>
-        <w:t>0736:         operating_ratio = round(38.61 + (completed_inspections - pending_inspections) * 0.1, 2)</w:t>
-        <w:br/>
-        <w:t xml:space="preserve">0737: </w:t>
-        <w:br/>
-        <w:t>0738:     import time</w:t>
-        <w:br/>
-        <w:t>0739:     try:</w:t>
-        <w:br/>
-        <w:t>0740:         start_time = time.mktime(time.strptime("2026-06-01 00:00:00", "%Y-%m-%d %H:%M:%S"))</w:t>
-        <w:br/>
-        <w:t>0741:         current_time = time.time()</w:t>
-        <w:br/>
-        <w:t>0742:         delta_seconds = max(0, current_time - start_time)</w:t>
-        <w:br/>
-        <w:t>0743:         solar_generated = round(59.26 + (delta_seconds * 0.000002), 6)</w:t>
-        <w:br/>
-        <w:t>0744:     except:</w:t>
-        <w:br/>
-        <w:t>0745:         solar_generated = 59.26</w:t>
-        <w:br/>
-        <w:t xml:space="preserve">0746: </w:t>
-        <w:br/>
-        <w:t>0747:     return jsonify({</w:t>
-        <w:br/>
-        <w:t>0748:         "pre_berthing_detention": pre_berthing,</w:t>
-        <w:br/>
-        <w:t>0749:         "average_trt": trt,</w:t>
-        <w:br/>
-        <w:t>0750:         "output_per_berth_day": berth_output,</w:t>
+        <w:t>0726:     escalated_grievances = grievances_col.count_documents({</w:t>
+        <w:br/>
+        <w:t>0727:         "$or": [</w:t>
+        <w:br/>
+        <w:t>0728:             {"sla_status": "SLA Breached"},</w:t>
+        <w:br/>
+        <w:t>0729:             {"escalated_to_chairman": True}</w:t>
+        <w:br/>
+        <w:t>0730:         ]</w:t>
+        <w:br/>
+        <w:t>0731:     })</w:t>
+        <w:br/>
+        <w:t xml:space="preserve">0732: </w:t>
+        <w:br/>
+        <w:t>0733:     return jsonify({</w:t>
+        <w:br/>
+        <w:t>0734:         "manifests_processed": manifests_processed,</w:t>
+        <w:br/>
+        <w:t>0735:         "active_holds": active_holds,</w:t>
+        <w:br/>
+        <w:t>0736:         "total_grievances": total_grievances,</w:t>
+        <w:br/>
+        <w:t>0737:         "escalated_grievances": escalated_grievances</w:t>
+        <w:br/>
+        <w:t>0738:     }), 200</w:t>
+        <w:br/>
+        <w:t xml:space="preserve">0739: </w:t>
+        <w:br/>
+        <w:t>0740: @app.route('/api/logs', methods=['GET'])</w:t>
+        <w:br/>
+        <w:t>0741: def get_logs():</w:t>
+        <w:br/>
+        <w:t>0742:     logs = []</w:t>
+        <w:br/>
+        <w:t>0743:     for r in audit_logs_col.find().sort("_id", pymongo.DESCENDING):</w:t>
+        <w:br/>
+        <w:t>0744:         logs.append({</w:t>
+        <w:br/>
+        <w:t>0745:             "id": str(r["_id"]),</w:t>
+        <w:br/>
+        <w:t>0746:             "action": r.get("action"),</w:t>
+        <w:br/>
+        <w:t>0747:             "role": r.get("user_role"),</w:t>
+        <w:br/>
+        <w:t>0748:             "details": r.get("details"),</w:t>
+        <w:br/>
+        <w:t>0749:             "date": r.get("timestamp")</w:t>
+        <w:br/>
+        <w:t>0750:         })</w:t>
       </w:r>
     </w:p>
     <w:p>
@@ -11694,305 +11694,305 @@
           <w:color w:val="000000"/>
           <w:sz w:val="17"/>
         </w:rPr>
-        <w:t>0751:         "operating_ratio": operating_ratio,</w:t>
-        <w:br/>
-        <w:t>0752:         "solar_generated": solar_generated</w:t>
-        <w:br/>
-        <w:t>0753:     }), 200</w:t>
-        <w:br/>
-        <w:t xml:space="preserve">0754: </w:t>
-        <w:br/>
-        <w:t>0755: @app.route('/api/logs', methods=['GET'])</w:t>
-        <w:br/>
-        <w:t>0756: def get_logs():</w:t>
-        <w:br/>
-        <w:t>0757:     logs = []</w:t>
-        <w:br/>
-        <w:t>0758:     for r in audit_logs_col.find().sort("_id", pymongo.DESCENDING):</w:t>
-        <w:br/>
-        <w:t>0759:         logs.append({</w:t>
-        <w:br/>
-        <w:t>0760:             "id": str(r["_id"]),</w:t>
-        <w:br/>
-        <w:t>0761:             "action": r.get("action"),</w:t>
-        <w:br/>
-        <w:t>0762:             "role": r.get("user_role"),</w:t>
-        <w:br/>
-        <w:t>0763:             "details": r.get("details"),</w:t>
-        <w:br/>
-        <w:t>0764:             "date": r.get("timestamp")</w:t>
-        <w:br/>
-        <w:t>0765:         })</w:t>
-        <w:br/>
-        <w:t>0766:     return jsonify(logs), 200</w:t>
-        <w:br/>
-        <w:t xml:space="preserve">0767: </w:t>
-        <w:br/>
-        <w:t>0768: def trigger_chairman_escalation_email(ticket):</w:t>
-        <w:br/>
-        <w:t>0769:     print("\n" + "="*80)</w:t>
-        <w:br/>
-        <w:t>0770:     print(" --- WEBHOOK TRIGGERED: trigger_chairman_escalation_email ---")</w:t>
-        <w:br/>
-        <w:t>0771:     print(f" Ticket ID: {ticket.get('_id') or ticket.get('id')}")</w:t>
-        <w:br/>
-        <w:t>0772:     print(f" Subject: {ticket.get('subject')}")</w:t>
-        <w:br/>
-        <w:t>0773:     print(f" Sender: {ticket.get('inspector_email') or ticket.get('email')}")</w:t>
-        <w:br/>
-        <w:t>0774:     print(f" SLA Deadline: {ticket.get('sla_deadline')}")</w:t>
-        <w:br/>
-        <w:t>0775:     print("="*80 + "\n")</w:t>
-        <w:br/>
-        <w:t xml:space="preserve">0776: </w:t>
-        <w:br/>
-        <w:t>0777: import threading</w:t>
-        <w:br/>
-        <w:t>0778: import time</w:t>
-        <w:br/>
-        <w:t xml:space="preserve">0779: </w:t>
-        <w:br/>
-        <w:t>0780: def start_sla_monitor():</w:t>
-        <w:br/>
-        <w:t>0781:     def monitor_loop():</w:t>
-        <w:br/>
-        <w:t>0782:         time.sleep(5)  # Wait for db initialization</w:t>
-        <w:br/>
-        <w:t>0783:         while True:</w:t>
-        <w:br/>
-        <w:t>0784:             try:</w:t>
-        <w:br/>
-        <w:t>0785:                 now_str = datetime.datetime.now().strftime("%Y-%m-%d %H:%M:%S")</w:t>
-        <w:br/>
-        <w:t>0786:                 pending_tickets = list(complaints_col.find({"sla_status": "Pending"}))</w:t>
-        <w:br/>
-        <w:t>0787:                 for ticket in pending_tickets:</w:t>
-        <w:br/>
-        <w:t>0788:                     deadline = ticket.get("sla_deadline")</w:t>
-        <w:br/>
-        <w:t>0789:                     if deadline and now_str &gt; deadline:</w:t>
-        <w:br/>
-        <w:t>0790:                         # Update database state to SLA Breached</w:t>
-        <w:br/>
-        <w:t>0791:                         complaints_col.update_one(</w:t>
-        <w:br/>
-        <w:t>0792:                             {"_id": ticket["_id"]},</w:t>
-        <w:br/>
-        <w:t>0793:                             {"$set": {</w:t>
-        <w:br/>
-        <w:t>0794:                                 "sla_status": "SLA Breached",</w:t>
-        <w:br/>
-        <w:t>0795:                                 "escalated_to_chairman": True,</w:t>
-        <w:br/>
-        <w:t>0796:                                 "is_escalated_to_chairman": True</w:t>
-        <w:br/>
-        <w:t>0797:                             }}</w:t>
-        <w:br/>
-        <w:t>0798:                         )</w:t>
-        <w:br/>
-        <w:t>0799:                         # Copy to Chairman's Inbox</w:t>
-        <w:br/>
-        <w:t>0800:                         chairman_record = chairman_office_inbox_col.find_one({"origin_complaint_...</w:t>
-        <w:br/>
-        <w:t>0801:                         if not chairman_record:</w:t>
-        <w:br/>
-        <w:t>0802:                             chairman_office_inbox_col.insert_one({</w:t>
-        <w:br/>
-        <w:t>0803:                                 "origin_complaint_id": str(ticket["_id"]),</w:t>
-        <w:br/>
-        <w:t>0804:                                 "email": ticket.get("inspector_email"),</w:t>
-        <w:br/>
-        <w:t>0805:                                 "category": f"[SLA BREACH] {ticket.get('subject')}",</w:t>
-        <w:br/>
-        <w:t>0806:                                 "description": ticket.get("message"),</w:t>
-        <w:br/>
-        <w:t>0807:                                 "severity_level": "Critical",</w:t>
-        <w:br/>
-        <w:t>0808:                                 "timestamp": now_str,</w:t>
-        <w:br/>
-        <w:t>0809:                                 "is_escalated_to_chairman": True</w:t>
-        <w:br/>
-        <w:t>0810:                             })</w:t>
-        <w:br/>
-        <w:t xml:space="preserve">0811: </w:t>
-        <w:br/>
-        <w:t>0812:                         log_action("Escalate Complaint (SLA Breach)", "System", f"SLA Breached f...</w:t>
-        <w:br/>
-        <w:t>0813:                         trigger_chairman_escalation_email(ticket)</w:t>
-        <w:br/>
-        <w:t>0814:             except Exception as e:</w:t>
-        <w:br/>
-        <w:t>0815:                 print(f"SLA monitor error: {e}")</w:t>
-        <w:br/>
-        <w:t>0816:             time.sleep(10)</w:t>
-        <w:br/>
-        <w:t xml:space="preserve">0817: </w:t>
-        <w:br/>
-        <w:t>0818:     monitor_thread = threading.Thread(target=monitor_loop, daemon=True)</w:t>
-        <w:br/>
-        <w:t>0819:     monitor_thread.start()</w:t>
+        <w:t>0751:     return jsonify(logs), 200</w:t>
+        <w:br/>
+        <w:t xml:space="preserve">0752: </w:t>
+        <w:br/>
+        <w:t>0753: def trigger_chairman_escalation_email(ticket):</w:t>
+        <w:br/>
+        <w:t>0754:     print("\n" + "="*80)</w:t>
+        <w:br/>
+        <w:t>0755:     print(" --- WEBHOOK TRIGGERED: trigger_chairman_escalation_email ---")</w:t>
+        <w:br/>
+        <w:t>0756:     print(f" Ticket ID: {ticket.get('_id') or ticket.get('id')}")</w:t>
+        <w:br/>
+        <w:t>0757:     print(f" Subject: {ticket.get('subject')}")</w:t>
+        <w:br/>
+        <w:t>0758:     print(f" Sender: {ticket.get('inspector_email') or ticket.get('email')}")</w:t>
+        <w:br/>
+        <w:t>0759:     print(f" SLA Deadline: {ticket.get('sla_deadline')}")</w:t>
+        <w:br/>
+        <w:t>0760:     print("="*80 + "\n")</w:t>
+        <w:br/>
+        <w:t xml:space="preserve">0761: </w:t>
+        <w:br/>
+        <w:t>0762: import threading</w:t>
+        <w:br/>
+        <w:t>0763: import time</w:t>
+        <w:br/>
+        <w:t xml:space="preserve">0764: </w:t>
+        <w:br/>
+        <w:t>0765: def start_sla_monitor():</w:t>
+        <w:br/>
+        <w:t>0766:     def monitor_loop():</w:t>
+        <w:br/>
+        <w:t>0767:         time.sleep(5)  # Wait for db initialization</w:t>
+        <w:br/>
+        <w:t>0768:         while True:</w:t>
+        <w:br/>
+        <w:t>0769:             try:</w:t>
+        <w:br/>
+        <w:t>0770:                 now_str = datetime.datetime.now().strftime("%Y-%m-%d %H:%M:%S")</w:t>
+        <w:br/>
+        <w:t>0771:                 pending_tickets = list(complaints_col.find({"sla_status": "Pending"}))</w:t>
+        <w:br/>
+        <w:t>0772:                 for ticket in pending_tickets:</w:t>
+        <w:br/>
+        <w:t>0773:                     deadline = ticket.get("sla_deadline")</w:t>
+        <w:br/>
+        <w:t>0774:                     if deadline and now_str &gt; deadline:</w:t>
+        <w:br/>
+        <w:t>0775:                         # Update database state to SLA Breached</w:t>
+        <w:br/>
+        <w:t>0776:                         complaints_col.update_one(</w:t>
+        <w:br/>
+        <w:t>0777:                             {"_id": ticket["_id"]},</w:t>
+        <w:br/>
+        <w:t>0778:                             {"$set": {</w:t>
+        <w:br/>
+        <w:t>0779:                                 "sla_status": "SLA Breached",</w:t>
+        <w:br/>
+        <w:t>0780:                                 "escalated_to_chairman": True,</w:t>
+        <w:br/>
+        <w:t>0781:                                 "is_escalated_to_chairman": True</w:t>
+        <w:br/>
+        <w:t>0782:                             }}</w:t>
+        <w:br/>
+        <w:t>0783:                         )</w:t>
+        <w:br/>
+        <w:t>0784:                         # Copy to Chairman's Inbox</w:t>
+        <w:br/>
+        <w:t>0785:                         chairman_record = chairman_office_inbox_col.find_one({"origin_complaint_...</w:t>
+        <w:br/>
+        <w:t>0786:                         if not chairman_record:</w:t>
+        <w:br/>
+        <w:t>0787:                             chairman_office_inbox_col.insert_one({</w:t>
+        <w:br/>
+        <w:t>0788:                                 "origin_complaint_id": str(ticket["_id"]),</w:t>
+        <w:br/>
+        <w:t>0789:                                 "email": ticket.get("inspector_email"),</w:t>
+        <w:br/>
+        <w:t>0790:                                 "category": f"[SLA BREACH] {ticket.get('subject')}",</w:t>
+        <w:br/>
+        <w:t>0791:                                 "description": ticket.get("message"),</w:t>
+        <w:br/>
+        <w:t>0792:                                 "severity_level": "Critical",</w:t>
+        <w:br/>
+        <w:t>0793:                                 "timestamp": now_str,</w:t>
+        <w:br/>
+        <w:t>0794:                                 "is_escalated_to_chairman": True</w:t>
+        <w:br/>
+        <w:t>0795:                             })</w:t>
+        <w:br/>
+        <w:t xml:space="preserve">0796: </w:t>
+        <w:br/>
+        <w:t>0797:                         log_action("Escalate Complaint (SLA Breach)", "System", f"SLA Breached f...</w:t>
+        <w:br/>
+        <w:t>0798:                         trigger_chairman_escalation_email(ticket)</w:t>
+        <w:br/>
+        <w:t>0799:             except Exception as e:</w:t>
+        <w:br/>
+        <w:t>0800:                 print(f"SLA monitor error: {e}")</w:t>
+        <w:br/>
+        <w:t>0801:             time.sleep(10)</w:t>
+        <w:br/>
+        <w:t xml:space="preserve">0802: </w:t>
+        <w:br/>
+        <w:t>0803:     monitor_thread = threading.Thread(target=monitor_loop, daemon=True)</w:t>
+        <w:br/>
+        <w:t>0804:     monitor_thread.start()</w:t>
+        <w:br/>
+        <w:t xml:space="preserve">0805: </w:t>
+        <w:br/>
+        <w:t>0806: @app.route('/api/complaints', methods=['GET', 'POST'])</w:t>
+        <w:br/>
+        <w:t>0807: def handle_complaints():</w:t>
+        <w:br/>
+        <w:t>0808:     if request.method == 'POST':</w:t>
+        <w:br/>
+        <w:t>0809:         data = request.json or {}</w:t>
+        <w:br/>
+        <w:t>0810:         email = data.get('email')</w:t>
+        <w:br/>
+        <w:t>0811:         subject = data.get('subject') or data.get('category')</w:t>
+        <w:br/>
+        <w:t>0812:         message = data.get('message') or data.get('description')</w:t>
+        <w:br/>
+        <w:t>0813:         is_escalated = data.get('is_escalated_to_chairman') or data.get('isEscalatedToChairman')</w:t>
+        <w:br/>
+        <w:t>0814:         severity = data.get('severity_level') or data.get('severityLevel') or 'Medium'</w:t>
+        <w:br/>
+        <w:t xml:space="preserve">0815: </w:t>
+        <w:br/>
+        <w:t>0816:         if isinstance(is_escalated, str):</w:t>
+        <w:br/>
+        <w:t>0817:             is_escalated = is_escalated.lower() == 'true'</w:t>
+        <w:br/>
+        <w:t>0818:         else:</w:t>
+        <w:br/>
+        <w:t>0819:             is_escalated = bool(is_escalated)</w:t>
         <w:br/>
         <w:t xml:space="preserve">0820: </w:t>
         <w:br/>
-        <w:t>0821: @app.route('/api/complaints', methods=['GET', 'POST'])</w:t>
-        <w:br/>
-        <w:t>0822: def handle_complaints():</w:t>
-        <w:br/>
-        <w:t>0823:     if request.method == 'POST':</w:t>
-        <w:br/>
-        <w:t>0824:         data = request.json or {}</w:t>
-        <w:br/>
-        <w:t>0825:         email = data.get('email')</w:t>
-        <w:br/>
-        <w:t>0826:         subject = data.get('subject') or data.get('category')</w:t>
-        <w:br/>
-        <w:t>0827:         message = data.get('message') or data.get('description')</w:t>
-        <w:br/>
-        <w:t>0828:         is_escalated = data.get('is_escalated_to_chairman') or data.get('isEscalatedToChairman')</w:t>
-        <w:br/>
-        <w:t>0829:         severity = data.get('severity_level') or data.get('severityLevel') or 'Medium'</w:t>
-        <w:br/>
-        <w:t xml:space="preserve">0830: </w:t>
-        <w:br/>
-        <w:t>0831:         if isinstance(is_escalated, str):</w:t>
-        <w:br/>
-        <w:t>0832:             is_escalated = is_escalated.lower() == 'true'</w:t>
-        <w:br/>
-        <w:t>0833:         else:</w:t>
-        <w:br/>
-        <w:t>0834:             is_escalated = bool(is_escalated)</w:t>
-        <w:br/>
-        <w:t xml:space="preserve">0835: </w:t>
-        <w:br/>
-        <w:t>0836:         if is_escalated:</w:t>
-        <w:br/>
-        <w:t>0837:             res = chairman_office_inbox_col.insert_one({</w:t>
-        <w:br/>
-        <w:t>0838:                 "email": email,</w:t>
-        <w:br/>
-        <w:t>0839:                 "category": subject,</w:t>
-        <w:br/>
-        <w:t>0840:                 "description": message,</w:t>
-        <w:br/>
-        <w:t>0841:                 "is_escalated_to_chairman": True,</w:t>
-        <w:br/>
-        <w:t>0842:                 "severity_level": severity,</w:t>
-        <w:br/>
-        <w:t>0843:                 "timestamp": datetime.datetime.now().strftime("%Y-%m-%d %H:%M:%S")</w:t>
-        <w:br/>
-        <w:t>0844:             })</w:t>
-        <w:br/>
-        <w:t>0845:             log_action("Escalate Complaint", "System", f"Escalated complaint by {email} to Chair...</w:t>
-        <w:br/>
-        <w:t>0846:             return jsonify({</w:t>
-        <w:br/>
-        <w:t>0847:                 "status": "success",</w:t>
-        <w:br/>
-        <w:t>0848:                 "message": "Grievance escalated directly to Chairman.",</w:t>
-        <w:br/>
-        <w:t>0849:                 "routed_to": "CHAIRMAN_OFFICE_INBOX",</w:t>
-        <w:br/>
-        <w:t>0850:                 "id": str(res.inserted_id)</w:t>
-        <w:br/>
-        <w:t>0851:             }), 201</w:t>
-        <w:br/>
-        <w:t>0852:         else:</w:t>
-        <w:br/>
-        <w:t>0853:             now_str = datetime.datetime.now().strftime("%Y-%m-%d %H:%M:%S")</w:t>
-        <w:br/>
-        <w:t>0854:             sla_deadline = (datetime.datetime.now() + datetime.timedelta(hours=72)).strftime("%Y...</w:t>
-        <w:br/>
-        <w:t>0855:             res = complaints_col.insert_one({</w:t>
-        <w:br/>
-        <w:t>0856:                 "inspector_email": email,</w:t>
-        <w:br/>
-        <w:t>0857:                 "subject": subject,</w:t>
-        <w:br/>
-        <w:t>0858:                 "message": message,</w:t>
-        <w:br/>
-        <w:t>0859:                 "is_escalated_to_chairman": False,</w:t>
-        <w:br/>
-        <w:t>0860:                 "severity_level": severity,</w:t>
-        <w:br/>
-        <w:t>0861:                 "timestamp": now_str,</w:t>
-        <w:br/>
-        <w:t>0862:                 "sla_status": "Pending",</w:t>
-        <w:br/>
-        <w:t>0863:                 "sla_deadline": sla_deadline,</w:t>
-        <w:br/>
-        <w:t>0864:                 "escalated_to_chairman": False</w:t>
-        <w:br/>
-        <w:t>0865:             })</w:t>
-        <w:br/>
-        <w:t>0866:             log_action("Submit Complaint", "System", f"Complaint submitted by {email}")</w:t>
-        <w:br/>
-        <w:t>0867:             return jsonify({</w:t>
-        <w:br/>
-        <w:t>0868:                 "status": "success",</w:t>
-        <w:br/>
-        <w:t>0869:                 "message": "Complaint submitted to standard queue.",</w:t>
-        <w:br/>
-        <w:t>0870:                 "routed_to": "STANDARD_GRIEVANCE_QUEUE",</w:t>
-        <w:br/>
-        <w:t>0871:                 "id": str(res.inserted_id)</w:t>
-        <w:br/>
-        <w:t>0872:             }), 201</w:t>
-        <w:br/>
-        <w:t xml:space="preserve">0873: </w:t>
-        <w:br/>
-        <w:t>0874:     else:</w:t>
-        <w:br/>
-        <w:t>0875:         result = []</w:t>
-        <w:br/>
-        <w:t>0876:         for r in complaints_col.find().sort("_id", pymongo.DESCENDING):</w:t>
-        <w:br/>
-        <w:t>0877:             result.append({</w:t>
-        <w:br/>
-        <w:t>0878:                 "id": str(r["_id"]),</w:t>
-        <w:br/>
-        <w:t>0879:                 "email": r.get("inspector_email"),</w:t>
-        <w:br/>
-        <w:t>0880:                 "subject": r.get("subject"),</w:t>
-        <w:br/>
-        <w:t>0881:                 "message": r.get("message"),</w:t>
-        <w:br/>
-        <w:t>0882:                 "date": r.get("timestamp"),</w:t>
-        <w:br/>
-        <w:t>0883:                 "is_escalated_to_chairman": bool(r.get("is_escalated_to_chairman")),</w:t>
-        <w:br/>
-        <w:t>0884:                 "severity_level": r.get("severity_level"),</w:t>
-        <w:br/>
-        <w:t>0885:                 "sla_status": r.get("sla_status", "Pending"),</w:t>
-        <w:br/>
-        <w:t>0886:                 "sla_deadline": r.get("sla_deadline"),</w:t>
-        <w:br/>
-        <w:t>0887:                 "escalated_to_chairman": bool(r.get("escalated_to_chairman", False))</w:t>
-        <w:br/>
-        <w:t>0888:             })</w:t>
-        <w:br/>
-        <w:t>0889:         return jsonify(result), 200</w:t>
-        <w:br/>
-        <w:t xml:space="preserve">0890: </w:t>
-        <w:br/>
-        <w:t>0891: @app.route('/api/complaints/&lt;id&gt;', methods=['PUT'])</w:t>
-        <w:br/>
-        <w:t>0892: def update_complaint_status(id):</w:t>
-        <w:br/>
-        <w:t>0893:     data = request.json or {}</w:t>
-        <w:br/>
-        <w:t>0894:     new_status = data.get('sla_status') or data.get('status')</w:t>
-        <w:br/>
-        <w:t xml:space="preserve">0895: </w:t>
-        <w:br/>
-        <w:t>0896:     if new_status not in ['Pending', 'Under Investigation', 'Resolved', 'SLA Breached']:</w:t>
-        <w:br/>
-        <w:t>0897:         return jsonify({"status": "error", "message": "Invalid status value."}), 400</w:t>
-        <w:br/>
-        <w:t xml:space="preserve">0898: </w:t>
-        <w:br/>
-        <w:t>0899:     try:</w:t>
-        <w:br/>
-        <w:t>0900:         obj_id = ObjectId(id)</w:t>
+        <w:t>0821:         if is_escalated:</w:t>
+        <w:br/>
+        <w:t>0822:             res = chairman_office_inbox_col.insert_one({</w:t>
+        <w:br/>
+        <w:t>0823:                 "email": email,</w:t>
+        <w:br/>
+        <w:t>0824:                 "category": subject,</w:t>
+        <w:br/>
+        <w:t>0825:                 "description": message,</w:t>
+        <w:br/>
+        <w:t>0826:                 "is_escalated_to_chairman": True,</w:t>
+        <w:br/>
+        <w:t>0827:                 "severity_level": severity,</w:t>
+        <w:br/>
+        <w:t>0828:                 "timestamp": datetime.datetime.now().strftime("%Y-%m-%d %H:%M:%S")</w:t>
+        <w:br/>
+        <w:t>0829:             })</w:t>
+        <w:br/>
+        <w:t>0830:             log_action("Escalate Complaint", "System", f"Escalated complaint by {email} to Chair...</w:t>
+        <w:br/>
+        <w:t>0831:             return jsonify({</w:t>
+        <w:br/>
+        <w:t>0832:                 "status": "success",</w:t>
+        <w:br/>
+        <w:t>0833:                 "message": "Grievance escalated directly to Chairman.",</w:t>
+        <w:br/>
+        <w:t>0834:                 "routed_to": "CHAIRMAN_OFFICE_INBOX",</w:t>
+        <w:br/>
+        <w:t>0835:                 "id": str(res.inserted_id)</w:t>
+        <w:br/>
+        <w:t>0836:             }), 201</w:t>
+        <w:br/>
+        <w:t>0837:         else:</w:t>
+        <w:br/>
+        <w:t>0838:             now_str = datetime.datetime.now().strftime("%Y-%m-%d %H:%M:%S")</w:t>
+        <w:br/>
+        <w:t>0839:             sla_deadline = (datetime.datetime.now() + datetime.timedelta(hours=72)).strftime("%Y...</w:t>
+        <w:br/>
+        <w:t>0840:             res = complaints_col.insert_one({</w:t>
+        <w:br/>
+        <w:t>0841:                 "inspector_email": email,</w:t>
+        <w:br/>
+        <w:t>0842:                 "subject": subject,</w:t>
+        <w:br/>
+        <w:t>0843:                 "message": message,</w:t>
+        <w:br/>
+        <w:t>0844:                 "is_escalated_to_chairman": False,</w:t>
+        <w:br/>
+        <w:t>0845:                 "severity_level": severity,</w:t>
+        <w:br/>
+        <w:t>0846:                 "timestamp": now_str,</w:t>
+        <w:br/>
+        <w:t>0847:                 "sla_status": "Pending",</w:t>
+        <w:br/>
+        <w:t>0848:                 "sla_deadline": sla_deadline,</w:t>
+        <w:br/>
+        <w:t>0849:                 "escalated_to_chairman": False</w:t>
+        <w:br/>
+        <w:t>0850:             })</w:t>
+        <w:br/>
+        <w:t>0851:             log_action("Submit Complaint", "System", f"Complaint submitted by {email}")</w:t>
+        <w:br/>
+        <w:t>0852:             return jsonify({</w:t>
+        <w:br/>
+        <w:t>0853:                 "status": "success",</w:t>
+        <w:br/>
+        <w:t>0854:                 "message": "Complaint submitted to standard queue.",</w:t>
+        <w:br/>
+        <w:t>0855:                 "routed_to": "STANDARD_GRIEVANCE_QUEUE",</w:t>
+        <w:br/>
+        <w:t>0856:                 "id": str(res.inserted_id)</w:t>
+        <w:br/>
+        <w:t>0857:             }), 201</w:t>
+        <w:br/>
+        <w:t xml:space="preserve">0858: </w:t>
+        <w:br/>
+        <w:t>0859:     else:</w:t>
+        <w:br/>
+        <w:t>0860:         result = []</w:t>
+        <w:br/>
+        <w:t>0861:         for r in complaints_col.find().sort("_id", pymongo.DESCENDING):</w:t>
+        <w:br/>
+        <w:t>0862:             result.append({</w:t>
+        <w:br/>
+        <w:t>0863:                 "id": str(r["_id"]),</w:t>
+        <w:br/>
+        <w:t>0864:                 "email": r.get("inspector_email"),</w:t>
+        <w:br/>
+        <w:t>0865:                 "subject": r.get("subject"),</w:t>
+        <w:br/>
+        <w:t>0866:                 "message": r.get("message"),</w:t>
+        <w:br/>
+        <w:t>0867:                 "date": r.get("timestamp"),</w:t>
+        <w:br/>
+        <w:t>0868:                 "is_escalated_to_chairman": bool(r.get("is_escalated_to_chairman")),</w:t>
+        <w:br/>
+        <w:t>0869:                 "severity_level": r.get("severity_level"),</w:t>
+        <w:br/>
+        <w:t>0870:                 "sla_status": r.get("sla_status", "Pending"),</w:t>
+        <w:br/>
+        <w:t>0871:                 "sla_deadline": r.get("sla_deadline"),</w:t>
+        <w:br/>
+        <w:t>0872:                 "escalated_to_chairman": bool(r.get("escalated_to_chairman", False))</w:t>
+        <w:br/>
+        <w:t>0873:             })</w:t>
+        <w:br/>
+        <w:t>0874:         return jsonify(result), 200</w:t>
+        <w:br/>
+        <w:t xml:space="preserve">0875: </w:t>
+        <w:br/>
+        <w:t>0876: @app.route('/api/complaints/&lt;id&gt;', methods=['PUT'])</w:t>
+        <w:br/>
+        <w:t>0877: def update_complaint_status(id):</w:t>
+        <w:br/>
+        <w:t>0878:     data = request.json or {}</w:t>
+        <w:br/>
+        <w:t>0879:     new_status = data.get('sla_status') or data.get('status')</w:t>
+        <w:br/>
+        <w:t xml:space="preserve">0880: </w:t>
+        <w:br/>
+        <w:t>0881:     if new_status not in ['Pending', 'Under Investigation', 'Resolved', 'SLA Breached']:</w:t>
+        <w:br/>
+        <w:t>0882:         return jsonify({"status": "error", "message": "Invalid status value."}), 400</w:t>
+        <w:br/>
+        <w:t xml:space="preserve">0883: </w:t>
+        <w:br/>
+        <w:t>0884:     try:</w:t>
+        <w:br/>
+        <w:t>0885:         obj_id = ObjectId(id)</w:t>
+        <w:br/>
+        <w:t>0886:     except:</w:t>
+        <w:br/>
+        <w:t>0887:         return jsonify({"status": "error", "message": "Invalid ID format"}), 400</w:t>
+        <w:br/>
+        <w:t xml:space="preserve">0888: </w:t>
+        <w:br/>
+        <w:t>0889:     complaint = complaints_col.find_one({"_id": obj_id})</w:t>
+        <w:br/>
+        <w:t>0890:     if not complaint:</w:t>
+        <w:br/>
+        <w:t>0891:         return jsonify({"status": "error", "message": "Complaint not found."}), 404</w:t>
+        <w:br/>
+        <w:t xml:space="preserve">0892: </w:t>
+        <w:br/>
+        <w:t>0893:     update_fields = {"sla_status": new_status}</w:t>
+        <w:br/>
+        <w:t>0894:     if new_status == "SLA Breached":</w:t>
+        <w:br/>
+        <w:t>0895:         update_fields["escalated_to_chairman"] = True</w:t>
+        <w:br/>
+        <w:t>0896:         update_fields["is_escalated_to_chairman"] = True</w:t>
+        <w:br/>
+        <w:t xml:space="preserve">0897: </w:t>
+        <w:br/>
+        <w:t>0898:     complaints_col.update_one({"_id": obj_id}, {"$set": update_fields})</w:t>
+        <w:br/>
+        <w:t>0899:     log_action("Update Grievance Status", "system_admin", f"Grievance ID {id} status updated to ...</w:t>
+        <w:br/>
+        <w:t>0900:     return jsonify({"status": "success", "message": f"Grievance status updated to {new_status}."...</w:t>
       </w:r>
     </w:p>
     <w:p>
@@ -12005,81 +12005,51 @@
           <w:color w:val="000000"/>
           <w:sz w:val="17"/>
         </w:rPr>
-        <w:t>0901:     except:</w:t>
-        <w:br/>
-        <w:t>0902:         return jsonify({"status": "error", "message": "Invalid ID format"}), 400</w:t>
-        <w:br/>
-        <w:t xml:space="preserve">0903: </w:t>
-        <w:br/>
-        <w:t>0904:     complaint = complaints_col.find_one({"_id": obj_id})</w:t>
-        <w:br/>
-        <w:t>0905:     if not complaint:</w:t>
-        <w:br/>
-        <w:t>0906:         return jsonify({"status": "error", "message": "Complaint not found."}), 404</w:t>
-        <w:br/>
-        <w:t xml:space="preserve">0907: </w:t>
-        <w:br/>
-        <w:t>0908:     update_fields = {"sla_status": new_status}</w:t>
-        <w:br/>
-        <w:t>0909:     if new_status == "SLA Breached":</w:t>
-        <w:br/>
-        <w:t>0910:         update_fields["escalated_to_chairman"] = True</w:t>
-        <w:br/>
-        <w:t>0911:         update_fields["is_escalated_to_chairman"] = True</w:t>
-        <w:br/>
-        <w:t xml:space="preserve">0912: </w:t>
-        <w:br/>
-        <w:t>0913:     complaints_col.update_one({"_id": obj_id}, {"$set": update_fields})</w:t>
-        <w:br/>
-        <w:t>0914:     log_action("Update Grievance Status", "system_admin", f"Grievance ID {id} status updated to ...</w:t>
-        <w:br/>
-        <w:t>0915:     return jsonify({"status": "success", "message": f"Grievance status updated to {new_status}."...</w:t>
-        <w:br/>
-        <w:t xml:space="preserve">0916: </w:t>
-        <w:br/>
-        <w:t>0917: @app.route('/api/chairman/complaints', methods=['GET'])</w:t>
-        <w:br/>
-        <w:t>0918: def get_chairman_complaints():</w:t>
-        <w:br/>
-        <w:t>0919:     result = []</w:t>
-        <w:br/>
-        <w:t>0920:     for r in chairman_office_inbox_col.find().sort("_id", pymongo.DESCENDING):</w:t>
-        <w:br/>
-        <w:t>0921:         result.append({</w:t>
-        <w:br/>
-        <w:t>0922:             "id": str(r["_id"]),</w:t>
-        <w:br/>
-        <w:t>0923:             "email": r.get("email"),</w:t>
-        <w:br/>
-        <w:t>0924:             "subject": r.get("category"),</w:t>
-        <w:br/>
-        <w:t>0925:             "message": r.get("description"),</w:t>
-        <w:br/>
-        <w:t>0926:             "severity_level": r.get("severity_level"),</w:t>
-        <w:br/>
-        <w:t>0927:             "date": r.get("timestamp"),</w:t>
-        <w:br/>
-        <w:t>0928:             "is_escalated_to_chairman": True,</w:t>
-        <w:br/>
-        <w:t>0929:             "origin_complaint_id": r.get("origin_complaint_id")</w:t>
-        <w:br/>
-        <w:t>0930:         })</w:t>
-        <w:br/>
-        <w:t>0931:     return jsonify(result), 200</w:t>
-        <w:br/>
-        <w:t xml:space="preserve">0932: </w:t>
-        <w:br/>
-        <w:t>0933: if __name__ == '__main__':</w:t>
-        <w:br/>
-        <w:t>0934:     init_db()</w:t>
-        <w:br/>
-        <w:t>0935:     start_sla_monitor()</w:t>
-        <w:br/>
-        <w:t>0936:     # Read port from environment, fallback to 5000</w:t>
-        <w:br/>
-        <w:t>0937:     port = int(os.getenv("PORT", 5000))</w:t>
-        <w:br/>
-        <w:t>0938:     app.run(host="0.0.0.0", port=port, debug=True)</w:t>
+        <w:t xml:space="preserve">0901: </w:t>
+        <w:br/>
+        <w:t>0902: @app.route('/api/chairman/complaints', methods=['GET'])</w:t>
+        <w:br/>
+        <w:t>0903: def get_chairman_complaints():</w:t>
+        <w:br/>
+        <w:t>0904:     result = []</w:t>
+        <w:br/>
+        <w:t>0905:     for r in chairman_office_inbox_col.find().sort("_id", pymongo.DESCENDING):</w:t>
+        <w:br/>
+        <w:t>0906:         result.append({</w:t>
+        <w:br/>
+        <w:t>0907:             "id": str(r["_id"]),</w:t>
+        <w:br/>
+        <w:t>0908:             "email": r.get("email"),</w:t>
+        <w:br/>
+        <w:t>0909:             "subject": r.get("category"),</w:t>
+        <w:br/>
+        <w:t>0910:             "message": r.get("description"),</w:t>
+        <w:br/>
+        <w:t>0911:             "severity_level": r.get("severity_level"),</w:t>
+        <w:br/>
+        <w:t>0912:             "date": r.get("timestamp"),</w:t>
+        <w:br/>
+        <w:t>0913:             "is_escalated_to_chairman": True,</w:t>
+        <w:br/>
+        <w:t>0914:             "origin_complaint_id": r.get("origin_complaint_id")</w:t>
+        <w:br/>
+        <w:t>0915:         })</w:t>
+        <w:br/>
+        <w:t>0916:     return jsonify(result), 200</w:t>
+        <w:br/>
+        <w:t xml:space="preserve">0917: </w:t>
+        <w:br/>
+        <w:t>0918: if __name__ == '__main__':</w:t>
+        <w:br/>
+        <w:t>0919:     init_db()</w:t>
+        <w:br/>
+        <w:t>0920:     start_sla_monitor()</w:t>
+        <w:br/>
+        <w:t>0921:     # Read port from environment, fallback to 5000</w:t>
+        <w:br/>
+        <w:t>0922:     port = int(os.getenv("PORT", 5000))</w:t>
+        <w:br/>
+        <w:t>0923:     app.run(host="0.0.0.0", port=port, debug=True)</w:t>
       </w:r>
     </w:p>
     <w:p>

</xml_diff>

<commit_message>
fix: update mock fetch interceptors in localDb.js to return new project-specific calculated metrics, restoring UI values on the login page; regenerate reports
</commit_message>
<xml_diff>
--- a/NMPA_Project_Report_Final.docx
+++ b/NMPA_Project_Report_Final.docx
@@ -14393,85 +14393,53 @@
         <w:br/>
         <w:t>1112:         const inspections = getStore("nmpa_inspections", DEFAULT_INSPECTIONS);</w:t>
         <w:br/>
-        <w:t>1113:         const totalInspections = inspections.length;</w:t>
-        <w:br/>
-        <w:t>1114:         const pendingInspections = inspections.filter(i =&gt; i.status === "Awaiting Physical Inspe...</w:t>
-        <w:br/>
-        <w:t>1115:         const clearedInspections = inspections.filter(i =&gt; i.status === "Approved" || i.status =...</w:t>
-        <w:br/>
-        <w:t xml:space="preserve">1116: </w:t>
-        <w:br/>
-        <w:t>1117:         const preBerthing = Math.max(0.2, parseFloat((0.78 + (pendingInspections * 0.02)).toFixe...</w:t>
-        <w:br/>
-        <w:t>1118:         const trt = Math.max(10, parseFloat((43.23 + (pendingInspections * 0.15)).toFixed(2)));</w:t>
+        <w:t>1113:         const complaints = getStore("nmpa_complaints", DEFAULT_COMPLAINTS);</w:t>
+        <w:br/>
+        <w:t xml:space="preserve">1114: </w:t>
+        <w:br/>
+        <w:t>1115:         const manifestsProcessed = inspections.filter(i =&gt; i.status === "Approved" || i.status =...</w:t>
+        <w:br/>
+        <w:t>1116:         const activeHolds = inspections.filter(i =&gt; i.status === "Clearance Denied - Detained fo...</w:t>
+        <w:br/>
+        <w:t>1117:         const totalGrievances = complaints.length;</w:t>
+        <w:br/>
+        <w:t>1118:         const escalatedGrievances = complaints.filter(c =&gt; c.sla_status === "SLA Breached" || c....</w:t>
         <w:br/>
         <w:t xml:space="preserve">1119: </w:t>
         <w:br/>
-        <w:t>1120:         const totalClearedWeight = inspections</w:t>
-        <w:br/>
-        <w:t>1121:           .filter(i =&gt; i.status === "Approved" || i.status === "Port Clearance Granted")</w:t>
-        <w:br/>
-        <w:t>1122:           .reduce((sum, item) =&gt; sum + (item.weight || 0), 0);</w:t>
-        <w:br/>
-        <w:t>1123:         const berthOutput = Math.round(19535 + (totalClearedWeight / 20));</w:t>
-        <w:br/>
-        <w:t xml:space="preserve">1124: </w:t>
-        <w:br/>
-        <w:t>1125:         const completedCount = inspections.filter(i =&gt; i.status !== "Awaiting Physical Inspectio...</w:t>
-        <w:br/>
-        <w:t>1126:         const operatingRatio = totalInspections &gt; 0</w:t>
-        <w:br/>
-        <w:t>1127:           ? parseFloat((38.61 + (completedCount - pendingInspections) * 0.1).toFixed(2))</w:t>
-        <w:br/>
-        <w:t>1128:           : 38.61;</w:t>
-        <w:br/>
-        <w:t xml:space="preserve">1129: </w:t>
-        <w:br/>
-        <w:t>1130:         const dateStart = new Date("2026-06-01T00:00:00Z").getTime();</w:t>
-        <w:br/>
-        <w:t>1131:         const dateNow = Date.now();</w:t>
-        <w:br/>
-        <w:t>1132:         const deltaSeconds = Math.max(0, (dateNow - dateStart) / 1000);</w:t>
-        <w:br/>
-        <w:t>1133:         const solarGenerated = parseFloat((59.26 + (deltaSeconds * 0.000002)).toFixed(6));</w:t>
-        <w:br/>
-        <w:t xml:space="preserve">1134: </w:t>
-        <w:br/>
-        <w:t>1135:         return jsonResponse({</w:t>
-        <w:br/>
-        <w:t>1136:           pre_berthing_detention: preBerthing,</w:t>
-        <w:br/>
-        <w:t>1137:           average_trt: trt,</w:t>
-        <w:br/>
-        <w:t>1138:           output_per_berth_day: berthOutput,</w:t>
-        <w:br/>
-        <w:t>1139:           operating_ratio: operatingRatio,</w:t>
-        <w:br/>
-        <w:t>1140:           solar_generated: solarGenerated</w:t>
-        <w:br/>
-        <w:t>1141:         });</w:t>
-        <w:br/>
-        <w:t>1142:       }</w:t>
-        <w:br/>
-        <w:t xml:space="preserve">1143: </w:t>
-        <w:br/>
-        <w:t>1144:       // Fallback</w:t>
-        <w:br/>
-        <w:t>1145:       return originalFetch.apply(this, arguments);</w:t>
-        <w:br/>
-        <w:t xml:space="preserve">1146: </w:t>
-        <w:br/>
-        <w:t>1147:     } catch (err) {</w:t>
-        <w:br/>
-        <w:t>1148:       console.error("[localDb Mock Fetch Error]", err);</w:t>
-        <w:br/>
-        <w:t>1149:       return originalFetch.apply(this, arguments);</w:t>
-        <w:br/>
-        <w:t>1150:     }</w:t>
-        <w:br/>
-        <w:t>1151:   };</w:t>
-        <w:br/>
-        <w:t>1152: }</w:t>
+        <w:t>1120:         return jsonResponse({</w:t>
+        <w:br/>
+        <w:t>1121:           manifests_processed: manifestsProcessed,</w:t>
+        <w:br/>
+        <w:t>1122:           active_holds: activeHolds,</w:t>
+        <w:br/>
+        <w:t>1123:           total_grievances: totalGrievances,</w:t>
+        <w:br/>
+        <w:t>1124:           escalated_grievances: escalatedGrievances</w:t>
+        <w:br/>
+        <w:t>1125:         });</w:t>
+        <w:br/>
+        <w:t>1126:       }</w:t>
+        <w:br/>
+        <w:t xml:space="preserve">1127: </w:t>
+        <w:br/>
+        <w:t>1128:       // Fallback</w:t>
+        <w:br/>
+        <w:t>1129:       return originalFetch.apply(this, arguments);</w:t>
+        <w:br/>
+        <w:t xml:space="preserve">1130: </w:t>
+        <w:br/>
+        <w:t>1131:     } catch (err) {</w:t>
+        <w:br/>
+        <w:t>1132:       console.error("[localDb Mock Fetch Error]", err);</w:t>
+        <w:br/>
+        <w:t>1133:       return originalFetch.apply(this, arguments);</w:t>
+        <w:br/>
+        <w:t>1134:     }</w:t>
+        <w:br/>
+        <w:t>1135:   };</w:t>
+        <w:br/>
+        <w:t>1136: }</w:t>
       </w:r>
     </w:p>
     <w:p>

</xml_diff>